<commit_message>
add: ELT 535 - Atividades 2,3,4
</commit_message>
<xml_diff>
--- a/6_Fundamentos-de-Robotica-Terrestre/Projeto-Final/Projeto-Final.docx
+++ b/6_Fundamentos-de-Robotica-Terrestre/Projeto-Final/Projeto-Final.docx
@@ -1,6 +1,6 @@
 
 <file path=word/document.xml><?xml version="1.0" encoding="utf-8"?>
-<w:document xmlns:wpc="http://schemas.microsoft.com/office/word/2010/wordprocessingCanvas" xmlns:cx="http://schemas.microsoft.com/office/drawing/2014/chartex" xmlns:cx1="http://schemas.microsoft.com/office/drawing/2015/9/8/chartex" xmlns:cx2="http://schemas.microsoft.com/office/drawing/2015/10/21/chartex" xmlns:cx3="http://schemas.microsoft.com/office/drawing/2016/5/9/chartex" xmlns:cx4="http://schemas.microsoft.com/office/drawing/2016/5/10/chartex" xmlns:cx5="http://schemas.microsoft.com/office/drawing/2016/5/11/chartex" xmlns:cx6="http://schemas.microsoft.com/office/drawing/2016/5/12/chartex" xmlns:cx7="http://schemas.microsoft.com/office/drawing/2016/5/13/chartex" xmlns:cx8="http://schemas.microsoft.com/office/drawing/2016/5/14/chartex" xmlns:mc="http://schemas.openxmlformats.org/markup-compatibility/2006" xmlns:m="http://schemas.openxmlformats.org/officeDocument/2006/math" xmlns:aink="http://schemas.microsoft.com/office/drawing/2016/ink" xmlns:am3d="http://schemas.microsoft.com/office/drawing/2017/model3d" xmlns:oel="http://schemas.microsoft.com/office/2019/extlst" xmlns:r="http://schemas.openxmlformats.org/officeDocument/2006/relationships" xmlns:wp14="http://schemas.microsoft.com/office/word/2010/wordprocessingDrawing" xmlns:wp="http://schemas.openxmlformats.org/drawingml/2006/wordprocessingDrawing" xmlns:wpg="http://schemas.microsoft.com/office/word/2010/wordprocessingGroup" xmlns:wpi="http://schemas.microsoft.com/office/word/2010/wordprocessingInk" xmlns:wps="http://schemas.microsoft.com/office/word/2010/wordprocessingShape" xmlns:o="urn:schemas-microsoft-com:office:office" xmlns:v="urn:schemas-microsoft-com:vml" xmlns:w10="urn:schemas-microsoft-com:office:word" xmlns:w="http://schemas.openxmlformats.org/wordprocessingml/2006/main" xmlns:w14="http://schemas.microsoft.com/office/word/2010/wordml" xmlns:w15="http://schemas.microsoft.com/office/word/2012/wordml" xmlns:w16cei="http://schemas.microsoft.com/office/word/2026/wordml/cei" xmlns:w16cex="http://schemas.microsoft.com/office/word/2018/wordml/cex" xmlns:w16cid="http://schemas.microsoft.com/office/word/2016/wordml/cid" xmlns:w16="http://schemas.microsoft.com/office/word/2018/wordml" xmlns:w16sdtdh="http://schemas.microsoft.com/office/word/2020/wordml/sdtdatahash" xmlns:w16sdtfl="http://schemas.microsoft.com/office/word/2024/wordml/sdtformatlock" xmlns:w16se="http://schemas.microsoft.com/office/word/2015/wordml/symex" xmlns:w16du="http://schemas.microsoft.com/office/word/2023/wordml/word16du" xmlns:wne="http://schemas.microsoft.com/office/word/2006/wordml" mc:Ignorable="w14 w15 w16se w16cid w16 w16cex w16sdtdh w16sdtfl w16du wp14">
+<w:document xmlns:wpc="http://schemas.microsoft.com/office/word/2010/wordprocessingCanvas" xmlns:cx="http://schemas.microsoft.com/office/drawing/2014/chartex" xmlns:cx1="http://schemas.microsoft.com/office/drawing/2015/9/8/chartex" xmlns:cx2="http://schemas.microsoft.com/office/drawing/2015/10/21/chartex" xmlns:cx3="http://schemas.microsoft.com/office/drawing/2016/5/9/chartex" xmlns:cx4="http://schemas.microsoft.com/office/drawing/2016/5/10/chartex" xmlns:cx5="http://schemas.microsoft.com/office/drawing/2016/5/11/chartex" xmlns:cx6="http://schemas.microsoft.com/office/drawing/2016/5/12/chartex" xmlns:cx7="http://schemas.microsoft.com/office/drawing/2016/5/13/chartex" xmlns:cx8="http://schemas.microsoft.com/office/drawing/2016/5/14/chartex" xmlns:mc="http://schemas.openxmlformats.org/markup-compatibility/2006" xmlns:m="http://schemas.openxmlformats.org/officeDocument/2006/math" xmlns:aink="http://schemas.microsoft.com/office/drawing/2016/ink" xmlns:am3d="http://schemas.microsoft.com/office/drawing/2017/model3d" xmlns:oel="http://schemas.microsoft.com/office/2019/extlst" xmlns:r="http://schemas.openxmlformats.org/officeDocument/2006/relationships" xmlns:wp14="http://schemas.microsoft.com/office/word/2010/wordprocessingDrawing" xmlns:wp="http://schemas.openxmlformats.org/drawingml/2006/wordprocessingDrawing" xmlns:wpg="http://schemas.microsoft.com/office/word/2010/wordprocessingGroup" xmlns:wpi="http://schemas.microsoft.com/office/word/2010/wordprocessingInk" xmlns:wps="http://schemas.microsoft.com/office/word/2010/wordprocessingShape" xmlns:o="urn:schemas-microsoft-com:office:office" xmlns:v="urn:schemas-microsoft-com:vml" xmlns:w10="urn:schemas-microsoft-com:office:word" xmlns:w="http://schemas.openxmlformats.org/wordprocessingml/2006/main" xmlns:w14="http://schemas.microsoft.com/office/word/2010/wordml" xmlns:w15="http://schemas.microsoft.com/office/word/2012/wordml" xmlns:w16cex="http://schemas.microsoft.com/office/word/2018/wordml/cex" xmlns:w16cid="http://schemas.microsoft.com/office/word/2016/wordml/cid" xmlns:w16="http://schemas.microsoft.com/office/word/2018/wordml" xmlns:w16sdtdh="http://schemas.microsoft.com/office/word/2020/wordml/sdtdatahash" xmlns:w16sdtfl="http://schemas.microsoft.com/office/word/2024/wordml/sdtformatlock" xmlns:w16se="http://schemas.microsoft.com/office/word/2015/wordml/symex" xmlns:w16du="http://schemas.microsoft.com/office/word/2023/wordml/word16du" xmlns:wne="http://schemas.microsoft.com/office/word/2006/wordml" mc:Ignorable="w14 w15 w16se w16cid w16 w16cex w16sdtdh w16sdtfl w16du wp14">
   <w:body>
     <w:tbl>
       <w:tblPr>
@@ -30,7 +30,7 @@
               <w:spacing w:line="360" w:lineRule="auto"/>
               <w:jc w:val="center"/>
               <w:rPr>
-                <w:rFonts w:ascii="Didot" w:hAnsi="Didot" w:cs="Didot" w:hint="cs"/>
+                <w:rFonts w:ascii="Didot" w:hAnsi="Didot" w:cs="Didot"/>
                 <w:sz w:val="22"/>
                 <w:szCs w:val="22"/>
               </w:rPr>
@@ -94,7 +94,7 @@
             <w:pPr>
               <w:spacing w:line="360" w:lineRule="auto"/>
               <w:rPr>
-                <w:rFonts w:ascii="Didot" w:hAnsi="Didot" w:cs="Didot" w:hint="cs"/>
+                <w:rFonts w:ascii="Didot" w:hAnsi="Didot" w:cs="Didot"/>
                 <w:sz w:val="22"/>
                 <w:szCs w:val="22"/>
               </w:rPr>
@@ -112,7 +112,7 @@
             <w:pPr>
               <w:spacing w:line="360" w:lineRule="auto"/>
               <w:rPr>
-                <w:rFonts w:ascii="Didot" w:hAnsi="Didot" w:cs="Didot" w:hint="cs"/>
+                <w:rFonts w:ascii="Didot" w:hAnsi="Didot" w:cs="Didot"/>
                 <w:sz w:val="22"/>
                 <w:szCs w:val="22"/>
               </w:rPr>
@@ -147,8 +147,9 @@
           <w:p>
             <w:pPr>
               <w:spacing w:line="360" w:lineRule="auto"/>
+              <w:jc w:val="both"/>
               <w:rPr>
-                <w:rFonts w:ascii="Didot" w:hAnsi="Didot" w:cs="Didot" w:hint="cs"/>
+                <w:rFonts w:ascii="Didot" w:hAnsi="Didot" w:cs="Didot"/>
                 <w:sz w:val="22"/>
                 <w:szCs w:val="22"/>
               </w:rPr>
@@ -165,8 +166,9 @@
           <w:p>
             <w:pPr>
               <w:spacing w:line="360" w:lineRule="auto"/>
+              <w:jc w:val="both"/>
               <w:rPr>
-                <w:rFonts w:ascii="Didot" w:hAnsi="Didot" w:cs="Didot" w:hint="cs"/>
+                <w:rFonts w:ascii="Didot" w:hAnsi="Didot" w:cs="Didot"/>
                 <w:sz w:val="22"/>
                 <w:szCs w:val="22"/>
               </w:rPr>
@@ -232,7 +234,7 @@
       <w:pPr>
         <w:spacing w:line="360" w:lineRule="auto"/>
         <w:rPr>
-          <w:rFonts w:ascii="Didot" w:hAnsi="Didot" w:cs="Didot" w:hint="cs"/>
+          <w:rFonts w:ascii="Didot" w:hAnsi="Didot" w:cs="Didot"/>
           <w:sz w:val="22"/>
           <w:szCs w:val="22"/>
         </w:rPr>
@@ -243,7 +245,7 @@
         <w:spacing w:line="360" w:lineRule="auto"/>
         <w:jc w:val="both"/>
         <w:rPr>
-          <w:rFonts w:ascii="Didot" w:hAnsi="Didot" w:cs="Didot" w:hint="cs"/>
+          <w:rFonts w:ascii="Didot" w:hAnsi="Didot" w:cs="Didot"/>
           <w:sz w:val="22"/>
           <w:szCs w:val="22"/>
         </w:rPr>
@@ -261,7 +263,7 @@
       <w:pPr>
         <w:spacing w:line="360" w:lineRule="auto"/>
         <w:rPr>
-          <w:rFonts w:ascii="Didot" w:hAnsi="Didot" w:cs="Didot" w:hint="cs"/>
+          <w:rFonts w:ascii="Didot" w:hAnsi="Didot" w:cs="Didot"/>
           <w:sz w:val="22"/>
           <w:szCs w:val="22"/>
         </w:rPr>
@@ -272,7 +274,7 @@
         <w:spacing w:line="360" w:lineRule="auto"/>
         <w:jc w:val="both"/>
         <w:rPr>
-          <w:rFonts w:ascii="Didot" w:hAnsi="Didot" w:cs="Didot" w:hint="cs"/>
+          <w:rFonts w:ascii="Didot" w:hAnsi="Didot" w:cs="Didot"/>
           <w:sz w:val="22"/>
           <w:szCs w:val="22"/>
         </w:rPr>
@@ -291,7 +293,7 @@
         <w:spacing w:line="360" w:lineRule="auto"/>
         <w:jc w:val="both"/>
         <w:rPr>
-          <w:rFonts w:ascii="Didot" w:hAnsi="Didot" w:cs="Didot" w:hint="cs"/>
+          <w:rFonts w:ascii="Didot" w:hAnsi="Didot" w:cs="Didot"/>
           <w:sz w:val="22"/>
           <w:szCs w:val="22"/>
         </w:rPr>
@@ -310,7 +312,7 @@
         <w:spacing w:line="360" w:lineRule="auto"/>
         <w:jc w:val="both"/>
         <w:rPr>
-          <w:rFonts w:ascii="Didot" w:hAnsi="Didot" w:cs="Didot" w:hint="cs"/>
+          <w:rFonts w:ascii="Didot" w:hAnsi="Didot" w:cs="Didot"/>
           <w:sz w:val="22"/>
           <w:szCs w:val="22"/>
         </w:rPr>
@@ -409,7 +411,7 @@
         <w:spacing w:line="360" w:lineRule="auto"/>
         <w:jc w:val="both"/>
         <w:rPr>
-          <w:rFonts w:ascii="Didot" w:hAnsi="Didot" w:cs="Didot" w:hint="cs"/>
+          <w:rFonts w:ascii="Didot" w:hAnsi="Didot" w:cs="Didot"/>
           <w:sz w:val="22"/>
           <w:szCs w:val="22"/>
         </w:rPr>
@@ -428,7 +430,7 @@
         <w:spacing w:line="360" w:lineRule="auto"/>
         <w:jc w:val="both"/>
         <w:rPr>
-          <w:rFonts w:ascii="Didot" w:hAnsi="Didot" w:cs="Didot" w:hint="cs"/>
+          <w:rFonts w:ascii="Didot" w:hAnsi="Didot" w:cs="Didot"/>
           <w:sz w:val="22"/>
           <w:szCs w:val="22"/>
         </w:rPr>
@@ -447,7 +449,7 @@
         <w:spacing w:line="360" w:lineRule="auto"/>
         <w:jc w:val="both"/>
         <w:rPr>
-          <w:rFonts w:ascii="Didot" w:hAnsi="Didot" w:cs="Didot" w:hint="cs"/>
+          <w:rFonts w:ascii="Didot" w:hAnsi="Didot" w:cs="Didot"/>
           <w:sz w:val="22"/>
           <w:szCs w:val="22"/>
         </w:rPr>
@@ -466,7 +468,7 @@
         <w:spacing w:line="360" w:lineRule="auto"/>
         <w:jc w:val="both"/>
         <w:rPr>
-          <w:rFonts w:ascii="Didot" w:hAnsi="Didot" w:cs="Didot" w:hint="cs"/>
+          <w:rFonts w:ascii="Didot" w:hAnsi="Didot" w:cs="Didot"/>
           <w:sz w:val="22"/>
           <w:szCs w:val="22"/>
         </w:rPr>
@@ -485,7 +487,7 @@
         <w:spacing w:line="360" w:lineRule="auto"/>
         <w:jc w:val="both"/>
         <w:rPr>
-          <w:rFonts w:ascii="Didot" w:hAnsi="Didot" w:cs="Didot" w:hint="cs"/>
+          <w:rFonts w:ascii="Didot" w:hAnsi="Didot" w:cs="Didot"/>
           <w:sz w:val="22"/>
           <w:szCs w:val="22"/>
         </w:rPr>
@@ -504,7 +506,7 @@
         <w:spacing w:line="360" w:lineRule="auto"/>
         <w:jc w:val="both"/>
         <w:rPr>
-          <w:rFonts w:ascii="Didot" w:hAnsi="Didot" w:cs="Didot" w:hint="cs"/>
+          <w:rFonts w:ascii="Didot" w:hAnsi="Didot" w:cs="Didot"/>
           <w:sz w:val="22"/>
           <w:szCs w:val="22"/>
         </w:rPr>
@@ -523,7 +525,7 @@
         <w:spacing w:line="360" w:lineRule="auto"/>
         <w:jc w:val="both"/>
         <w:rPr>
-          <w:rFonts w:ascii="Didot" w:hAnsi="Didot" w:cs="Didot" w:hint="cs"/>
+          <w:rFonts w:ascii="Didot" w:hAnsi="Didot" w:cs="Didot"/>
           <w:sz w:val="22"/>
           <w:szCs w:val="22"/>
         </w:rPr>
@@ -543,7 +545,7 @@
         <w:spacing w:line="360" w:lineRule="auto"/>
         <w:jc w:val="both"/>
         <w:rPr>
-          <w:rFonts w:ascii="Didot" w:hAnsi="Didot" w:cs="Didot" w:hint="cs"/>
+          <w:rFonts w:ascii="Didot" w:hAnsi="Didot" w:cs="Didot"/>
           <w:sz w:val="22"/>
           <w:szCs w:val="22"/>
         </w:rPr>
@@ -562,7 +564,7 @@
         <w:spacing w:line="360" w:lineRule="auto"/>
         <w:jc w:val="both"/>
         <w:rPr>
-          <w:rFonts w:ascii="Didot" w:hAnsi="Didot" w:cs="Didot" w:hint="cs"/>
+          <w:rFonts w:ascii="Didot" w:hAnsi="Didot" w:cs="Didot"/>
           <w:sz w:val="22"/>
           <w:szCs w:val="22"/>
         </w:rPr>
@@ -573,7 +575,7 @@
         <w:spacing w:line="360" w:lineRule="auto"/>
         <w:jc w:val="both"/>
         <w:rPr>
-          <w:rFonts w:ascii="Didot" w:hAnsi="Didot" w:cs="Didot" w:hint="cs"/>
+          <w:rFonts w:ascii="Didot" w:hAnsi="Didot" w:cs="Didot"/>
           <w:sz w:val="22"/>
           <w:szCs w:val="22"/>
         </w:rPr>
@@ -591,17 +593,17 @@
       <w:pPr>
         <w:spacing w:line="360" w:lineRule="auto"/>
         <w:rPr>
-          <w:rFonts w:ascii="Didot" w:hAnsi="Didot" w:cs="Didot" w:hint="cs"/>
-          <w:sz w:val="22"/>
-          <w:szCs w:val="22"/>
-        </w:rPr>
-      </w:pPr>
-    </w:p>
-    <w:p>
-      <w:pPr>
-        <w:spacing w:line="360" w:lineRule="auto"/>
-        <w:rPr>
-          <w:rFonts w:ascii="Didot" w:hAnsi="Didot" w:cs="Didot" w:hint="cs"/>
+          <w:rFonts w:ascii="Didot" w:hAnsi="Didot" w:cs="Didot"/>
+          <w:sz w:val="22"/>
+          <w:szCs w:val="22"/>
+        </w:rPr>
+      </w:pPr>
+    </w:p>
+    <w:p>
+      <w:pPr>
+        <w:spacing w:line="360" w:lineRule="auto"/>
+        <w:rPr>
+          <w:rFonts w:ascii="Didot" w:hAnsi="Didot" w:cs="Didot"/>
           <w:sz w:val="22"/>
           <w:szCs w:val="22"/>
         </w:rPr>
@@ -619,7 +621,7 @@
       <w:pPr>
         <w:spacing w:line="360" w:lineRule="auto"/>
         <w:rPr>
-          <w:rFonts w:ascii="Didot" w:hAnsi="Didot" w:cs="Didot" w:hint="cs"/>
+          <w:rFonts w:ascii="Didot" w:hAnsi="Didot" w:cs="Didot"/>
           <w:sz w:val="22"/>
           <w:szCs w:val="22"/>
         </w:rPr>
@@ -653,27 +655,217 @@
       <w:pPr>
         <w:spacing w:line="360" w:lineRule="auto"/>
         <w:rPr>
-          <w:rFonts w:ascii="Didot" w:hAnsi="Didot" w:cs="Didot" w:hint="cs"/>
-          <w:sz w:val="22"/>
-          <w:szCs w:val="22"/>
-        </w:rPr>
-      </w:pPr>
-    </w:p>
-    <w:p>
-      <w:pPr>
-        <w:spacing w:line="360" w:lineRule="auto"/>
-        <w:rPr>
-          <w:rFonts w:ascii="Didot" w:hAnsi="Didot" w:cs="Didot" w:hint="cs"/>
-          <w:sz w:val="22"/>
-          <w:szCs w:val="22"/>
-        </w:rPr>
-      </w:pPr>
-    </w:p>
-    <w:p>
-      <w:pPr>
-        <w:spacing w:line="360" w:lineRule="auto"/>
-        <w:rPr>
-          <w:rFonts w:ascii="Didot" w:hAnsi="Didot" w:cs="Didot" w:hint="cs"/>
+          <w:rFonts w:ascii="Didot" w:hAnsi="Didot" w:cs="Didot"/>
+          <w:sz w:val="22"/>
+          <w:szCs w:val="22"/>
+        </w:rPr>
+      </w:pPr>
+      <w:r>
+        <w:rPr>
+          <w:rFonts w:ascii="Didot" w:hAnsi="Didot" w:cs="Didot"/>
+          <w:sz w:val="22"/>
+          <w:szCs w:val="22"/>
+        </w:rPr>
+        <w:t xml:space="preserve">1. </w:t>
+      </w:r>
+      <w:r>
+        <w:rPr>
+          <w:rFonts w:ascii="Didot" w:hAnsi="Didot" w:cs="Didot"/>
+          <w:sz w:val="22"/>
+          <w:szCs w:val="22"/>
+        </w:rPr>
+        <w:t>Não</w:t>
+      </w:r>
+      <w:r>
+        <w:rPr>
+          <w:rFonts w:ascii="Didot" w:hAnsi="Didot" w:cs="Didot"/>
+          <w:sz w:val="22"/>
+          <w:szCs w:val="22"/>
+        </w:rPr>
+        <w:t>-holonômia: não desliza lateralmente</w:t>
+      </w:r>
+      <w:r>
+        <w:rPr>
+          <w:rFonts w:ascii="Didot" w:hAnsi="Didot" w:cs="Didot"/>
+          <w:sz w:val="22"/>
+          <w:szCs w:val="22"/>
+        </w:rPr>
+        <w:t xml:space="preserve"> (</w:t>
+      </w:r>
+      <m:oMath>
+        <m:acc>
+          <m:accPr>
+            <m:chr m:val="̇"/>
+            <m:ctrlPr>
+              <w:rPr>
+                <w:rFonts w:ascii="Cambria Math" w:hAnsi="Cambria Math" w:cs="Didot"/>
+                <w:sz w:val="22"/>
+                <w:szCs w:val="22"/>
+              </w:rPr>
+            </m:ctrlPr>
+          </m:accPr>
+          <m:e>
+            <m:r>
+              <w:rPr>
+                <w:rFonts w:ascii="Cambria Math" w:hAnsi="Cambria Math" w:cs="Didot"/>
+                <w:sz w:val="22"/>
+                <w:szCs w:val="22"/>
+              </w:rPr>
+              <m:t>x</m:t>
+            </m:r>
+          </m:e>
+        </m:acc>
+        <m:func>
+          <m:funcPr>
+            <m:ctrlPr>
+              <w:rPr>
+                <w:rFonts w:ascii="Cambria Math" w:hAnsi="Cambria Math" w:cs="Didot"/>
+                <w:sz w:val="22"/>
+                <w:szCs w:val="22"/>
+              </w:rPr>
+            </m:ctrlPr>
+          </m:funcPr>
+          <m:fName>
+            <m:r>
+              <m:rPr>
+                <m:sty m:val="p"/>
+              </m:rPr>
+              <w:rPr>
+                <w:rFonts w:ascii="Cambria Math" w:hAnsi="Cambria Math" w:cs="Didot"/>
+                <w:sz w:val="22"/>
+                <w:szCs w:val="22"/>
+              </w:rPr>
+              <m:t>sin</m:t>
+            </m:r>
+          </m:fName>
+          <m:e>
+            <m:r>
+              <w:rPr>
+                <w:rFonts w:ascii="Cambria Math" w:hAnsi="Cambria Math" w:cs="Didot"/>
+                <w:sz w:val="22"/>
+                <w:szCs w:val="22"/>
+              </w:rPr>
+              <m:t>θ</m:t>
+            </m:r>
+          </m:e>
+        </m:func>
+        <m:r>
+          <w:rPr>
+            <w:rFonts w:ascii="Cambria Math" w:hAnsi="Cambria Math" w:cs="Didot"/>
+            <w:sz w:val="22"/>
+            <w:szCs w:val="22"/>
+          </w:rPr>
+          <m:t>-</m:t>
+        </m:r>
+        <m:acc>
+          <m:accPr>
+            <m:chr m:val="̇"/>
+            <m:ctrlPr>
+              <w:rPr>
+                <w:rFonts w:ascii="Cambria Math" w:hAnsi="Cambria Math" w:cs="Didot"/>
+                <w:sz w:val="22"/>
+                <w:szCs w:val="22"/>
+              </w:rPr>
+            </m:ctrlPr>
+          </m:accPr>
+          <m:e>
+            <m:r>
+              <w:rPr>
+                <w:rFonts w:ascii="Cambria Math" w:hAnsi="Cambria Math" w:cs="Didot"/>
+                <w:sz w:val="22"/>
+                <w:szCs w:val="22"/>
+              </w:rPr>
+              <m:t>y</m:t>
+            </m:r>
+          </m:e>
+        </m:acc>
+        <m:func>
+          <m:funcPr>
+            <m:ctrlPr>
+              <w:rPr>
+                <w:rFonts w:ascii="Cambria Math" w:hAnsi="Cambria Math" w:cs="Didot"/>
+                <w:sz w:val="22"/>
+                <w:szCs w:val="22"/>
+              </w:rPr>
+            </m:ctrlPr>
+          </m:funcPr>
+          <m:fName>
+            <m:r>
+              <m:rPr>
+                <m:sty m:val="p"/>
+              </m:rPr>
+              <w:rPr>
+                <w:rFonts w:ascii="Cambria Math" w:hAnsi="Cambria Math" w:cs="Didot"/>
+                <w:sz w:val="22"/>
+                <w:szCs w:val="22"/>
+              </w:rPr>
+              <m:t>cos</m:t>
+            </m:r>
+          </m:fName>
+          <m:e>
+            <m:r>
+              <w:rPr>
+                <w:rFonts w:ascii="Cambria Math" w:hAnsi="Cambria Math" w:cs="Didot"/>
+                <w:sz w:val="22"/>
+                <w:szCs w:val="22"/>
+              </w:rPr>
+              <m:t>θ = 0</m:t>
+            </m:r>
+          </m:e>
+        </m:func>
+      </m:oMath>
+      <w:r>
+        <w:rPr>
+          <w:rFonts w:ascii="Didot" w:hAnsi="Didot" w:cs="Didot"/>
+          <w:sz w:val="22"/>
+          <w:szCs w:val="22"/>
+        </w:rPr>
+        <w:t>)</w:t>
+      </w:r>
+    </w:p>
+    <w:p>
+      <w:pPr>
+        <w:spacing w:line="360" w:lineRule="auto"/>
+        <w:rPr>
+          <w:rFonts w:ascii="Didot" w:hAnsi="Didot" w:cs="Didot"/>
+          <w:sz w:val="22"/>
+          <w:szCs w:val="22"/>
+        </w:rPr>
+      </w:pPr>
+      <w:r>
+        <w:rPr>
+          <w:rFonts w:ascii="Didot" w:hAnsi="Didot" w:cs="Didot"/>
+          <w:sz w:val="22"/>
+          <w:szCs w:val="22"/>
+        </w:rPr>
+        <w:t>2. Não-estabilizabilidade suave: pelo Teorema de Brockett, por isso exige controle de fases ou variante no tempo</w:t>
+      </w:r>
+    </w:p>
+    <w:p>
+      <w:pPr>
+        <w:spacing w:line="360" w:lineRule="auto"/>
+        <w:rPr>
+          <w:rFonts w:ascii="Didot" w:hAnsi="Didot" w:cs="Didot"/>
+          <w:sz w:val="22"/>
+          <w:szCs w:val="22"/>
+        </w:rPr>
+      </w:pPr>
+    </w:p>
+    <w:p>
+      <w:pPr>
+        <w:spacing w:line="360" w:lineRule="auto"/>
+        <w:rPr>
+          <w:rFonts w:ascii="Didot" w:hAnsi="Didot" w:cs="Didot"/>
+          <w:sz w:val="22"/>
+          <w:szCs w:val="22"/>
+        </w:rPr>
+      </w:pPr>
+    </w:p>
+    <w:p>
+      <w:pPr>
+        <w:spacing w:line="360" w:lineRule="auto"/>
+        <w:rPr>
+          <w:rFonts w:ascii="Didot" w:hAnsi="Didot" w:cs="Didot"/>
           <w:sz w:val="22"/>
           <w:szCs w:val="22"/>
         </w:rPr>
@@ -691,7 +883,7 @@
       <w:pPr>
         <w:spacing w:line="360" w:lineRule="auto"/>
         <w:rPr>
-          <w:rFonts w:ascii="Didot" w:hAnsi="Didot" w:cs="Didot" w:hint="cs"/>
+          <w:rFonts w:ascii="Didot" w:hAnsi="Didot" w:cs="Didot"/>
           <w:sz w:val="22"/>
           <w:szCs w:val="22"/>
         </w:rPr>
@@ -719,17 +911,17 @@
       <w:pPr>
         <w:spacing w:line="360" w:lineRule="auto"/>
         <w:rPr>
-          <w:rFonts w:ascii="Didot" w:hAnsi="Didot" w:cs="Didot" w:hint="cs"/>
-          <w:sz w:val="22"/>
-          <w:szCs w:val="22"/>
-        </w:rPr>
-      </w:pPr>
-    </w:p>
-    <w:p>
-      <w:pPr>
-        <w:spacing w:line="360" w:lineRule="auto"/>
-        <w:rPr>
-          <w:rFonts w:ascii="Didot" w:hAnsi="Didot" w:cs="Didot" w:hint="cs"/>
+          <w:rFonts w:ascii="Didot" w:hAnsi="Didot" w:cs="Didot"/>
+          <w:sz w:val="22"/>
+          <w:szCs w:val="22"/>
+        </w:rPr>
+      </w:pPr>
+    </w:p>
+    <w:p>
+      <w:pPr>
+        <w:spacing w:line="360" w:lineRule="auto"/>
+        <w:rPr>
+          <w:rFonts w:ascii="Didot" w:hAnsi="Didot" w:cs="Didot"/>
           <w:sz w:val="22"/>
           <w:szCs w:val="22"/>
         </w:rPr>
@@ -747,7 +939,7 @@
       <w:pPr>
         <w:spacing w:line="360" w:lineRule="auto"/>
         <w:rPr>
-          <w:rFonts w:ascii="Didot" w:hAnsi="Didot" w:cs="Didot" w:hint="cs"/>
+          <w:rFonts w:ascii="Didot" w:hAnsi="Didot" w:cs="Didot"/>
           <w:sz w:val="22"/>
           <w:szCs w:val="22"/>
         </w:rPr>
@@ -765,7 +957,7 @@
       <w:pPr>
         <w:spacing w:line="360" w:lineRule="auto"/>
         <w:rPr>
-          <w:rFonts w:ascii="Didot" w:hAnsi="Didot" w:cs="Didot" w:hint="cs"/>
+          <w:rFonts w:ascii="Didot" w:hAnsi="Didot" w:cs="Didot"/>
           <w:sz w:val="22"/>
           <w:szCs w:val="22"/>
         </w:rPr>
@@ -799,27 +991,27 @@
       <w:pPr>
         <w:spacing w:line="360" w:lineRule="auto"/>
         <w:rPr>
-          <w:rFonts w:ascii="Didot" w:hAnsi="Didot" w:cs="Didot" w:hint="cs"/>
-          <w:sz w:val="22"/>
-          <w:szCs w:val="22"/>
-        </w:rPr>
-      </w:pPr>
-    </w:p>
-    <w:p>
-      <w:pPr>
-        <w:spacing w:line="360" w:lineRule="auto"/>
-        <w:rPr>
-          <w:rFonts w:ascii="Didot" w:hAnsi="Didot" w:cs="Didot" w:hint="cs"/>
-          <w:sz w:val="22"/>
-          <w:szCs w:val="22"/>
-        </w:rPr>
-      </w:pPr>
-    </w:p>
-    <w:p>
-      <w:pPr>
-        <w:spacing w:line="360" w:lineRule="auto"/>
-        <w:rPr>
-          <w:rFonts w:ascii="Didot" w:hAnsi="Didot" w:cs="Didot" w:hint="cs"/>
+          <w:rFonts w:ascii="Didot" w:hAnsi="Didot" w:cs="Didot"/>
+          <w:sz w:val="22"/>
+          <w:szCs w:val="22"/>
+        </w:rPr>
+      </w:pPr>
+    </w:p>
+    <w:p>
+      <w:pPr>
+        <w:spacing w:line="360" w:lineRule="auto"/>
+        <w:rPr>
+          <w:rFonts w:ascii="Didot" w:hAnsi="Didot" w:cs="Didot"/>
+          <w:sz w:val="22"/>
+          <w:szCs w:val="22"/>
+        </w:rPr>
+      </w:pPr>
+    </w:p>
+    <w:p>
+      <w:pPr>
+        <w:spacing w:line="360" w:lineRule="auto"/>
+        <w:rPr>
+          <w:rFonts w:ascii="Didot" w:hAnsi="Didot" w:cs="Didot"/>
           <w:sz w:val="22"/>
           <w:szCs w:val="22"/>
         </w:rPr>
@@ -837,17 +1029,18 @@
       <w:pPr>
         <w:spacing w:line="360" w:lineRule="auto"/>
         <w:rPr>
-          <w:rFonts w:ascii="Didot" w:hAnsi="Didot" w:cs="Didot" w:hint="cs"/>
-          <w:sz w:val="22"/>
-          <w:szCs w:val="22"/>
-        </w:rPr>
-      </w:pPr>
-      <w:r>
-        <w:rPr>
-          <w:rFonts w:ascii="Didot" w:hAnsi="Didot" w:cs="Didot" w:hint="cs"/>
-          <w:sz w:val="22"/>
-          <w:szCs w:val="22"/>
-        </w:rPr>
+          <w:rFonts w:ascii="Didot" w:hAnsi="Didot" w:cs="Didot"/>
+          <w:sz w:val="22"/>
+          <w:szCs w:val="22"/>
+        </w:rPr>
+      </w:pPr>
+      <w:r>
+        <w:rPr>
+          <w:rFonts w:ascii="Didot" w:hAnsi="Didot" w:cs="Didot" w:hint="cs"/>
+          <w:sz w:val="22"/>
+          <w:szCs w:val="22"/>
+        </w:rPr>
+        <w:lastRenderedPageBreak/>
         <w:t>Quais critérios você usaria para ajustar os ganhos do controlador para garantir um comportamento suave, seguro e eficiente?</w:t>
       </w:r>
     </w:p>
@@ -855,27 +1048,27 @@
       <w:pPr>
         <w:spacing w:line="360" w:lineRule="auto"/>
         <w:rPr>
-          <w:rFonts w:ascii="Didot" w:hAnsi="Didot" w:cs="Didot" w:hint="cs"/>
-          <w:sz w:val="22"/>
-          <w:szCs w:val="22"/>
-        </w:rPr>
-      </w:pPr>
-    </w:p>
-    <w:p>
-      <w:pPr>
-        <w:spacing w:line="360" w:lineRule="auto"/>
-        <w:rPr>
-          <w:rFonts w:ascii="Didot" w:hAnsi="Didot" w:cs="Didot" w:hint="cs"/>
-          <w:sz w:val="22"/>
-          <w:szCs w:val="22"/>
-        </w:rPr>
-      </w:pPr>
-    </w:p>
-    <w:p>
-      <w:pPr>
-        <w:spacing w:line="360" w:lineRule="auto"/>
-        <w:rPr>
-          <w:rFonts w:ascii="Didot" w:hAnsi="Didot" w:cs="Didot" w:hint="cs"/>
+          <w:rFonts w:ascii="Didot" w:hAnsi="Didot" w:cs="Didot"/>
+          <w:sz w:val="22"/>
+          <w:szCs w:val="22"/>
+        </w:rPr>
+      </w:pPr>
+    </w:p>
+    <w:p>
+      <w:pPr>
+        <w:spacing w:line="360" w:lineRule="auto"/>
+        <w:rPr>
+          <w:rFonts w:ascii="Didot" w:hAnsi="Didot" w:cs="Didot"/>
+          <w:sz w:val="22"/>
+          <w:szCs w:val="22"/>
+        </w:rPr>
+      </w:pPr>
+    </w:p>
+    <w:p>
+      <w:pPr>
+        <w:spacing w:line="360" w:lineRule="auto"/>
+        <w:rPr>
+          <w:rFonts w:ascii="Didot" w:hAnsi="Didot" w:cs="Didot"/>
           <w:sz w:val="22"/>
           <w:szCs w:val="22"/>
         </w:rPr>
@@ -893,7 +1086,7 @@
       <w:pPr>
         <w:spacing w:line="360" w:lineRule="auto"/>
         <w:rPr>
-          <w:rFonts w:ascii="Didot" w:hAnsi="Didot" w:cs="Didot" w:hint="cs"/>
+          <w:rFonts w:ascii="Didot" w:hAnsi="Didot" w:cs="Didot"/>
           <w:sz w:val="22"/>
           <w:szCs w:val="22"/>
         </w:rPr>
@@ -936,7 +1129,7 @@
       <w:pPr>
         <w:spacing w:line="360" w:lineRule="auto"/>
         <w:rPr>
-          <w:rFonts w:ascii="Didot" w:hAnsi="Didot" w:cs="Didot" w:hint="cs"/>
+          <w:rFonts w:ascii="Didot" w:hAnsi="Didot" w:cs="Didot"/>
           <w:sz w:val="22"/>
           <w:szCs w:val="22"/>
         </w:rPr>
@@ -954,7 +1147,7 @@
       <w:pPr>
         <w:spacing w:line="360" w:lineRule="auto"/>
         <w:rPr>
-          <w:rFonts w:ascii="Didot" w:hAnsi="Didot" w:cs="Didot" w:hint="cs"/>
+          <w:rFonts w:ascii="Didot" w:hAnsi="Didot" w:cs="Didot"/>
           <w:sz w:val="22"/>
           <w:szCs w:val="22"/>
         </w:rPr>
@@ -972,7 +1165,7 @@
       <w:pPr>
         <w:spacing w:line="360" w:lineRule="auto"/>
         <w:rPr>
-          <w:rFonts w:ascii="Didot" w:hAnsi="Didot" w:cs="Didot" w:hint="cs"/>
+          <w:rFonts w:ascii="Didot" w:hAnsi="Didot" w:cs="Didot"/>
           <w:sz w:val="22"/>
           <w:szCs w:val="22"/>
         </w:rPr>
@@ -990,7 +1183,7 @@
       <w:pPr>
         <w:spacing w:line="360" w:lineRule="auto"/>
         <w:rPr>
-          <w:rFonts w:ascii="Didot" w:hAnsi="Didot" w:cs="Didot" w:hint="cs"/>
+          <w:rFonts w:ascii="Didot" w:hAnsi="Didot" w:cs="Didot"/>
           <w:sz w:val="22"/>
           <w:szCs w:val="22"/>
         </w:rPr>
@@ -1006,7 +1199,7 @@
       <m:oMath>
         <m:r>
           <w:rPr>
-            <w:rFonts w:ascii="Cambria Math" w:hAnsi="Cambria Math" w:cs="Didot" w:hint="cs"/>
+            <w:rFonts w:ascii="Cambria Math" w:hAnsi="Cambria Math" w:cs="Didot"/>
             <w:sz w:val="22"/>
             <w:szCs w:val="22"/>
           </w:rPr>
@@ -1018,37 +1211,37 @@
       <w:pPr>
         <w:spacing w:line="360" w:lineRule="auto"/>
         <w:rPr>
-          <w:rFonts w:ascii="Didot" w:hAnsi="Didot" w:cs="Didot" w:hint="cs"/>
-          <w:sz w:val="22"/>
-          <w:szCs w:val="22"/>
-        </w:rPr>
-      </w:pPr>
-    </w:p>
-    <w:p>
-      <w:pPr>
-        <w:spacing w:line="360" w:lineRule="auto"/>
-        <w:rPr>
-          <w:rFonts w:ascii="Didot" w:hAnsi="Didot" w:cs="Didot" w:hint="cs"/>
-          <w:sz w:val="22"/>
-          <w:szCs w:val="22"/>
-        </w:rPr>
-      </w:pPr>
-    </w:p>
-    <w:p>
-      <w:pPr>
-        <w:spacing w:line="360" w:lineRule="auto"/>
-        <w:rPr>
-          <w:rFonts w:ascii="Didot" w:hAnsi="Didot" w:cs="Didot" w:hint="cs"/>
-          <w:sz w:val="22"/>
-          <w:szCs w:val="22"/>
-        </w:rPr>
-      </w:pPr>
-    </w:p>
-    <w:p>
-      <w:pPr>
-        <w:spacing w:line="360" w:lineRule="auto"/>
-        <w:rPr>
-          <w:rFonts w:ascii="Didot" w:hAnsi="Didot" w:cs="Didot" w:hint="cs"/>
+          <w:rFonts w:ascii="Didot" w:hAnsi="Didot" w:cs="Didot"/>
+          <w:sz w:val="22"/>
+          <w:szCs w:val="22"/>
+        </w:rPr>
+      </w:pPr>
+    </w:p>
+    <w:p>
+      <w:pPr>
+        <w:spacing w:line="360" w:lineRule="auto"/>
+        <w:rPr>
+          <w:rFonts w:ascii="Didot" w:hAnsi="Didot" w:cs="Didot"/>
+          <w:sz w:val="22"/>
+          <w:szCs w:val="22"/>
+        </w:rPr>
+      </w:pPr>
+    </w:p>
+    <w:p>
+      <w:pPr>
+        <w:spacing w:line="360" w:lineRule="auto"/>
+        <w:rPr>
+          <w:rFonts w:ascii="Didot" w:hAnsi="Didot" w:cs="Didot"/>
+          <w:sz w:val="22"/>
+          <w:szCs w:val="22"/>
+        </w:rPr>
+      </w:pPr>
+    </w:p>
+    <w:p>
+      <w:pPr>
+        <w:spacing w:line="360" w:lineRule="auto"/>
+        <w:rPr>
+          <w:rFonts w:ascii="Didot" w:hAnsi="Didot" w:cs="Didot"/>
           <w:sz w:val="22"/>
           <w:szCs w:val="22"/>
         </w:rPr>
@@ -1066,7 +1259,7 @@
       <w:pPr>
         <w:spacing w:line="360" w:lineRule="auto"/>
         <w:rPr>
-          <w:rFonts w:ascii="Didot" w:hAnsi="Didot" w:cs="Didot" w:hint="cs"/>
+          <w:rFonts w:ascii="Didot" w:hAnsi="Didot" w:cs="Didot"/>
           <w:sz w:val="22"/>
           <w:szCs w:val="22"/>
         </w:rPr>
@@ -1101,7 +1294,7 @@
       <w:pPr>
         <w:spacing w:line="360" w:lineRule="auto"/>
         <w:rPr>
-          <w:rFonts w:ascii="Didot" w:hAnsi="Didot" w:cs="Didot" w:hint="cs"/>
+          <w:rFonts w:ascii="Didot" w:hAnsi="Didot" w:cs="Didot"/>
           <w:sz w:val="22"/>
           <w:szCs w:val="22"/>
         </w:rPr>
@@ -1117,7 +1310,7 @@
       <m:oMath>
         <m:r>
           <w:rPr>
-            <w:rFonts w:ascii="Cambria Math" w:hAnsi="Cambria Math" w:cs="Didot" w:hint="cs"/>
+            <w:rFonts w:ascii="Cambria Math" w:hAnsi="Cambria Math" w:cs="Didot"/>
             <w:sz w:val="22"/>
             <w:szCs w:val="22"/>
           </w:rPr>
@@ -1137,7 +1330,7 @@
       <w:pPr>
         <w:spacing w:line="360" w:lineRule="auto"/>
         <w:rPr>
-          <w:rFonts w:ascii="Didot" w:hAnsi="Didot" w:cs="Didot" w:hint="cs"/>
+          <w:rFonts w:ascii="Didot" w:hAnsi="Didot" w:cs="Didot"/>
           <w:sz w:val="22"/>
           <w:szCs w:val="22"/>
         </w:rPr>
@@ -1153,7 +1346,7 @@
       <m:oMath>
         <m:r>
           <w:rPr>
-            <w:rFonts w:ascii="Cambria Math" w:hAnsi="Cambria Math" w:cs="Didot" w:hint="cs"/>
+            <w:rFonts w:ascii="Cambria Math" w:hAnsi="Cambria Math" w:cs="Didot"/>
             <w:sz w:val="22"/>
             <w:szCs w:val="22"/>
           </w:rPr>
@@ -1173,7 +1366,7 @@
       <w:pPr>
         <w:spacing w:line="360" w:lineRule="auto"/>
         <w:rPr>
-          <w:rFonts w:ascii="Didot" w:hAnsi="Didot" w:cs="Didot" w:hint="cs"/>
+          <w:rFonts w:ascii="Didot" w:hAnsi="Didot" w:cs="Didot"/>
           <w:sz w:val="22"/>
           <w:szCs w:val="22"/>
         </w:rPr>
@@ -1190,7 +1383,7 @@
 </file>
 
 <file path=word/numbering.xml><?xml version="1.0" encoding="utf-8"?>
-<w:numbering xmlns:wpc="http://schemas.microsoft.com/office/word/2010/wordprocessingCanvas" xmlns:cx="http://schemas.microsoft.com/office/drawing/2014/chartex" xmlns:cx1="http://schemas.microsoft.com/office/drawing/2015/9/8/chartex" xmlns:cx2="http://schemas.microsoft.com/office/drawing/2015/10/21/chartex" xmlns:cx3="http://schemas.microsoft.com/office/drawing/2016/5/9/chartex" xmlns:cx4="http://schemas.microsoft.com/office/drawing/2016/5/10/chartex" xmlns:cx5="http://schemas.microsoft.com/office/drawing/2016/5/11/chartex" xmlns:cx6="http://schemas.microsoft.com/office/drawing/2016/5/12/chartex" xmlns:cx7="http://schemas.microsoft.com/office/drawing/2016/5/13/chartex" xmlns:cx8="http://schemas.microsoft.com/office/drawing/2016/5/14/chartex" xmlns:mc="http://schemas.openxmlformats.org/markup-compatibility/2006" xmlns:m="http://schemas.openxmlformats.org/officeDocument/2006/math" xmlns:aink="http://schemas.microsoft.com/office/drawing/2016/ink" xmlns:am3d="http://schemas.microsoft.com/office/drawing/2017/model3d" xmlns:oel="http://schemas.microsoft.com/office/2019/extlst" xmlns:r="http://schemas.openxmlformats.org/officeDocument/2006/relationships" xmlns:wp14="http://schemas.microsoft.com/office/word/2010/wordprocessingDrawing" xmlns:wp="http://schemas.openxmlformats.org/drawingml/2006/wordprocessingDrawing" xmlns:wpg="http://schemas.microsoft.com/office/word/2010/wordprocessingGroup" xmlns:wpi="http://schemas.microsoft.com/office/word/2010/wordprocessingInk" xmlns:wps="http://schemas.microsoft.com/office/word/2010/wordprocessingShape" xmlns:o="urn:schemas-microsoft-com:office:office" xmlns:v="urn:schemas-microsoft-com:vml" xmlns:w10="urn:schemas-microsoft-com:office:word" xmlns:w="http://schemas.openxmlformats.org/wordprocessingml/2006/main" xmlns:w14="http://schemas.microsoft.com/office/word/2010/wordml" xmlns:w15="http://schemas.microsoft.com/office/word/2012/wordml" xmlns:w16cei="http://schemas.microsoft.com/office/word/2026/wordml/cei" xmlns:w16cex="http://schemas.microsoft.com/office/word/2018/wordml/cex" xmlns:w16cid="http://schemas.microsoft.com/office/word/2016/wordml/cid" xmlns:w16="http://schemas.microsoft.com/office/word/2018/wordml" xmlns:w16sdtdh="http://schemas.microsoft.com/office/word/2020/wordml/sdtdatahash" xmlns:w16sdtfl="http://schemas.microsoft.com/office/word/2024/wordml/sdtformatlock" xmlns:w16se="http://schemas.microsoft.com/office/word/2015/wordml/symex" xmlns:w16du="http://schemas.microsoft.com/office/word/2023/wordml/word16du" xmlns:wne="http://schemas.microsoft.com/office/word/2006/wordml" mc:Ignorable="w14 w15 w16se w16cid w16 w16cex w16sdtdh w16sdtfl w16du wp14">
+<w:numbering xmlns:wpc="http://schemas.microsoft.com/office/word/2010/wordprocessingCanvas" xmlns:cx="http://schemas.microsoft.com/office/drawing/2014/chartex" xmlns:cx1="http://schemas.microsoft.com/office/drawing/2015/9/8/chartex" xmlns:cx2="http://schemas.microsoft.com/office/drawing/2015/10/21/chartex" xmlns:cx3="http://schemas.microsoft.com/office/drawing/2016/5/9/chartex" xmlns:cx4="http://schemas.microsoft.com/office/drawing/2016/5/10/chartex" xmlns:cx5="http://schemas.microsoft.com/office/drawing/2016/5/11/chartex" xmlns:cx6="http://schemas.microsoft.com/office/drawing/2016/5/12/chartex" xmlns:cx7="http://schemas.microsoft.com/office/drawing/2016/5/13/chartex" xmlns:cx8="http://schemas.microsoft.com/office/drawing/2016/5/14/chartex" xmlns:mc="http://schemas.openxmlformats.org/markup-compatibility/2006" xmlns:m="http://schemas.openxmlformats.org/officeDocument/2006/math" xmlns:aink="http://schemas.microsoft.com/office/drawing/2016/ink" xmlns:am3d="http://schemas.microsoft.com/office/drawing/2017/model3d" xmlns:oel="http://schemas.microsoft.com/office/2019/extlst" xmlns:r="http://schemas.openxmlformats.org/officeDocument/2006/relationships" xmlns:wp14="http://schemas.microsoft.com/office/word/2010/wordprocessingDrawing" xmlns:wp="http://schemas.openxmlformats.org/drawingml/2006/wordprocessingDrawing" xmlns:wpg="http://schemas.microsoft.com/office/word/2010/wordprocessingGroup" xmlns:wpi="http://schemas.microsoft.com/office/word/2010/wordprocessingInk" xmlns:wps="http://schemas.microsoft.com/office/word/2010/wordprocessingShape" xmlns:o="urn:schemas-microsoft-com:office:office" xmlns:v="urn:schemas-microsoft-com:vml" xmlns:w10="urn:schemas-microsoft-com:office:word" xmlns:w="http://schemas.openxmlformats.org/wordprocessingml/2006/main" xmlns:w14="http://schemas.microsoft.com/office/word/2010/wordml" xmlns:w15="http://schemas.microsoft.com/office/word/2012/wordml" xmlns:w16cex="http://schemas.microsoft.com/office/word/2018/wordml/cex" xmlns:w16cid="http://schemas.microsoft.com/office/word/2016/wordml/cid" xmlns:w16="http://schemas.microsoft.com/office/word/2018/wordml" xmlns:w16sdtdh="http://schemas.microsoft.com/office/word/2020/wordml/sdtdatahash" xmlns:w16sdtfl="http://schemas.microsoft.com/office/word/2024/wordml/sdtformatlock" xmlns:w16se="http://schemas.microsoft.com/office/word/2015/wordml/symex" xmlns:w16du="http://schemas.microsoft.com/office/word/2023/wordml/word16du" xmlns:wne="http://schemas.microsoft.com/office/word/2006/wordml" mc:Ignorable="w14 w15 w16se w16cid w16 w16cex w16sdtdh w16sdtfl w16du wp14">
   <w:abstractNum w:abstractNumId="0" w15:restartNumberingAfterBreak="0">
     <w:nsid w:val="0BF85FC0"/>
     <w:multiLevelType w:val="multilevel"/>
@@ -2776,6 +2969,16 @@
       <w:u w:val="single"/>
     </w:rPr>
   </w:style>
+  <w:style w:type="character" w:styleId="PlaceholderText">
+    <w:name w:val="Placeholder Text"/>
+    <w:basedOn w:val="DefaultParagraphFont"/>
+    <w:uiPriority w:val="99"/>
+    <w:semiHidden/>
+    <w:rsid w:val="00A3249E"/>
+    <w:rPr>
+      <w:color w:val="666666"/>
+    </w:rPr>
+  </w:style>
 </w:styles>
 </file>
 

</xml_diff>

<commit_message>
Terrestre - Projeto Final
</commit_message>
<xml_diff>
--- a/6_Fundamentos-de-Robotica-Terrestre/Projeto-Final/Projeto-Final.docx
+++ b/6_Fundamentos-de-Robotica-Terrestre/Projeto-Final/Projeto-Final.docx
@@ -262,12 +262,62 @@
     <w:p>
       <w:pPr>
         <w:spacing w:line="360" w:lineRule="auto"/>
-        <w:rPr>
-          <w:rFonts w:ascii="Didot" w:hAnsi="Didot" w:cs="Didot"/>
-          <w:sz w:val="22"/>
-          <w:szCs w:val="22"/>
-        </w:rPr>
-      </w:pPr>
+        <w:jc w:val="center"/>
+        <w:rPr>
+          <w:rFonts w:ascii="Didot" w:hAnsi="Didot" w:cs="Didot"/>
+          <w:sz w:val="22"/>
+          <w:szCs w:val="22"/>
+        </w:rPr>
+      </w:pPr>
+      <w:r>
+        <w:rPr>
+          <w:rFonts w:ascii="Didot" w:hAnsi="Didot" w:cs="Didot"/>
+          <w:noProof/>
+          <w:sz w:val="22"/>
+          <w:szCs w:val="22"/>
+        </w:rPr>
+        <w:drawing>
+          <wp:inline distT="0" distB="0" distL="0" distR="0" wp14:anchorId="6DC229EF" wp14:editId="306EDF08">
+            <wp:extent cx="3332860" cy="3332860"/>
+            <wp:effectExtent l="0" t="0" r="0" b="0"/>
+            <wp:docPr id="170165436" name="Picture 1"/>
+            <wp:cNvGraphicFramePr>
+              <a:graphicFrameLocks xmlns:a="http://schemas.openxmlformats.org/drawingml/2006/main" noChangeAspect="1"/>
+            </wp:cNvGraphicFramePr>
+            <a:graphic xmlns:a="http://schemas.openxmlformats.org/drawingml/2006/main">
+              <a:graphicData uri="http://schemas.openxmlformats.org/drawingml/2006/picture">
+                <pic:pic xmlns:pic="http://schemas.openxmlformats.org/drawingml/2006/picture">
+                  <pic:nvPicPr>
+                    <pic:cNvPr id="170165436" name="Picture 170165436"/>
+                    <pic:cNvPicPr/>
+                  </pic:nvPicPr>
+                  <pic:blipFill>
+                    <a:blip r:embed="rId6" cstate="print">
+                      <a:extLst>
+                        <a:ext uri="{28A0092B-C50C-407E-A947-70E740481C1C}">
+                          <a14:useLocalDpi xmlns:a14="http://schemas.microsoft.com/office/drawing/2010/main" val="0"/>
+                        </a:ext>
+                      </a:extLst>
+                    </a:blip>
+                    <a:stretch>
+                      <a:fillRect/>
+                    </a:stretch>
+                  </pic:blipFill>
+                  <pic:spPr>
+                    <a:xfrm>
+                      <a:off x="0" y="0"/>
+                      <a:ext cx="3387731" cy="3387731"/>
+                    </a:xfrm>
+                    <a:prstGeom prst="rect">
+                      <a:avLst/>
+                    </a:prstGeom>
+                  </pic:spPr>
+                </pic:pic>
+              </a:graphicData>
+            </a:graphic>
+          </wp:inline>
+        </w:drawing>
+      </w:r>
     </w:p>
     <w:p>
       <w:pPr>
@@ -422,6 +472,7 @@
           <w:sz w:val="22"/>
           <w:szCs w:val="22"/>
         </w:rPr>
+        <w:lastRenderedPageBreak/>
         <w:t>O robô precisa ajustar sua orientação para alinhar-se corretamente à baia antes de realizar cada entrega.</w:t>
       </w:r>
     </w:p>
@@ -536,99 +587,156 @@
           <w:sz w:val="22"/>
           <w:szCs w:val="22"/>
         </w:rPr>
+        <w:t>Baia D: (+3m, -5m, 90°)</w:t>
+      </w:r>
+    </w:p>
+    <w:p>
+      <w:pPr>
+        <w:spacing w:line="360" w:lineRule="auto"/>
+        <w:jc w:val="both"/>
+        <w:rPr>
+          <w:rFonts w:ascii="Didot" w:hAnsi="Didot" w:cs="Didot"/>
+          <w:sz w:val="22"/>
+          <w:szCs w:val="22"/>
+        </w:rPr>
+      </w:pPr>
+      <w:r>
+        <w:rPr>
+          <w:rFonts w:ascii="Didot" w:hAnsi="Didot" w:cs="Didot" w:hint="cs"/>
+          <w:sz w:val="22"/>
+          <w:szCs w:val="22"/>
+        </w:rPr>
+        <w:t>Base de Recarga: (0m, -5m, 90°)</w:t>
+      </w:r>
+    </w:p>
+    <w:p>
+      <w:pPr>
+        <w:spacing w:line="360" w:lineRule="auto"/>
+        <w:jc w:val="center"/>
+        <w:rPr>
+          <w:rFonts w:ascii="Didot" w:hAnsi="Didot" w:cs="Didot"/>
+          <w:sz w:val="22"/>
+          <w:szCs w:val="22"/>
+        </w:rPr>
+      </w:pPr>
+      <w:r>
+        <w:rPr>
+          <w:rFonts w:ascii="Didot" w:hAnsi="Didot" w:cs="Didot"/>
+          <w:noProof/>
+          <w:sz w:val="22"/>
+          <w:szCs w:val="22"/>
+        </w:rPr>
+        <w:drawing>
+          <wp:inline distT="0" distB="0" distL="0" distR="0" wp14:anchorId="2DE65C45" wp14:editId="462FBCE8">
+            <wp:extent cx="5756910" cy="2620645"/>
+            <wp:effectExtent l="0" t="0" r="0" b="0"/>
+            <wp:docPr id="720665433" name="Picture 2"/>
+            <wp:cNvGraphicFramePr>
+              <a:graphicFrameLocks xmlns:a="http://schemas.openxmlformats.org/drawingml/2006/main" noChangeAspect="1"/>
+            </wp:cNvGraphicFramePr>
+            <a:graphic xmlns:a="http://schemas.openxmlformats.org/drawingml/2006/main">
+              <a:graphicData uri="http://schemas.openxmlformats.org/drawingml/2006/picture">
+                <pic:pic xmlns:pic="http://schemas.openxmlformats.org/drawingml/2006/picture">
+                  <pic:nvPicPr>
+                    <pic:cNvPr id="720665433" name="Picture 720665433"/>
+                    <pic:cNvPicPr/>
+                  </pic:nvPicPr>
+                  <pic:blipFill>
+                    <a:blip r:embed="rId7" cstate="print">
+                      <a:extLst>
+                        <a:ext uri="{28A0092B-C50C-407E-A947-70E740481C1C}">
+                          <a14:useLocalDpi xmlns:a14="http://schemas.microsoft.com/office/drawing/2010/main" val="0"/>
+                        </a:ext>
+                      </a:extLst>
+                    </a:blip>
+                    <a:stretch>
+                      <a:fillRect/>
+                    </a:stretch>
+                  </pic:blipFill>
+                  <pic:spPr>
+                    <a:xfrm>
+                      <a:off x="0" y="0"/>
+                      <a:ext cx="5756910" cy="2620645"/>
+                    </a:xfrm>
+                    <a:prstGeom prst="rect">
+                      <a:avLst/>
+                    </a:prstGeom>
+                  </pic:spPr>
+                </pic:pic>
+              </a:graphicData>
+            </a:graphic>
+          </wp:inline>
+        </w:drawing>
+      </w:r>
+    </w:p>
+    <w:p>
+      <w:pPr>
+        <w:spacing w:line="360" w:lineRule="auto"/>
+        <w:jc w:val="both"/>
+        <w:rPr>
+          <w:rFonts w:ascii="Didot" w:hAnsi="Didot" w:cs="Didot"/>
+          <w:sz w:val="22"/>
+          <w:szCs w:val="22"/>
+        </w:rPr>
+      </w:pPr>
+      <w:r>
+        <w:rPr>
+          <w:rFonts w:ascii="Didot" w:hAnsi="Didot" w:cs="Didot" w:hint="cs"/>
+          <w:sz w:val="22"/>
+          <w:szCs w:val="22"/>
+        </w:rPr>
+        <w:t>Para solucionar o problema proposto, responda as questões a seguir:</w:t>
+      </w:r>
+    </w:p>
+    <w:p>
+      <w:pPr>
+        <w:rPr>
+          <w:rFonts w:ascii="Didot" w:hAnsi="Didot" w:cs="Didot"/>
+          <w:sz w:val="22"/>
+          <w:szCs w:val="22"/>
+        </w:rPr>
+      </w:pPr>
+      <w:r>
+        <w:rPr>
+          <w:rFonts w:ascii="Didot" w:hAnsi="Didot" w:cs="Didot"/>
+          <w:sz w:val="22"/>
+          <w:szCs w:val="22"/>
+        </w:rPr>
+        <w:br w:type="page"/>
+      </w:r>
+    </w:p>
+    <w:p>
+      <w:pPr>
+        <w:pStyle w:val="Heading1"/>
+        <w:spacing w:line="360" w:lineRule="auto"/>
+        <w:rPr>
+          <w:color w:val="0A2F41" w:themeColor="accent1" w:themeShade="80"/>
+        </w:rPr>
+      </w:pPr>
+      <w:r>
+        <w:rPr>
+          <w:rFonts w:hint="cs"/>
+          <w:color w:val="0A2F41" w:themeColor="accent1" w:themeShade="80"/>
+        </w:rPr>
         <w:lastRenderedPageBreak/>
-        <w:t>Baia D: (+3m, -5m, 90°)</w:t>
-      </w:r>
-    </w:p>
-    <w:p>
-      <w:pPr>
-        <w:spacing w:line="360" w:lineRule="auto"/>
-        <w:jc w:val="both"/>
-        <w:rPr>
-          <w:rFonts w:ascii="Didot" w:hAnsi="Didot" w:cs="Didot"/>
-          <w:sz w:val="22"/>
-          <w:szCs w:val="22"/>
-        </w:rPr>
-      </w:pPr>
-      <w:r>
-        <w:rPr>
-          <w:rFonts w:ascii="Didot" w:hAnsi="Didot" w:cs="Didot" w:hint="cs"/>
-          <w:sz w:val="22"/>
-          <w:szCs w:val="22"/>
-        </w:rPr>
-        <w:t>Base de Recarga: (0m, -5m, 90°)</w:t>
-      </w:r>
-    </w:p>
-    <w:p>
-      <w:pPr>
-        <w:spacing w:line="360" w:lineRule="auto"/>
-        <w:jc w:val="both"/>
-        <w:rPr>
-          <w:rFonts w:ascii="Didot" w:hAnsi="Didot" w:cs="Didot"/>
-          <w:sz w:val="22"/>
-          <w:szCs w:val="22"/>
-        </w:rPr>
-      </w:pPr>
-    </w:p>
-    <w:p>
-      <w:pPr>
-        <w:spacing w:line="360" w:lineRule="auto"/>
-        <w:jc w:val="both"/>
-        <w:rPr>
-          <w:rFonts w:ascii="Didot" w:hAnsi="Didot" w:cs="Didot"/>
-          <w:sz w:val="22"/>
-          <w:szCs w:val="22"/>
-        </w:rPr>
-      </w:pPr>
-      <w:r>
-        <w:rPr>
-          <w:rFonts w:ascii="Didot" w:hAnsi="Didot" w:cs="Didot" w:hint="cs"/>
-          <w:sz w:val="22"/>
-          <w:szCs w:val="22"/>
-        </w:rPr>
-        <w:t>Para solucionar o problema proposto, responda as questões a seguir:</w:t>
-      </w:r>
-    </w:p>
-    <w:p>
-      <w:pPr>
-        <w:spacing w:line="360" w:lineRule="auto"/>
-        <w:rPr>
-          <w:rFonts w:ascii="Didot" w:hAnsi="Didot" w:cs="Didot"/>
-          <w:sz w:val="22"/>
-          <w:szCs w:val="22"/>
-        </w:rPr>
-      </w:pPr>
-    </w:p>
-    <w:p>
-      <w:pPr>
-        <w:spacing w:line="360" w:lineRule="auto"/>
-        <w:rPr>
-          <w:rFonts w:ascii="Didot" w:hAnsi="Didot" w:cs="Didot"/>
-          <w:sz w:val="22"/>
-          <w:szCs w:val="22"/>
-        </w:rPr>
-      </w:pPr>
-      <w:r>
-        <w:rPr>
-          <w:rFonts w:ascii="Didot" w:hAnsi="Didot" w:cs="Didot" w:hint="cs"/>
-          <w:sz w:val="22"/>
-          <w:szCs w:val="22"/>
-        </w:rPr>
         <w:t>Questão 1</w:t>
       </w:r>
     </w:p>
     <w:p>
       <w:pPr>
         <w:spacing w:line="360" w:lineRule="auto"/>
-        <w:rPr>
-          <w:rFonts w:ascii="Didot" w:hAnsi="Didot" w:cs="Didot"/>
-          <w:sz w:val="22"/>
-          <w:szCs w:val="22"/>
-        </w:rPr>
-      </w:pPr>
-      <w:r>
-        <w:rPr>
-          <w:rFonts w:ascii="Didot" w:hAnsi="Didot" w:cs="Didot" w:hint="cs"/>
+        <w:jc w:val="both"/>
+        <w:rPr>
+          <w:rFonts w:ascii="Didot" w:hAnsi="Didot" w:cs="Didot"/>
+          <w:color w:val="0A2F41" w:themeColor="accent1" w:themeShade="80"/>
+          <w:sz w:val="22"/>
+          <w:szCs w:val="22"/>
+        </w:rPr>
+      </w:pPr>
+      <w:r>
+        <w:rPr>
+          <w:rFonts w:ascii="Didot" w:hAnsi="Didot" w:cs="Didot" w:hint="cs"/>
+          <w:color w:val="0A2F41" w:themeColor="accent1" w:themeShade="80"/>
           <w:sz w:val="22"/>
           <w:szCs w:val="22"/>
         </w:rPr>
@@ -637,6 +745,7 @@
       <w:r>
         <w:rPr>
           <w:rFonts w:ascii="Didot" w:hAnsi="Didot" w:cs="Didot"/>
+          <w:color w:val="0A2F41" w:themeColor="accent1" w:themeShade="80"/>
           <w:sz w:val="22"/>
           <w:szCs w:val="22"/>
         </w:rPr>
@@ -645,6 +754,7 @@
       <w:r>
         <w:rPr>
           <w:rFonts w:ascii="Didot" w:hAnsi="Didot" w:cs="Didot" w:hint="cs"/>
+          <w:color w:val="0A2F41" w:themeColor="accent1" w:themeShade="80"/>
           <w:sz w:val="22"/>
           <w:szCs w:val="22"/>
         </w:rPr>
@@ -654,658 +764,1704 @@
     <w:p>
       <w:pPr>
         <w:spacing w:line="360" w:lineRule="auto"/>
-        <w:rPr>
-          <w:rFonts w:ascii="Didot" w:hAnsi="Didot" w:cs="Didot"/>
-          <w:sz w:val="22"/>
-          <w:szCs w:val="22"/>
-        </w:rPr>
-      </w:pPr>
-      <w:r>
-        <w:rPr>
-          <w:rFonts w:ascii="Didot" w:hAnsi="Didot" w:cs="Didot"/>
-          <w:sz w:val="22"/>
-          <w:szCs w:val="22"/>
-        </w:rPr>
-        <w:t xml:space="preserve">1. </w:t>
-      </w:r>
-      <w:r>
-        <w:rPr>
-          <w:rFonts w:ascii="Didot" w:hAnsi="Didot" w:cs="Didot"/>
-          <w:sz w:val="22"/>
-          <w:szCs w:val="22"/>
-        </w:rPr>
-        <w:t>Não</w:t>
-      </w:r>
-      <w:r>
-        <w:rPr>
-          <w:rFonts w:ascii="Didot" w:hAnsi="Didot" w:cs="Didot"/>
-          <w:sz w:val="22"/>
-          <w:szCs w:val="22"/>
-        </w:rPr>
-        <w:t>-holonômia: não desliza lateralmente</w:t>
-      </w:r>
-      <w:r>
-        <w:rPr>
-          <w:rFonts w:ascii="Didot" w:hAnsi="Didot" w:cs="Didot"/>
-          <w:sz w:val="22"/>
-          <w:szCs w:val="22"/>
-        </w:rPr>
-        <w:t xml:space="preserve"> (</w:t>
+        <w:jc w:val="both"/>
+        <w:rPr>
+          <w:rFonts w:ascii="Didot" w:hAnsi="Didot" w:cs="Didot"/>
+          <w:color w:val="0A2F41" w:themeColor="accent1" w:themeShade="80"/>
+          <w:sz w:val="22"/>
+          <w:szCs w:val="22"/>
+        </w:rPr>
+      </w:pPr>
+    </w:p>
+    <w:p>
+      <w:pPr>
+        <w:spacing w:line="360" w:lineRule="auto"/>
+        <w:jc w:val="both"/>
+        <w:rPr>
+          <w:rFonts w:ascii="Didot" w:hAnsi="Didot" w:cs="Didot" w:hint="cs"/>
+          <w:sz w:val="22"/>
+          <w:szCs w:val="22"/>
+        </w:rPr>
+      </w:pPr>
+      <w:r>
+        <w:rPr>
+          <w:rFonts w:ascii="Didot" w:hAnsi="Didot" w:cs="Didot" w:hint="cs"/>
+          <w:sz w:val="22"/>
+          <w:szCs w:val="22"/>
+          <w:u w:val="single"/>
+        </w:rPr>
+        <w:t>1.</w:t>
+      </w:r>
+      <w:r>
+        <w:rPr>
+          <w:rFonts w:ascii="Didot" w:hAnsi="Didot" w:cs="Didot" w:hint="cs"/>
+          <w:sz w:val="22"/>
+          <w:szCs w:val="22"/>
+          <w:u w:val="single"/>
+        </w:rPr>
+        <w:t xml:space="preserve"> Restrições Não-Holonômicas:</w:t>
+      </w:r>
+      <w:r>
+        <w:rPr>
+          <w:rFonts w:ascii="Didot" w:hAnsi="Didot" w:cs="Didot" w:hint="cs"/>
+          <w:sz w:val="22"/>
+          <w:szCs w:val="22"/>
+        </w:rPr>
+        <w:t xml:space="preserve"> O robô move-se para frente e para trás e rotaciona, mas não pode mover-se lateralmente (deslizamento nulo). Isso torna impossível corrigir um err</w:t>
+      </w:r>
+      <w:r>
+        <w:rPr>
+          <w:rFonts w:ascii="Didot" w:hAnsi="Didot" w:cs="Didot"/>
+          <w:sz w:val="22"/>
+          <w:szCs w:val="22"/>
+        </w:rPr>
+        <w:t>o</w:t>
+      </w:r>
+      <w:r>
+        <w:rPr>
+          <w:rFonts w:ascii="Didot" w:hAnsi="Didot" w:cs="Didot" w:hint="cs"/>
+          <w:sz w:val="22"/>
+          <w:szCs w:val="22"/>
+        </w:rPr>
+        <w:t xml:space="preserve"> lateral de forma direta, necessitando realizar manobras de rotação seguidas de translação.</w:t>
+      </w:r>
+    </w:p>
+    <w:p>
+      <w:pPr>
+        <w:spacing w:line="360" w:lineRule="auto"/>
+        <w:jc w:val="both"/>
+        <w:rPr>
+          <w:rFonts w:ascii="Didot" w:hAnsi="Didot" w:cs="Didot" w:hint="cs"/>
+          <w:sz w:val="22"/>
+          <w:szCs w:val="22"/>
+        </w:rPr>
+      </w:pPr>
+      <w:r>
+        <w:rPr>
+          <w:rFonts w:ascii="Didot" w:hAnsi="Didot" w:cs="Didot" w:hint="cs"/>
+          <w:sz w:val="22"/>
+          <w:szCs w:val="22"/>
+          <w:u w:val="single"/>
+        </w:rPr>
+        <w:t>2. Teorema de Brockett</w:t>
+      </w:r>
+      <w:r>
+        <w:rPr>
+          <w:rFonts w:ascii="Didot" w:hAnsi="Didot" w:cs="Didot" w:hint="cs"/>
+          <w:sz w:val="22"/>
+          <w:szCs w:val="22"/>
+          <w:u w:val="single"/>
+        </w:rPr>
+        <w:t>:</w:t>
+      </w:r>
+      <w:r>
+        <w:rPr>
+          <w:rFonts w:ascii="Didot" w:hAnsi="Didot" w:cs="Didot" w:hint="cs"/>
+          <w:sz w:val="22"/>
+          <w:szCs w:val="22"/>
+        </w:rPr>
+        <w:t xml:space="preserve"> Na teoria de controle, este teorema estabelece que um robô não-holonômico não pode ser estabilizado em uma postura específica (</w:t>
       </w:r>
       <m:oMath>
-        <m:acc>
-          <m:accPr>
-            <m:chr m:val="̇"/>
-            <m:ctrlPr>
-              <w:rPr>
-                <w:rFonts w:ascii="Cambria Math" w:hAnsi="Cambria Math" w:cs="Didot"/>
-                <w:sz w:val="22"/>
-                <w:szCs w:val="22"/>
-              </w:rPr>
-            </m:ctrlPr>
-          </m:accPr>
-          <m:e>
-            <m:r>
-              <w:rPr>
-                <w:rFonts w:ascii="Cambria Math" w:hAnsi="Cambria Math" w:cs="Didot"/>
-                <w:sz w:val="22"/>
-                <w:szCs w:val="22"/>
-              </w:rPr>
-              <m:t>x</m:t>
-            </m:r>
-          </m:e>
-        </m:acc>
-        <m:func>
-          <m:funcPr>
-            <m:ctrlPr>
-              <w:rPr>
-                <w:rFonts w:ascii="Cambria Math" w:hAnsi="Cambria Math" w:cs="Didot"/>
-                <w:sz w:val="22"/>
-                <w:szCs w:val="22"/>
-              </w:rPr>
-            </m:ctrlPr>
-          </m:funcPr>
-          <m:fName>
-            <m:r>
-              <m:rPr>
-                <m:sty m:val="p"/>
-              </m:rPr>
-              <w:rPr>
-                <w:rFonts w:ascii="Cambria Math" w:hAnsi="Cambria Math" w:cs="Didot"/>
-                <w:sz w:val="22"/>
-                <w:szCs w:val="22"/>
-              </w:rPr>
-              <m:t>sin</m:t>
-            </m:r>
-          </m:fName>
-          <m:e>
-            <m:r>
-              <w:rPr>
-                <w:rFonts w:ascii="Cambria Math" w:hAnsi="Cambria Math" w:cs="Didot"/>
-                <w:sz w:val="22"/>
-                <w:szCs w:val="22"/>
-              </w:rPr>
-              <m:t>θ</m:t>
-            </m:r>
-          </m:e>
-        </m:func>
         <m:r>
           <w:rPr>
-            <w:rFonts w:ascii="Cambria Math" w:hAnsi="Cambria Math" w:cs="Didot"/>
+            <w:rFonts w:ascii="Cambria Math" w:hAnsi="Cambria Math" w:cs="Didot" w:hint="cs"/>
             <w:sz w:val="22"/>
             <w:szCs w:val="22"/>
           </w:rPr>
-          <m:t>-</m:t>
+          <m:t>x</m:t>
         </m:r>
-        <m:acc>
-          <m:accPr>
-            <m:chr m:val="̇"/>
-            <m:ctrlPr>
-              <w:rPr>
-                <w:rFonts w:ascii="Cambria Math" w:hAnsi="Cambria Math" w:cs="Didot"/>
-                <w:sz w:val="22"/>
-                <w:szCs w:val="22"/>
-              </w:rPr>
-            </m:ctrlPr>
-          </m:accPr>
-          <m:e>
-            <m:r>
-              <w:rPr>
-                <w:rFonts w:ascii="Cambria Math" w:hAnsi="Cambria Math" w:cs="Didot"/>
-                <w:sz w:val="22"/>
-                <w:szCs w:val="22"/>
-              </w:rPr>
-              <m:t>y</m:t>
-            </m:r>
-          </m:e>
-        </m:acc>
-        <m:func>
-          <m:funcPr>
-            <m:ctrlPr>
-              <w:rPr>
-                <w:rFonts w:ascii="Cambria Math" w:hAnsi="Cambria Math" w:cs="Didot"/>
-                <w:sz w:val="22"/>
-                <w:szCs w:val="22"/>
-              </w:rPr>
-            </m:ctrlPr>
-          </m:funcPr>
-          <m:fName>
-            <m:r>
-              <m:rPr>
-                <m:sty m:val="p"/>
-              </m:rPr>
-              <w:rPr>
-                <w:rFonts w:ascii="Cambria Math" w:hAnsi="Cambria Math" w:cs="Didot"/>
-                <w:sz w:val="22"/>
-                <w:szCs w:val="22"/>
-              </w:rPr>
-              <m:t>cos</m:t>
-            </m:r>
-          </m:fName>
-          <m:e>
-            <m:r>
-              <w:rPr>
-                <w:rFonts w:ascii="Cambria Math" w:hAnsi="Cambria Math" w:cs="Didot"/>
-                <w:sz w:val="22"/>
-                <w:szCs w:val="22"/>
-              </w:rPr>
-              <m:t>θ = 0</m:t>
-            </m:r>
-          </m:e>
-        </m:func>
       </m:oMath>
       <w:r>
         <w:rPr>
-          <w:rFonts w:ascii="Didot" w:hAnsi="Didot" w:cs="Didot"/>
-          <w:sz w:val="22"/>
-          <w:szCs w:val="22"/>
-        </w:rPr>
-        <w:t>)</w:t>
-      </w:r>
-    </w:p>
-    <w:p>
-      <w:pPr>
-        <w:spacing w:line="360" w:lineRule="auto"/>
-        <w:rPr>
-          <w:rFonts w:ascii="Didot" w:hAnsi="Didot" w:cs="Didot"/>
-          <w:sz w:val="22"/>
-          <w:szCs w:val="22"/>
-        </w:rPr>
-      </w:pPr>
-      <w:r>
-        <w:rPr>
-          <w:rFonts w:ascii="Didot" w:hAnsi="Didot" w:cs="Didot"/>
-          <w:sz w:val="22"/>
-          <w:szCs w:val="22"/>
-        </w:rPr>
-        <w:t>2. Não-estabilizabilidade suave: pelo Teorema de Brockett, por isso exige controle de fases ou variante no tempo</w:t>
-      </w:r>
-    </w:p>
-    <w:p>
-      <w:pPr>
-        <w:spacing w:line="360" w:lineRule="auto"/>
-        <w:rPr>
-          <w:rFonts w:ascii="Didot" w:hAnsi="Didot" w:cs="Didot"/>
-          <w:sz w:val="22"/>
-          <w:szCs w:val="22"/>
-        </w:rPr>
-      </w:pPr>
-    </w:p>
-    <w:p>
-      <w:pPr>
-        <w:spacing w:line="360" w:lineRule="auto"/>
-        <w:rPr>
-          <w:rFonts w:ascii="Didot" w:hAnsi="Didot" w:cs="Didot"/>
-          <w:sz w:val="22"/>
-          <w:szCs w:val="22"/>
-        </w:rPr>
-      </w:pPr>
-    </w:p>
-    <w:p>
-      <w:pPr>
-        <w:spacing w:line="360" w:lineRule="auto"/>
-        <w:rPr>
-          <w:rFonts w:ascii="Didot" w:hAnsi="Didot" w:cs="Didot"/>
-          <w:sz w:val="22"/>
-          <w:szCs w:val="22"/>
-        </w:rPr>
-      </w:pPr>
-      <w:r>
-        <w:rPr>
-          <w:rFonts w:ascii="Didot" w:hAnsi="Didot" w:cs="Didot" w:hint="cs"/>
-          <w:sz w:val="22"/>
-          <w:szCs w:val="22"/>
-        </w:rPr>
-        <w:t>Questão 2</w:t>
-      </w:r>
-    </w:p>
-    <w:p>
-      <w:pPr>
-        <w:spacing w:line="360" w:lineRule="auto"/>
-        <w:rPr>
-          <w:rFonts w:ascii="Didot" w:hAnsi="Didot" w:cs="Didot"/>
-          <w:sz w:val="22"/>
-          <w:szCs w:val="22"/>
-        </w:rPr>
-      </w:pPr>
-      <w:r>
-        <w:rPr>
-          <w:rFonts w:ascii="Didot" w:hAnsi="Didot" w:cs="Didot" w:hint="cs"/>
-          <w:sz w:val="22"/>
-          <w:szCs w:val="22"/>
-        </w:rPr>
-        <w:t>Como você estruturaria o controle (por exemplo, separando controle de orientação e de posição) para o problema proposto?</w:t>
-      </w:r>
-    </w:p>
-    <w:p>
-      <w:pPr>
-        <w:spacing w:line="360" w:lineRule="auto"/>
-        <w:rPr>
-          <w:rFonts w:ascii="Didot" w:hAnsi="Didot" w:cs="Didot"/>
-          <w:sz w:val="22"/>
-          <w:szCs w:val="22"/>
-        </w:rPr>
-      </w:pPr>
-    </w:p>
-    <w:p>
-      <w:pPr>
-        <w:spacing w:line="360" w:lineRule="auto"/>
-        <w:rPr>
-          <w:rFonts w:ascii="Didot" w:hAnsi="Didot" w:cs="Didot"/>
-          <w:sz w:val="22"/>
-          <w:szCs w:val="22"/>
-        </w:rPr>
-      </w:pPr>
-    </w:p>
-    <w:p>
-      <w:pPr>
-        <w:spacing w:line="360" w:lineRule="auto"/>
-        <w:rPr>
-          <w:rFonts w:ascii="Didot" w:hAnsi="Didot" w:cs="Didot"/>
-          <w:sz w:val="22"/>
-          <w:szCs w:val="22"/>
-        </w:rPr>
-      </w:pPr>
-      <w:r>
-        <w:rPr>
-          <w:rFonts w:ascii="Didot" w:hAnsi="Didot" w:cs="Didot" w:hint="cs"/>
-          <w:sz w:val="22"/>
-          <w:szCs w:val="22"/>
-        </w:rPr>
-        <w:t>Questão 3</w:t>
-      </w:r>
-    </w:p>
-    <w:p>
-      <w:pPr>
-        <w:spacing w:line="360" w:lineRule="auto"/>
-        <w:rPr>
-          <w:rFonts w:ascii="Didot" w:hAnsi="Didot" w:cs="Didot"/>
-          <w:sz w:val="22"/>
-          <w:szCs w:val="22"/>
-        </w:rPr>
-      </w:pPr>
-      <w:r>
-        <w:rPr>
-          <w:rFonts w:ascii="Didot" w:hAnsi="Didot" w:cs="Didot" w:hint="cs"/>
-          <w:sz w:val="22"/>
-          <w:szCs w:val="22"/>
-        </w:rPr>
-        <w:t>Como garantir que o robôs não colida com as baias durante a navegação?</w:t>
-      </w:r>
-    </w:p>
-    <w:p>
-      <w:pPr>
-        <w:spacing w:line="360" w:lineRule="auto"/>
-        <w:rPr>
-          <w:rFonts w:ascii="Didot" w:hAnsi="Didot" w:cs="Didot"/>
-          <w:sz w:val="22"/>
-          <w:szCs w:val="22"/>
-        </w:rPr>
-      </w:pPr>
-      <w:r>
-        <w:rPr>
-          <w:rFonts w:ascii="Didot" w:hAnsi="Didot" w:cs="Didot" w:hint="cs"/>
-          <w:sz w:val="22"/>
-          <w:szCs w:val="22"/>
-        </w:rPr>
-        <w:t>Nota: Consider</w:t>
-      </w:r>
-      <w:r>
-        <w:rPr>
-          <w:rFonts w:ascii="Didot" w:hAnsi="Didot" w:cs="Didot"/>
-          <w:sz w:val="22"/>
-          <w:szCs w:val="22"/>
-        </w:rPr>
-        <w:t>e</w:t>
-      </w:r>
-      <w:r>
-        <w:rPr>
-          <w:rFonts w:ascii="Didot" w:hAnsi="Didot" w:cs="Didot" w:hint="cs"/>
-          <w:sz w:val="22"/>
-          <w:szCs w:val="22"/>
-        </w:rPr>
-        <w:t xml:space="preserve"> que no problema proposto, o robô não possui implementado estratégias de evasão de obstáculos. O rota a ser seguida deve garantir a navegação sem colisão.</w:t>
-      </w:r>
-    </w:p>
-    <w:p>
-      <w:pPr>
-        <w:spacing w:line="360" w:lineRule="auto"/>
-        <w:rPr>
-          <w:rFonts w:ascii="Didot" w:hAnsi="Didot" w:cs="Didot"/>
-          <w:sz w:val="22"/>
-          <w:szCs w:val="22"/>
-        </w:rPr>
-      </w:pPr>
-    </w:p>
-    <w:p>
-      <w:pPr>
-        <w:spacing w:line="360" w:lineRule="auto"/>
-        <w:rPr>
-          <w:rFonts w:ascii="Didot" w:hAnsi="Didot" w:cs="Didot"/>
-          <w:sz w:val="22"/>
-          <w:szCs w:val="22"/>
-        </w:rPr>
-      </w:pPr>
-    </w:p>
-    <w:p>
-      <w:pPr>
-        <w:spacing w:line="360" w:lineRule="auto"/>
-        <w:rPr>
-          <w:rFonts w:ascii="Didot" w:hAnsi="Didot" w:cs="Didot"/>
-          <w:sz w:val="22"/>
-          <w:szCs w:val="22"/>
-        </w:rPr>
-      </w:pPr>
-      <w:r>
-        <w:rPr>
-          <w:rFonts w:ascii="Didot" w:hAnsi="Didot" w:cs="Didot" w:hint="cs"/>
-          <w:sz w:val="22"/>
-          <w:szCs w:val="22"/>
-        </w:rPr>
-        <w:t>Questão 4</w:t>
-      </w:r>
-    </w:p>
-    <w:p>
-      <w:pPr>
-        <w:spacing w:line="360" w:lineRule="auto"/>
-        <w:rPr>
-          <w:rFonts w:ascii="Didot" w:hAnsi="Didot" w:cs="Didot"/>
-          <w:sz w:val="22"/>
-          <w:szCs w:val="22"/>
-        </w:rPr>
-      </w:pPr>
-      <w:r>
-        <w:rPr>
-          <w:rFonts w:ascii="Didot" w:hAnsi="Didot" w:cs="Didot" w:hint="cs"/>
-          <w:sz w:val="22"/>
-          <w:szCs w:val="22"/>
-        </w:rPr>
-        <w:lastRenderedPageBreak/>
-        <w:t>Quais critérios você usaria para ajustar os ganhos do controlador para garantir um comportamento suave, seguro e eficiente?</w:t>
-      </w:r>
-    </w:p>
-    <w:p>
-      <w:pPr>
-        <w:spacing w:line="360" w:lineRule="auto"/>
-        <w:rPr>
-          <w:rFonts w:ascii="Didot" w:hAnsi="Didot" w:cs="Didot"/>
-          <w:sz w:val="22"/>
-          <w:szCs w:val="22"/>
-        </w:rPr>
-      </w:pPr>
-    </w:p>
-    <w:p>
-      <w:pPr>
-        <w:spacing w:line="360" w:lineRule="auto"/>
-        <w:rPr>
-          <w:rFonts w:ascii="Didot" w:hAnsi="Didot" w:cs="Didot"/>
-          <w:sz w:val="22"/>
-          <w:szCs w:val="22"/>
-        </w:rPr>
-      </w:pPr>
-    </w:p>
-    <w:p>
-      <w:pPr>
-        <w:spacing w:line="360" w:lineRule="auto"/>
-        <w:rPr>
-          <w:rFonts w:ascii="Didot" w:hAnsi="Didot" w:cs="Didot"/>
-          <w:sz w:val="22"/>
-          <w:szCs w:val="22"/>
-        </w:rPr>
-      </w:pPr>
-      <w:r>
-        <w:rPr>
-          <w:rFonts w:ascii="Didot" w:hAnsi="Didot" w:cs="Didot" w:hint="cs"/>
-          <w:sz w:val="22"/>
-          <w:szCs w:val="22"/>
-        </w:rPr>
-        <w:t>Questão 5</w:t>
-      </w:r>
-    </w:p>
-    <w:p>
-      <w:pPr>
-        <w:spacing w:line="360" w:lineRule="auto"/>
-        <w:rPr>
-          <w:rFonts w:ascii="Didot" w:hAnsi="Didot" w:cs="Didot"/>
-          <w:sz w:val="22"/>
-          <w:szCs w:val="22"/>
-        </w:rPr>
-      </w:pPr>
-      <w:r>
-        <w:rPr>
-          <w:rFonts w:ascii="Didot" w:hAnsi="Didot" w:cs="Didot" w:hint="cs"/>
-          <w:sz w:val="22"/>
-          <w:szCs w:val="22"/>
-        </w:rPr>
-        <w:t>Qual a rota realizada pelo robô para executar a tarefa proposta?</w:t>
-      </w:r>
-      <w:r>
-        <w:rPr>
-          <w:rFonts w:ascii="Didot" w:hAnsi="Didot" w:cs="Didot" w:hint="cs"/>
-          <w:sz w:val="22"/>
-          <w:szCs w:val="22"/>
-        </w:rPr>
-        <w:br/>
-      </w:r>
-      <w:r>
-        <w:rPr>
-          <w:rFonts w:ascii="Didot" w:hAnsi="Didot" w:cs="Didot" w:hint="cs"/>
-          <w:sz w:val="22"/>
-          <w:szCs w:val="22"/>
-        </w:rPr>
-        <w:br/>
-        <w:t>Insira aqui as imagens dos seguintes gráficos:</w:t>
-      </w:r>
-      <w:r>
-        <w:rPr>
-          <w:rFonts w:ascii="Didot" w:hAnsi="Didot" w:cs="Didot" w:hint="cs"/>
-          <w:sz w:val="22"/>
-          <w:szCs w:val="22"/>
-        </w:rPr>
-        <w:br/>
-      </w:r>
-    </w:p>
-    <w:p>
-      <w:pPr>
-        <w:spacing w:line="360" w:lineRule="auto"/>
-        <w:rPr>
-          <w:rFonts w:ascii="Didot" w:hAnsi="Didot" w:cs="Didot"/>
-          <w:sz w:val="22"/>
-          <w:szCs w:val="22"/>
-        </w:rPr>
-      </w:pPr>
-      <w:r>
-        <w:rPr>
-          <w:rFonts w:ascii="Didot" w:hAnsi="Didot" w:cs="Didot" w:hint="cs"/>
-          <w:sz w:val="22"/>
-          <w:szCs w:val="22"/>
-        </w:rPr>
-        <w:t>Navegação no plano XY</w:t>
-      </w:r>
-    </w:p>
-    <w:p>
-      <w:pPr>
-        <w:spacing w:line="360" w:lineRule="auto"/>
-        <w:rPr>
-          <w:rFonts w:ascii="Didot" w:hAnsi="Didot" w:cs="Didot"/>
-          <w:sz w:val="22"/>
-          <w:szCs w:val="22"/>
-        </w:rPr>
-      </w:pPr>
-      <w:r>
-        <w:rPr>
-          <w:rFonts w:ascii="Didot" w:hAnsi="Didot" w:cs="Didot" w:hint="cs"/>
-          <w:sz w:val="22"/>
-          <w:szCs w:val="22"/>
-        </w:rPr>
-        <w:t>Evolução temporal de X</w:t>
-      </w:r>
-    </w:p>
-    <w:p>
-      <w:pPr>
-        <w:spacing w:line="360" w:lineRule="auto"/>
-        <w:rPr>
-          <w:rFonts w:ascii="Didot" w:hAnsi="Didot" w:cs="Didot"/>
-          <w:sz w:val="22"/>
-          <w:szCs w:val="22"/>
-        </w:rPr>
-      </w:pPr>
-      <w:r>
-        <w:rPr>
-          <w:rFonts w:ascii="Didot" w:hAnsi="Didot" w:cs="Didot" w:hint="cs"/>
-          <w:sz w:val="22"/>
-          <w:szCs w:val="22"/>
-        </w:rPr>
-        <w:t>Evolução temporal de Y</w:t>
-      </w:r>
-    </w:p>
-    <w:p>
-      <w:pPr>
-        <w:spacing w:line="360" w:lineRule="auto"/>
-        <w:rPr>
-          <w:rFonts w:ascii="Didot" w:hAnsi="Didot" w:cs="Didot"/>
-          <w:sz w:val="22"/>
-          <w:szCs w:val="22"/>
-        </w:rPr>
-      </w:pPr>
-      <w:r>
-        <w:rPr>
-          <w:rFonts w:ascii="Didot" w:hAnsi="Didot" w:cs="Didot" w:hint="cs"/>
-          <w:sz w:val="22"/>
-          <w:szCs w:val="22"/>
-        </w:rPr>
-        <w:t>Evolução temporal de </w:t>
+          <w:rFonts w:ascii="Didot" w:hAnsi="Didot" w:cs="Didot" w:hint="cs"/>
+          <w:sz w:val="22"/>
+          <w:szCs w:val="22"/>
+        </w:rPr>
+        <w:t xml:space="preserve">, </w:t>
       </w:r>
       <m:oMath>
         <m:r>
           <w:rPr>
-            <w:rFonts w:ascii="Cambria Math" w:hAnsi="Cambria Math" w:cs="Didot"/>
+            <w:rFonts w:ascii="Cambria Math" w:hAnsi="Cambria Math" w:cs="Didot" w:hint="cs"/>
+            <w:sz w:val="22"/>
+            <w:szCs w:val="22"/>
+          </w:rPr>
+          <m:t>y</m:t>
+        </m:r>
+      </m:oMath>
+      <w:r>
+        <w:rPr>
+          <w:rFonts w:ascii="Didot" w:hAnsi="Didot" w:cs="Didot" w:hint="cs"/>
+          <w:sz w:val="22"/>
+          <w:szCs w:val="22"/>
+        </w:rPr>
+        <w:t xml:space="preserve">, </w:t>
+      </w:r>
+      <m:oMath>
+        <m:r>
+          <w:rPr>
+            <w:rFonts w:ascii="Cambria Math" w:hAnsi="Cambria Math" w:cs="Didot" w:hint="cs"/>
             <w:sz w:val="22"/>
             <w:szCs w:val="22"/>
           </w:rPr>
           <m:t>ψ</m:t>
         </m:r>
       </m:oMath>
-    </w:p>
-    <w:p>
-      <w:pPr>
-        <w:spacing w:line="360" w:lineRule="auto"/>
-        <w:rPr>
-          <w:rFonts w:ascii="Didot" w:hAnsi="Didot" w:cs="Didot"/>
-          <w:sz w:val="22"/>
-          <w:szCs w:val="22"/>
-        </w:rPr>
-      </w:pPr>
-    </w:p>
-    <w:p>
-      <w:pPr>
-        <w:spacing w:line="360" w:lineRule="auto"/>
-        <w:rPr>
-          <w:rFonts w:ascii="Didot" w:hAnsi="Didot" w:cs="Didot"/>
-          <w:sz w:val="22"/>
-          <w:szCs w:val="22"/>
-        </w:rPr>
-      </w:pPr>
-    </w:p>
-    <w:p>
-      <w:pPr>
-        <w:spacing w:line="360" w:lineRule="auto"/>
-        <w:rPr>
-          <w:rFonts w:ascii="Didot" w:hAnsi="Didot" w:cs="Didot"/>
-          <w:sz w:val="22"/>
-          <w:szCs w:val="22"/>
-        </w:rPr>
-      </w:pPr>
-    </w:p>
-    <w:p>
-      <w:pPr>
-        <w:spacing w:line="360" w:lineRule="auto"/>
-        <w:rPr>
-          <w:rFonts w:ascii="Didot" w:hAnsi="Didot" w:cs="Didot"/>
-          <w:sz w:val="22"/>
-          <w:szCs w:val="22"/>
-        </w:rPr>
-      </w:pPr>
-      <w:r>
-        <w:rPr>
-          <w:rFonts w:ascii="Didot" w:hAnsi="Didot" w:cs="Didot" w:hint="cs"/>
-          <w:sz w:val="22"/>
-          <w:szCs w:val="22"/>
-        </w:rPr>
-        <w:t>Questão 6</w:t>
-      </w:r>
-    </w:p>
-    <w:p>
-      <w:pPr>
-        <w:spacing w:line="360" w:lineRule="auto"/>
-        <w:rPr>
-          <w:rFonts w:ascii="Didot" w:hAnsi="Didot" w:cs="Didot"/>
-          <w:sz w:val="22"/>
-          <w:szCs w:val="22"/>
-        </w:rPr>
-      </w:pPr>
-      <w:r>
-        <w:rPr>
-          <w:rFonts w:ascii="Didot" w:hAnsi="Didot" w:cs="Didot" w:hint="cs"/>
-          <w:sz w:val="22"/>
-          <w:szCs w:val="22"/>
-        </w:rPr>
-        <w:t>Quais os sinais de controle foram aplicados ao robô para executar a tarefa proposta?</w:t>
-      </w:r>
-      <w:r>
-        <w:rPr>
-          <w:rFonts w:ascii="Didot" w:hAnsi="Didot" w:cs="Didot" w:hint="cs"/>
-          <w:sz w:val="22"/>
-          <w:szCs w:val="22"/>
-        </w:rPr>
-        <w:br/>
-      </w:r>
-      <w:r>
-        <w:rPr>
-          <w:rFonts w:ascii="Didot" w:hAnsi="Didot" w:cs="Didot" w:hint="cs"/>
-          <w:sz w:val="22"/>
-          <w:szCs w:val="22"/>
-        </w:rPr>
-        <w:br/>
-        <w:t>Insira aqui as imagens dos seguintes gráficos:</w:t>
-      </w:r>
-    </w:p>
-    <w:p>
-      <w:pPr>
-        <w:spacing w:line="360" w:lineRule="auto"/>
-        <w:rPr>
-          <w:rFonts w:ascii="Didot" w:hAnsi="Didot" w:cs="Didot"/>
-          <w:sz w:val="22"/>
-          <w:szCs w:val="22"/>
-        </w:rPr>
-      </w:pPr>
-      <w:r>
-        <w:rPr>
-          <w:rFonts w:ascii="Didot" w:hAnsi="Didot" w:cs="Didot" w:hint="cs"/>
-          <w:sz w:val="22"/>
-          <w:szCs w:val="22"/>
-        </w:rPr>
-        <w:t>Evolução temporal da velocidade linear </w:t>
+      <w:r>
+        <w:rPr>
+          <w:rFonts w:ascii="Didot" w:hAnsi="Didot" w:cs="Didot" w:hint="cs"/>
+          <w:sz w:val="22"/>
+          <w:szCs w:val="22"/>
+        </w:rPr>
+        <w:t xml:space="preserve">) usando apenas leis de controle de </w:t>
+      </w:r>
+      <w:r>
+        <w:rPr>
+          <w:rFonts w:ascii="Didot" w:hAnsi="Didot" w:cs="Didot" w:hint="cs"/>
+          <w:i/>
+          <w:iCs/>
+          <w:sz w:val="22"/>
+          <w:szCs w:val="22"/>
+        </w:rPr>
+        <w:t>feedback</w:t>
+      </w:r>
+      <w:r>
+        <w:rPr>
+          <w:rFonts w:ascii="Didot" w:hAnsi="Didot" w:cs="Didot" w:hint="cs"/>
+          <w:sz w:val="22"/>
+          <w:szCs w:val="22"/>
+        </w:rPr>
+        <w:t xml:space="preserve"> contínuas e invariantes no tempo. Exige-se o uso de controladores descontínuos, variantes no tempo ou lógicas de estados.</w:t>
+      </w:r>
+    </w:p>
+    <w:p>
+      <w:pPr>
+        <w:spacing w:line="360" w:lineRule="auto"/>
+        <w:jc w:val="both"/>
+        <w:rPr>
+          <w:rFonts w:ascii="Didot" w:hAnsi="Didot" w:cs="Didot" w:hint="cs"/>
+          <w:sz w:val="22"/>
+          <w:szCs w:val="22"/>
+        </w:rPr>
+      </w:pPr>
+      <w:r>
+        <w:rPr>
+          <w:rFonts w:ascii="Didot" w:hAnsi="Didot" w:cs="Didot" w:hint="cs"/>
+          <w:sz w:val="22"/>
+          <w:szCs w:val="22"/>
+          <w:u w:val="single"/>
+        </w:rPr>
+        <w:t>3. Precisão de Alinhamento Terminal:</w:t>
+      </w:r>
+      <w:r>
+        <w:rPr>
+          <w:rFonts w:ascii="Didot" w:hAnsi="Didot" w:cs="Didot" w:hint="cs"/>
+          <w:sz w:val="22"/>
+          <w:szCs w:val="22"/>
+        </w:rPr>
+        <w:t xml:space="preserve"> A tarefa exige que o robô chegue às baias com um ângulo exato. Um pequeno erro de odometria ao longo da rota exige manobras corretivas de giro no próprio eixo, o que pode causar trepidação se o ganho controle for muito alto.</w:t>
+      </w:r>
+    </w:p>
+    <w:p>
+      <w:pPr>
+        <w:spacing w:line="360" w:lineRule="auto"/>
+        <w:jc w:val="both"/>
+        <w:rPr>
+          <w:rFonts w:ascii="Didot" w:hAnsi="Didot" w:cs="Didot" w:hint="cs"/>
+          <w:sz w:val="22"/>
+          <w:szCs w:val="22"/>
+        </w:rPr>
+      </w:pPr>
+    </w:p>
+    <w:p>
+      <w:pPr>
+        <w:pStyle w:val="Heading1"/>
+        <w:spacing w:line="360" w:lineRule="auto"/>
+      </w:pPr>
+      <w:r>
+        <w:t>Questão 2</w:t>
+      </w:r>
+    </w:p>
+    <w:p>
+      <w:pPr>
+        <w:spacing w:line="360" w:lineRule="auto"/>
+        <w:jc w:val="both"/>
+        <w:rPr>
+          <w:rFonts w:ascii="Didot" w:hAnsi="Didot" w:cs="Didot"/>
+          <w:color w:val="0A2F41" w:themeColor="accent1" w:themeShade="80"/>
+          <w:sz w:val="22"/>
+          <w:szCs w:val="22"/>
+        </w:rPr>
+      </w:pPr>
+      <w:r>
+        <w:rPr>
+          <w:rFonts w:ascii="Didot" w:hAnsi="Didot" w:cs="Didot" w:hint="cs"/>
+          <w:color w:val="0A2F41" w:themeColor="accent1" w:themeShade="80"/>
+          <w:sz w:val="22"/>
+          <w:szCs w:val="22"/>
+        </w:rPr>
+        <w:t>Como você estruturaria o controle (por exemplo, separando controle de orientação e de posição) para o problema proposto?</w:t>
+      </w:r>
+    </w:p>
+    <w:p>
+      <w:pPr>
+        <w:spacing w:line="360" w:lineRule="auto"/>
+        <w:jc w:val="both"/>
+        <w:rPr>
+          <w:rFonts w:ascii="Didot" w:hAnsi="Didot" w:cs="Didot" w:hint="cs"/>
+          <w:sz w:val="22"/>
+          <w:szCs w:val="22"/>
+        </w:rPr>
+      </w:pPr>
+    </w:p>
+    <w:p>
+      <w:pPr>
+        <w:spacing w:line="360" w:lineRule="auto"/>
+        <w:jc w:val="both"/>
+        <w:rPr>
+          <w:rFonts w:ascii="Didot" w:hAnsi="Didot" w:cs="Didot" w:hint="cs"/>
+          <w:sz w:val="22"/>
+          <w:szCs w:val="22"/>
+        </w:rPr>
+      </w:pPr>
+      <w:r>
+        <w:rPr>
+          <w:rFonts w:ascii="Didot" w:hAnsi="Didot" w:cs="Didot" w:hint="cs"/>
+          <w:sz w:val="22"/>
+          <w:szCs w:val="22"/>
+        </w:rPr>
+        <w:t>é a mais viável industrialmente.</w:t>
+      </w:r>
+    </w:p>
+    <w:p>
+      <w:pPr>
+        <w:spacing w:line="360" w:lineRule="auto"/>
+        <w:jc w:val="both"/>
+        <w:rPr>
+          <w:rFonts w:ascii="Didot" w:hAnsi="Didot" w:cs="Didot" w:hint="cs"/>
+          <w:sz w:val="22"/>
+          <w:szCs w:val="22"/>
+          <w:u w:val="single"/>
+        </w:rPr>
+      </w:pPr>
+      <w:r>
+        <w:rPr>
+          <w:rFonts w:ascii="Didot" w:hAnsi="Didot" w:cs="Didot" w:hint="cs"/>
+          <w:sz w:val="22"/>
+          <w:szCs w:val="22"/>
+          <w:u w:val="single"/>
+        </w:rPr>
+        <w:t>Estrutura Lógica:</w:t>
+      </w:r>
+    </w:p>
+    <w:p>
+      <w:pPr>
+        <w:spacing w:line="360" w:lineRule="auto"/>
+        <w:jc w:val="both"/>
+        <w:rPr>
+          <w:rFonts w:ascii="Didot" w:hAnsi="Didot" w:cs="Didot" w:hint="cs"/>
+          <w:sz w:val="22"/>
+          <w:szCs w:val="22"/>
+        </w:rPr>
+      </w:pPr>
+      <w:r>
+        <w:rPr>
+          <w:rFonts w:ascii="Didot" w:hAnsi="Didot" w:cs="Didot" w:hint="cs"/>
+          <w:sz w:val="22"/>
+          <w:szCs w:val="22"/>
+        </w:rPr>
+        <w:t xml:space="preserve">1. </w:t>
+      </w:r>
+      <w:r>
+        <w:rPr>
+          <w:rFonts w:ascii="Didot" w:hAnsi="Didot" w:cs="Didot" w:hint="cs"/>
+          <w:sz w:val="22"/>
+          <w:szCs w:val="22"/>
+        </w:rPr>
+        <w:t>[INÍCIO]</w:t>
+      </w:r>
+      <w:r>
+        <w:rPr>
+          <w:rFonts w:ascii="Didot" w:hAnsi="Didot" w:cs="Didot" w:hint="cs"/>
+          <w:sz w:val="22"/>
+          <w:szCs w:val="22"/>
+        </w:rPr>
+        <w:t xml:space="preserve"> </w:t>
+      </w:r>
+      <w:r>
+        <w:rPr>
+          <w:rFonts w:ascii="Didot" w:hAnsi="Didot" w:cs="Didot" w:hint="cs"/>
+          <w:sz w:val="22"/>
+          <w:szCs w:val="22"/>
+        </w:rPr>
+        <w:t>A separação entre orientação e posição</w:t>
+      </w:r>
+    </w:p>
+    <w:p>
+      <w:pPr>
+        <w:spacing w:line="360" w:lineRule="auto"/>
+        <w:jc w:val="both"/>
+        <w:rPr>
+          <w:rFonts w:ascii="Didot" w:hAnsi="Didot" w:cs="Didot" w:hint="cs"/>
+          <w:sz w:val="22"/>
+          <w:szCs w:val="22"/>
+        </w:rPr>
+      </w:pPr>
+      <w:r>
+        <w:rPr>
+          <w:rFonts w:ascii="Didot" w:hAnsi="Didot" w:cs="Didot" w:hint="cs"/>
+          <w:sz w:val="22"/>
+          <w:szCs w:val="22"/>
+        </w:rPr>
+        <w:t xml:space="preserve">2. </w:t>
+      </w:r>
+      <w:r>
+        <w:rPr>
+          <w:rFonts w:ascii="Didot" w:hAnsi="Didot" w:cs="Didot" w:hint="cs"/>
+          <w:sz w:val="22"/>
+          <w:szCs w:val="22"/>
+        </w:rPr>
+        <w:t>Estado 1: Alinhar Visada</w:t>
+      </w:r>
+    </w:p>
+    <w:p>
+      <w:pPr>
+        <w:spacing w:line="360" w:lineRule="auto"/>
+        <w:jc w:val="both"/>
+        <w:rPr>
+          <w:rFonts w:ascii="Didot" w:hAnsi="Didot" w:cs="Didot" w:hint="cs"/>
+          <w:sz w:val="22"/>
+          <w:szCs w:val="22"/>
+        </w:rPr>
+      </w:pPr>
+      <w:r>
+        <w:rPr>
+          <w:rFonts w:ascii="Didot" w:hAnsi="Didot" w:cs="Didot" w:hint="cs"/>
+          <w:sz w:val="22"/>
+          <w:szCs w:val="22"/>
+        </w:rPr>
+        <w:tab/>
+        <w:t xml:space="preserve">- Calcula ângulo alvo: </w:t>
+      </w:r>
+      <m:oMath>
+        <m:sSub>
+          <m:sSubPr>
+            <m:ctrlPr>
+              <w:rPr>
+                <w:rFonts w:ascii="Cambria Math" w:hAnsi="Cambria Math" w:cs="Didot" w:hint="cs"/>
+                <w:sz w:val="22"/>
+                <w:szCs w:val="22"/>
+              </w:rPr>
+            </m:ctrlPr>
+          </m:sSubPr>
+          <m:e>
+            <m:r>
+              <w:rPr>
+                <w:rFonts w:ascii="Cambria Math" w:hAnsi="Cambria Math" w:cs="Didot" w:hint="cs"/>
+                <w:sz w:val="22"/>
+                <w:szCs w:val="22"/>
+              </w:rPr>
+              <m:t>θ</m:t>
+            </m:r>
+          </m:e>
+          <m:sub>
+            <m:r>
+              <w:rPr>
+                <w:rFonts w:ascii="Cambria Math" w:hAnsi="Cambria Math" w:cs="Didot" w:hint="cs"/>
+                <w:sz w:val="22"/>
+                <w:szCs w:val="22"/>
+              </w:rPr>
+              <m:t>target</m:t>
+            </m:r>
+          </m:sub>
+        </m:sSub>
+        <m:r>
+          <w:rPr>
+            <w:rFonts w:ascii="Cambria Math" w:hAnsi="Cambria Math" w:cs="Didot" w:hint="cs"/>
+            <w:sz w:val="22"/>
+            <w:szCs w:val="22"/>
+          </w:rPr>
+          <m:t>=atan2</m:t>
+        </m:r>
+        <m:d>
+          <m:dPr>
+            <m:ctrlPr>
+              <w:rPr>
+                <w:rFonts w:ascii="Cambria Math" w:hAnsi="Cambria Math" w:cs="Didot" w:hint="cs"/>
+                <w:sz w:val="22"/>
+                <w:szCs w:val="22"/>
+              </w:rPr>
+            </m:ctrlPr>
+          </m:dPr>
+          <m:e>
+            <m:r>
+              <w:rPr>
+                <w:rFonts w:ascii="Cambria Math" w:hAnsi="Cambria Math" w:cs="Didot" w:hint="cs"/>
+                <w:sz w:val="22"/>
+                <w:szCs w:val="22"/>
+              </w:rPr>
+              <m:t>dy,dx</m:t>
+            </m:r>
+          </m:e>
+        </m:d>
+      </m:oMath>
+    </w:p>
+    <w:p>
+      <w:pPr>
+        <w:spacing w:line="360" w:lineRule="auto"/>
+        <w:jc w:val="both"/>
+        <w:rPr>
+          <w:rFonts w:ascii="Didot" w:hAnsi="Didot" w:cs="Didot" w:hint="cs"/>
+          <w:sz w:val="22"/>
+          <w:szCs w:val="22"/>
+        </w:rPr>
+      </w:pPr>
+      <w:r>
+        <w:rPr>
+          <w:rFonts w:ascii="Didot" w:hAnsi="Didot" w:cs="Didot" w:hint="cs"/>
+          <w:sz w:val="22"/>
+          <w:szCs w:val="22"/>
+        </w:rPr>
+        <w:tab/>
+        <w:t xml:space="preserve">- Controle: </w:t>
+      </w:r>
+      <m:oMath>
+        <m:r>
+          <w:rPr>
+            <w:rFonts w:ascii="Cambria Math" w:hAnsi="Cambria Math" w:cs="Didot" w:hint="cs"/>
+            <w:sz w:val="22"/>
+            <w:szCs w:val="22"/>
+          </w:rPr>
+          <m:t>u=θ</m:t>
+        </m:r>
+      </m:oMath>
+      <w:r>
+        <w:rPr>
+          <w:rFonts w:ascii="Didot" w:hAnsi="Didot" w:cs="Didot" w:hint="cs"/>
+          <w:sz w:val="22"/>
+          <w:szCs w:val="22"/>
+        </w:rPr>
+        <w:t xml:space="preserve">, </w:t>
+      </w:r>
+      <m:oMath>
+        <m:r>
+          <w:rPr>
+            <w:rFonts w:ascii="Cambria Math" w:hAnsi="Cambria Math" w:cs="Didot" w:hint="cs"/>
+            <w:sz w:val="22"/>
+            <w:szCs w:val="22"/>
+          </w:rPr>
+          <m:t>ω=K</m:t>
+        </m:r>
+        <m:sSub>
+          <m:sSubPr>
+            <m:ctrlPr>
+              <w:rPr>
+                <w:rFonts w:ascii="Cambria Math" w:hAnsi="Cambria Math" w:cs="Didot" w:hint="cs"/>
+                <w:sz w:val="22"/>
+                <w:szCs w:val="22"/>
+              </w:rPr>
+            </m:ctrlPr>
+          </m:sSubPr>
+          <m:e>
+            <m:r>
+              <w:rPr>
+                <w:rFonts w:ascii="Cambria Math" w:hAnsi="Cambria Math" w:cs="Didot" w:hint="cs"/>
+                <w:sz w:val="22"/>
+                <w:szCs w:val="22"/>
+              </w:rPr>
+              <m:t>p</m:t>
+            </m:r>
+          </m:e>
+          <m:sub>
+            <m:r>
+              <w:rPr>
+                <w:rFonts w:ascii="Cambria Math" w:hAnsi="Cambria Math" w:cs="Didot" w:hint="cs"/>
+                <w:sz w:val="22"/>
+                <w:szCs w:val="22"/>
+              </w:rPr>
+              <m:t>angular</m:t>
+            </m:r>
+          </m:sub>
+        </m:sSub>
+        <m:r>
+          <w:rPr>
+            <w:rFonts w:ascii="Cambria Math" w:hAnsi="Cambria Math" w:cs="Didot" w:hint="cs"/>
+            <w:sz w:val="22"/>
+            <w:szCs w:val="22"/>
+          </w:rPr>
+          <m:t>*</m:t>
+        </m:r>
+        <m:d>
+          <m:dPr>
+            <m:ctrlPr>
+              <w:rPr>
+                <w:rFonts w:ascii="Cambria Math" w:hAnsi="Cambria Math" w:cs="Didot" w:hint="cs"/>
+                <w:sz w:val="22"/>
+                <w:szCs w:val="22"/>
+              </w:rPr>
+            </m:ctrlPr>
+          </m:dPr>
+          <m:e>
+            <m:sSub>
+              <m:sSubPr>
+                <m:ctrlPr>
+                  <w:rPr>
+                    <w:rFonts w:ascii="Cambria Math" w:hAnsi="Cambria Math" w:cs="Didot" w:hint="cs"/>
+                    <w:sz w:val="22"/>
+                    <w:szCs w:val="22"/>
+                  </w:rPr>
+                </m:ctrlPr>
+              </m:sSubPr>
+              <m:e>
+                <m:r>
+                  <w:rPr>
+                    <w:rFonts w:ascii="Cambria Math" w:hAnsi="Cambria Math" w:cs="Didot" w:hint="cs"/>
+                    <w:sz w:val="22"/>
+                    <w:szCs w:val="22"/>
+                  </w:rPr>
+                  <m:t>θ</m:t>
+                </m:r>
+              </m:e>
+              <m:sub>
+                <m:r>
+                  <w:rPr>
+                    <w:rFonts w:ascii="Cambria Math" w:hAnsi="Cambria Math" w:cs="Didot" w:hint="cs"/>
+                    <w:sz w:val="22"/>
+                    <w:szCs w:val="22"/>
+                  </w:rPr>
+                  <m:t>target</m:t>
+                </m:r>
+              </m:sub>
+            </m:sSub>
+            <m:r>
+              <w:rPr>
+                <w:rFonts w:ascii="Cambria Math" w:hAnsi="Cambria Math" w:cs="Didot" w:hint="cs"/>
+                <w:sz w:val="22"/>
+                <w:szCs w:val="22"/>
+              </w:rPr>
+              <m:t>-θ</m:t>
+            </m:r>
+          </m:e>
+        </m:d>
+      </m:oMath>
+    </w:p>
+    <w:p>
+      <w:pPr>
+        <w:spacing w:line="360" w:lineRule="auto"/>
+        <w:jc w:val="both"/>
+        <w:rPr>
+          <w:rFonts w:ascii="Didot" w:hAnsi="Didot" w:cs="Didot" w:hint="cs"/>
+          <w:sz w:val="22"/>
+          <w:szCs w:val="22"/>
+        </w:rPr>
+      </w:pPr>
+      <w:r>
+        <w:rPr>
+          <w:rFonts w:ascii="Didot" w:hAnsi="Didot" w:cs="Didot" w:hint="cs"/>
+          <w:sz w:val="22"/>
+          <w:szCs w:val="22"/>
+        </w:rPr>
+        <w:tab/>
+        <w:t>- Se erro &lt; tolerância, vai para Estado 2</w:t>
+      </w:r>
+    </w:p>
+    <w:p>
+      <w:pPr>
+        <w:spacing w:line="360" w:lineRule="auto"/>
+        <w:jc w:val="both"/>
+        <w:rPr>
+          <w:rFonts w:ascii="Didot" w:hAnsi="Didot" w:cs="Didot" w:hint="cs"/>
+          <w:sz w:val="22"/>
+          <w:szCs w:val="22"/>
+        </w:rPr>
+      </w:pPr>
+      <w:r>
+        <w:rPr>
+          <w:rFonts w:ascii="Didot" w:hAnsi="Didot" w:cs="Didot" w:hint="cs"/>
+          <w:sz w:val="22"/>
+          <w:szCs w:val="22"/>
+        </w:rPr>
+        <w:lastRenderedPageBreak/>
+        <w:t>3. Estado 2: Translação</w:t>
+      </w:r>
+    </w:p>
+    <w:p>
+      <w:pPr>
+        <w:spacing w:line="360" w:lineRule="auto"/>
+        <w:jc w:val="both"/>
+        <w:rPr>
+          <w:rFonts w:ascii="Didot" w:hAnsi="Didot" w:cs="Didot" w:hint="cs"/>
+          <w:sz w:val="22"/>
+          <w:szCs w:val="22"/>
+        </w:rPr>
+      </w:pPr>
+      <w:r>
+        <w:rPr>
+          <w:rFonts w:ascii="Didot" w:hAnsi="Didot" w:cs="Didot" w:hint="cs"/>
+          <w:sz w:val="22"/>
+          <w:szCs w:val="22"/>
+        </w:rPr>
+        <w:tab/>
+        <w:t xml:space="preserve">- Controle: </w:t>
+      </w:r>
+      <m:oMath>
+        <m:r>
+          <w:rPr>
+            <w:rFonts w:ascii="Cambria Math" w:hAnsi="Cambria Math" w:cs="Didot" w:hint="cs"/>
+            <w:sz w:val="22"/>
+            <w:szCs w:val="22"/>
+          </w:rPr>
+          <m:t>u=K</m:t>
+        </m:r>
+        <m:sSub>
+          <m:sSubPr>
+            <m:ctrlPr>
+              <w:rPr>
+                <w:rFonts w:ascii="Cambria Math" w:hAnsi="Cambria Math" w:cs="Didot" w:hint="cs"/>
+                <w:sz w:val="22"/>
+                <w:szCs w:val="22"/>
+              </w:rPr>
+            </m:ctrlPr>
+          </m:sSubPr>
+          <m:e>
+            <m:r>
+              <w:rPr>
+                <w:rFonts w:ascii="Cambria Math" w:hAnsi="Cambria Math" w:cs="Didot" w:hint="cs"/>
+                <w:sz w:val="22"/>
+                <w:szCs w:val="22"/>
+              </w:rPr>
+              <m:t>p</m:t>
+            </m:r>
+          </m:e>
+          <m:sub>
+            <m:r>
+              <w:rPr>
+                <w:rFonts w:ascii="Cambria Math" w:hAnsi="Cambria Math" w:cs="Didot" w:hint="cs"/>
+                <w:sz w:val="22"/>
+                <w:szCs w:val="22"/>
+              </w:rPr>
+              <m:t>linear</m:t>
+            </m:r>
+          </m:sub>
+        </m:sSub>
+        <m:r>
+          <w:rPr>
+            <w:rFonts w:ascii="Cambria Math" w:hAnsi="Cambria Math" w:cs="Didot" w:hint="cs"/>
+            <w:sz w:val="22"/>
+            <w:szCs w:val="22"/>
+          </w:rPr>
+          <m:t>*distância</m:t>
+        </m:r>
+      </m:oMath>
+      <w:r>
+        <w:rPr>
+          <w:rFonts w:ascii="Didot" w:hAnsi="Didot" w:cs="Didot" w:hint="cs"/>
+          <w:sz w:val="22"/>
+          <w:szCs w:val="22"/>
+        </w:rPr>
+        <w:t xml:space="preserve">, </w:t>
+      </w:r>
+      <m:oMath>
+        <m:r>
+          <w:rPr>
+            <w:rFonts w:ascii="Cambria Math" w:hAnsi="Cambria Math" w:cs="Didot" w:hint="cs"/>
+            <w:sz w:val="22"/>
+            <w:szCs w:val="22"/>
+          </w:rPr>
+          <m:t>ω=K</m:t>
+        </m:r>
+        <m:sSub>
+          <m:sSubPr>
+            <m:ctrlPr>
+              <w:rPr>
+                <w:rFonts w:ascii="Cambria Math" w:hAnsi="Cambria Math" w:cs="Didot" w:hint="cs"/>
+                <w:sz w:val="22"/>
+                <w:szCs w:val="22"/>
+              </w:rPr>
+            </m:ctrlPr>
+          </m:sSubPr>
+          <m:e>
+            <m:r>
+              <w:rPr>
+                <w:rFonts w:ascii="Cambria Math" w:hAnsi="Cambria Math" w:cs="Didot" w:hint="cs"/>
+                <w:sz w:val="22"/>
+                <w:szCs w:val="22"/>
+              </w:rPr>
+              <m:t>p</m:t>
+            </m:r>
+          </m:e>
+          <m:sub>
+            <m:r>
+              <w:rPr>
+                <w:rFonts w:ascii="Cambria Math" w:hAnsi="Cambria Math" w:cs="Didot" w:hint="cs"/>
+                <w:sz w:val="22"/>
+                <w:szCs w:val="22"/>
+              </w:rPr>
+              <m:t>alinhamento</m:t>
+            </m:r>
+          </m:sub>
+        </m:sSub>
+        <m:r>
+          <w:rPr>
+            <w:rFonts w:ascii="Cambria Math" w:hAnsi="Cambria Math" w:cs="Didot" w:hint="cs"/>
+            <w:sz w:val="22"/>
+            <w:szCs w:val="22"/>
+          </w:rPr>
+          <m:t>*err</m:t>
+        </m:r>
+        <m:sSub>
+          <m:sSubPr>
+            <m:ctrlPr>
+              <w:rPr>
+                <w:rFonts w:ascii="Cambria Math" w:hAnsi="Cambria Math" w:cs="Didot" w:hint="cs"/>
+                <w:sz w:val="22"/>
+                <w:szCs w:val="22"/>
+              </w:rPr>
+            </m:ctrlPr>
+          </m:sSubPr>
+          <m:e>
+            <m:r>
+              <w:rPr>
+                <w:rFonts w:ascii="Cambria Math" w:hAnsi="Cambria Math" w:cs="Didot" w:hint="cs"/>
+                <w:sz w:val="22"/>
+                <w:szCs w:val="22"/>
+              </w:rPr>
+              <m:t>o</m:t>
+            </m:r>
+          </m:e>
+          <m:sub>
+            <m:r>
+              <w:rPr>
+                <w:rFonts w:ascii="Cambria Math" w:hAnsi="Cambria Math" w:cs="Didot" w:hint="cs"/>
+                <w:sz w:val="22"/>
+                <w:szCs w:val="22"/>
+              </w:rPr>
+              <m:t>visada</m:t>
+            </m:r>
+          </m:sub>
+        </m:sSub>
+      </m:oMath>
+    </w:p>
+    <w:p>
+      <w:pPr>
+        <w:spacing w:line="360" w:lineRule="auto"/>
+        <w:jc w:val="both"/>
+        <w:rPr>
+          <w:rFonts w:ascii="Didot" w:hAnsi="Didot" w:cs="Didot" w:hint="cs"/>
+          <w:sz w:val="22"/>
+          <w:szCs w:val="22"/>
+        </w:rPr>
+      </w:pPr>
+      <w:r>
+        <w:rPr>
+          <w:rFonts w:ascii="Didot" w:hAnsi="Didot" w:cs="Didot" w:hint="cs"/>
+          <w:sz w:val="22"/>
+          <w:szCs w:val="22"/>
+        </w:rPr>
+        <w:tab/>
+        <w:t>- Se distância &lt; tolerância, vai para Estado 3</w:t>
+      </w:r>
+    </w:p>
+    <w:p>
+      <w:pPr>
+        <w:spacing w:line="360" w:lineRule="auto"/>
+        <w:jc w:val="both"/>
+        <w:rPr>
+          <w:rFonts w:ascii="Didot" w:hAnsi="Didot" w:cs="Didot" w:hint="cs"/>
+          <w:sz w:val="22"/>
+          <w:szCs w:val="22"/>
+        </w:rPr>
+      </w:pPr>
+      <w:r>
+        <w:rPr>
+          <w:rFonts w:ascii="Didot" w:hAnsi="Didot" w:cs="Didot" w:hint="cs"/>
+          <w:sz w:val="22"/>
+          <w:szCs w:val="22"/>
+        </w:rPr>
+        <w:t>4. Estado 3: Alinhamento Final</w:t>
+      </w:r>
+    </w:p>
+    <w:p>
+      <w:pPr>
+        <w:spacing w:line="360" w:lineRule="auto"/>
+        <w:jc w:val="both"/>
+        <w:rPr>
+          <w:rFonts w:ascii="Didot" w:hAnsi="Didot" w:cs="Didot" w:hint="cs"/>
+          <w:sz w:val="22"/>
+          <w:szCs w:val="22"/>
+        </w:rPr>
+      </w:pPr>
+      <w:r>
+        <w:rPr>
+          <w:rFonts w:ascii="Didot" w:hAnsi="Didot" w:cs="Didot" w:hint="cs"/>
+          <w:sz w:val="22"/>
+          <w:szCs w:val="22"/>
+        </w:rPr>
+        <w:tab/>
+        <w:t xml:space="preserve">- Controle: u = 0, </w:t>
+      </w:r>
+      <m:oMath>
+        <m:r>
+          <w:rPr>
+            <w:rFonts w:ascii="Cambria Math" w:hAnsi="Cambria Math" w:cs="Didot" w:hint="cs"/>
+            <w:sz w:val="22"/>
+            <w:szCs w:val="22"/>
+          </w:rPr>
+          <m:t>ω=K</m:t>
+        </m:r>
+        <m:sSub>
+          <m:sSubPr>
+            <m:ctrlPr>
+              <w:rPr>
+                <w:rFonts w:ascii="Cambria Math" w:hAnsi="Cambria Math" w:cs="Didot" w:hint="cs"/>
+                <w:sz w:val="22"/>
+                <w:szCs w:val="22"/>
+              </w:rPr>
+            </m:ctrlPr>
+          </m:sSubPr>
+          <m:e>
+            <m:r>
+              <w:rPr>
+                <w:rFonts w:ascii="Cambria Math" w:hAnsi="Cambria Math" w:cs="Didot" w:hint="cs"/>
+                <w:sz w:val="22"/>
+                <w:szCs w:val="22"/>
+              </w:rPr>
+              <m:t>p</m:t>
+            </m:r>
+          </m:e>
+          <m:sub>
+            <m:r>
+              <w:rPr>
+                <w:rFonts w:ascii="Cambria Math" w:hAnsi="Cambria Math" w:cs="Didot" w:hint="cs"/>
+                <w:sz w:val="22"/>
+                <w:szCs w:val="22"/>
+              </w:rPr>
+              <m:t>final</m:t>
+            </m:r>
+          </m:sub>
+        </m:sSub>
+        <m:r>
+          <w:rPr>
+            <w:rFonts w:ascii="Cambria Math" w:hAnsi="Cambria Math" w:cs="Didot" w:hint="cs"/>
+            <w:sz w:val="22"/>
+            <w:szCs w:val="22"/>
+          </w:rPr>
+          <m:t>*(</m:t>
+        </m:r>
+        <m:sSub>
+          <m:sSubPr>
+            <m:ctrlPr>
+              <w:rPr>
+                <w:rFonts w:ascii="Cambria Math" w:hAnsi="Cambria Math" w:cs="Didot" w:hint="cs"/>
+                <w:sz w:val="22"/>
+                <w:szCs w:val="22"/>
+              </w:rPr>
+            </m:ctrlPr>
+          </m:sSubPr>
+          <m:e>
+            <m:r>
+              <w:rPr>
+                <w:rFonts w:ascii="Cambria Math" w:hAnsi="Cambria Math" w:cs="Didot" w:hint="cs"/>
+                <w:sz w:val="22"/>
+                <w:szCs w:val="22"/>
+              </w:rPr>
+              <m:t>ψ</m:t>
+            </m:r>
+          </m:e>
+          <m:sub>
+            <m:r>
+              <w:rPr>
+                <w:rFonts w:ascii="Cambria Math" w:hAnsi="Cambria Math" w:cs="Didot" w:hint="cs"/>
+                <w:sz w:val="22"/>
+                <w:szCs w:val="22"/>
+              </w:rPr>
+              <m:t>desejado</m:t>
+            </m:r>
+          </m:sub>
+        </m:sSub>
+        <m:r>
+          <w:rPr>
+            <w:rFonts w:ascii="Cambria Math" w:hAnsi="Cambria Math" w:cs="Didot" w:hint="cs"/>
+            <w:sz w:val="22"/>
+            <w:szCs w:val="22"/>
+          </w:rPr>
+          <m:t>-θ</m:t>
+        </m:r>
+      </m:oMath>
+      <w:r>
+        <w:rPr>
+          <w:rFonts w:ascii="Didot" w:hAnsi="Didot" w:cs="Didot" w:hint="cs"/>
+          <w:sz w:val="22"/>
+          <w:szCs w:val="22"/>
+        </w:rPr>
+        <w:t>)</w:t>
+      </w:r>
+    </w:p>
+    <w:p>
+      <w:pPr>
+        <w:spacing w:line="360" w:lineRule="auto"/>
+        <w:jc w:val="both"/>
+        <w:rPr>
+          <w:rFonts w:ascii="Didot" w:hAnsi="Didot" w:cs="Didot" w:hint="cs"/>
+          <w:sz w:val="22"/>
+          <w:szCs w:val="22"/>
+        </w:rPr>
+      </w:pPr>
+      <w:r>
+        <w:rPr>
+          <w:rFonts w:ascii="Didot" w:hAnsi="Didot" w:cs="Didot" w:hint="cs"/>
+          <w:sz w:val="22"/>
+          <w:szCs w:val="22"/>
+        </w:rPr>
+        <w:tab/>
+        <w:t>- Se erro &lt; tolerância -&gt; Entrega Concluída</w:t>
+      </w:r>
+    </w:p>
+    <w:p>
+      <w:pPr>
+        <w:spacing w:line="360" w:lineRule="auto"/>
+        <w:jc w:val="both"/>
+        <w:rPr>
+          <w:rFonts w:ascii="Didot" w:hAnsi="Didot" w:cs="Didot" w:hint="cs"/>
+          <w:sz w:val="22"/>
+          <w:szCs w:val="22"/>
+        </w:rPr>
+      </w:pPr>
+    </w:p>
+    <w:p>
+      <w:pPr>
+        <w:spacing w:line="360" w:lineRule="auto"/>
+        <w:jc w:val="both"/>
+        <w:rPr>
+          <w:rFonts w:ascii="Didot" w:hAnsi="Didot" w:cs="Didot" w:hint="cs"/>
+          <w:sz w:val="22"/>
+          <w:szCs w:val="22"/>
+          <w:u w:val="single"/>
+        </w:rPr>
+      </w:pPr>
+      <w:r>
+        <w:rPr>
+          <w:rFonts w:ascii="Didot" w:hAnsi="Didot" w:cs="Didot" w:hint="cs"/>
+          <w:sz w:val="22"/>
+          <w:szCs w:val="22"/>
+          <w:u w:val="single"/>
+        </w:rPr>
+        <w:t>Vantagens:</w:t>
+      </w:r>
+    </w:p>
+    <w:p>
+      <w:pPr>
+        <w:spacing w:line="360" w:lineRule="auto"/>
+        <w:jc w:val="both"/>
+        <w:rPr>
+          <w:rFonts w:ascii="Didot" w:hAnsi="Didot" w:cs="Didot" w:hint="cs"/>
+          <w:sz w:val="22"/>
+          <w:szCs w:val="22"/>
+        </w:rPr>
+      </w:pPr>
+      <w:r>
+        <w:rPr>
+          <w:rFonts w:ascii="Didot" w:hAnsi="Didot" w:cs="Didot" w:hint="cs"/>
+          <w:sz w:val="22"/>
+          <w:szCs w:val="22"/>
+        </w:rPr>
+        <w:t>- extrema simplicidade</w:t>
+      </w:r>
+    </w:p>
+    <w:p>
+      <w:pPr>
+        <w:spacing w:line="360" w:lineRule="auto"/>
+        <w:jc w:val="both"/>
+        <w:rPr>
+          <w:rFonts w:ascii="Didot" w:hAnsi="Didot" w:cs="Didot" w:hint="cs"/>
+          <w:sz w:val="22"/>
+          <w:szCs w:val="22"/>
+        </w:rPr>
+      </w:pPr>
+      <w:r>
+        <w:rPr>
+          <w:rFonts w:ascii="Didot" w:hAnsi="Didot" w:cs="Didot" w:hint="cs"/>
+          <w:sz w:val="22"/>
+          <w:szCs w:val="22"/>
+        </w:rPr>
+        <w:t xml:space="preserve">- facilita o tuning individual dos controladores PID e </w:t>
+      </w:r>
+      <m:oMath>
+        <m:r>
+          <w:rPr>
+            <w:rFonts w:ascii="Cambria Math" w:hAnsi="Cambria Math" w:cs="Didot" w:hint="cs"/>
+            <w:sz w:val="22"/>
+            <w:szCs w:val="22"/>
+          </w:rPr>
+          <m:t>ω</m:t>
+        </m:r>
+      </m:oMath>
+      <w:r>
+        <w:rPr>
+          <w:rFonts w:ascii="Didot" w:hAnsi="Didot" w:cs="Didot" w:hint="cs"/>
+          <w:sz w:val="22"/>
+          <w:szCs w:val="22"/>
+        </w:rPr>
+        <w:t xml:space="preserve"> e </w:t>
+      </w:r>
+      <m:oMath>
+        <m:r>
+          <w:rPr>
+            <w:rFonts w:ascii="Cambria Math" w:hAnsi="Cambria Math" w:cs="Didot" w:hint="cs"/>
+            <w:sz w:val="22"/>
+            <w:szCs w:val="22"/>
+          </w:rPr>
+          <m:t>u</m:t>
+        </m:r>
+      </m:oMath>
+    </w:p>
+    <w:p>
+      <w:pPr>
+        <w:spacing w:line="360" w:lineRule="auto"/>
+        <w:jc w:val="both"/>
+        <w:rPr>
+          <w:rFonts w:ascii="Didot" w:hAnsi="Didot" w:cs="Didot" w:hint="cs"/>
+          <w:sz w:val="22"/>
+          <w:szCs w:val="22"/>
+          <w:u w:val="single"/>
+        </w:rPr>
+      </w:pPr>
+      <w:r>
+        <w:rPr>
+          <w:rFonts w:ascii="Didot" w:hAnsi="Didot" w:cs="Didot" w:hint="cs"/>
+          <w:sz w:val="22"/>
+          <w:szCs w:val="22"/>
+          <w:u w:val="single"/>
+        </w:rPr>
+        <w:t>Desvantagem:</w:t>
+      </w:r>
+    </w:p>
+    <w:p>
+      <w:pPr>
+        <w:spacing w:line="360" w:lineRule="auto"/>
+        <w:jc w:val="both"/>
+        <w:rPr>
+          <w:rFonts w:ascii="Didot" w:hAnsi="Didot" w:cs="Didot" w:hint="cs"/>
+          <w:sz w:val="22"/>
+          <w:szCs w:val="22"/>
+        </w:rPr>
+      </w:pPr>
+      <w:r>
+        <w:rPr>
+          <w:rFonts w:ascii="Didot" w:hAnsi="Didot" w:cs="Didot" w:hint="cs"/>
+          <w:sz w:val="22"/>
+          <w:szCs w:val="22"/>
+        </w:rPr>
+        <w:t>- movimento segmentado</w:t>
+      </w:r>
+    </w:p>
+    <w:p>
+      <w:pPr>
+        <w:spacing w:line="360" w:lineRule="auto"/>
+        <w:jc w:val="both"/>
+        <w:rPr>
+          <w:rFonts w:ascii="Didot" w:hAnsi="Didot" w:cs="Didot" w:hint="cs"/>
+          <w:sz w:val="22"/>
+          <w:szCs w:val="22"/>
+        </w:rPr>
+      </w:pPr>
+    </w:p>
+    <w:p>
+      <w:pPr>
+        <w:pStyle w:val="Heading1"/>
+        <w:spacing w:line="360" w:lineRule="auto"/>
+      </w:pPr>
+      <w:r>
+        <w:t>Questão 3</w:t>
+      </w:r>
+    </w:p>
+    <w:p>
+      <w:pPr>
+        <w:spacing w:line="360" w:lineRule="auto"/>
+        <w:jc w:val="both"/>
+        <w:rPr>
+          <w:rFonts w:ascii="Didot" w:hAnsi="Didot" w:cs="Didot" w:hint="cs"/>
+          <w:color w:val="0A2F41" w:themeColor="accent1" w:themeShade="80"/>
+          <w:sz w:val="22"/>
+          <w:szCs w:val="22"/>
+        </w:rPr>
+      </w:pPr>
+      <w:r>
+        <w:rPr>
+          <w:rFonts w:ascii="Didot" w:hAnsi="Didot" w:cs="Didot" w:hint="cs"/>
+          <w:color w:val="0A2F41" w:themeColor="accent1" w:themeShade="80"/>
+          <w:sz w:val="22"/>
+          <w:szCs w:val="22"/>
+        </w:rPr>
+        <w:t>Como garantir que o robôs não colida com as baias durante a navegação?</w:t>
+      </w:r>
+    </w:p>
+    <w:p>
+      <w:pPr>
+        <w:spacing w:line="360" w:lineRule="auto"/>
+        <w:jc w:val="both"/>
+        <w:rPr>
+          <w:rFonts w:ascii="Didot" w:hAnsi="Didot" w:cs="Didot" w:hint="cs"/>
+          <w:color w:val="0A2F41" w:themeColor="accent1" w:themeShade="80"/>
+          <w:sz w:val="22"/>
+          <w:szCs w:val="22"/>
+        </w:rPr>
+      </w:pPr>
+      <w:r>
+        <w:rPr>
+          <w:rFonts w:ascii="Didot" w:hAnsi="Didot" w:cs="Didot" w:hint="cs"/>
+          <w:color w:val="0A2F41" w:themeColor="accent1" w:themeShade="80"/>
+          <w:sz w:val="22"/>
+          <w:szCs w:val="22"/>
+        </w:rPr>
+        <w:t>Nota: Considere que no problema proposto, o robô não possui implementado estratégias de evasão de obstáculos. O rota a ser seguida deve garantir a navegação sem colisão.</w:t>
+      </w:r>
+    </w:p>
+    <w:p>
+      <w:pPr>
+        <w:spacing w:line="360" w:lineRule="auto"/>
+        <w:jc w:val="both"/>
+        <w:rPr>
+          <w:rFonts w:ascii="Didot" w:hAnsi="Didot" w:cs="Didot"/>
+          <w:sz w:val="22"/>
+          <w:szCs w:val="22"/>
+        </w:rPr>
+      </w:pPr>
+    </w:p>
+    <w:p>
+      <w:pPr>
+        <w:spacing w:line="360" w:lineRule="auto"/>
+        <w:jc w:val="both"/>
+        <w:rPr>
+          <w:rFonts w:ascii="Didot" w:hAnsi="Didot" w:cs="Didot"/>
+          <w:sz w:val="22"/>
+          <w:szCs w:val="22"/>
+        </w:rPr>
+      </w:pPr>
+      <w:r>
+        <w:rPr>
+          <w:rFonts w:ascii="Didot" w:hAnsi="Didot" w:cs="Didot"/>
+          <w:sz w:val="22"/>
+          <w:szCs w:val="22"/>
+        </w:rPr>
+        <w:t>A prevenção de colisões deve ser feita estritamente no planejamento da rota (Topologia do Grafo de Navegação).</w:t>
+      </w:r>
+    </w:p>
+    <w:p>
+      <w:pPr>
+        <w:spacing w:line="360" w:lineRule="auto"/>
+        <w:jc w:val="both"/>
+        <w:rPr>
+          <w:rFonts w:ascii="Didot" w:hAnsi="Didot" w:cs="Didot"/>
+          <w:sz w:val="22"/>
+          <w:szCs w:val="22"/>
+        </w:rPr>
+      </w:pPr>
+      <w:r>
+        <w:rPr>
+          <w:rFonts w:ascii="Didot" w:hAnsi="Didot" w:cs="Didot"/>
+          <w:sz w:val="22"/>
+          <w:szCs w:val="22"/>
+        </w:rPr>
+        <w:t xml:space="preserve">O uso de </w:t>
+      </w:r>
+      <w:r>
+        <w:rPr>
+          <w:rFonts w:ascii="Didot" w:hAnsi="Didot" w:cs="Didot"/>
+          <w:i/>
+          <w:iCs/>
+          <w:sz w:val="22"/>
+          <w:szCs w:val="22"/>
+        </w:rPr>
+        <w:t>waypoints</w:t>
+      </w:r>
+      <w:r>
+        <w:rPr>
+          <w:rFonts w:ascii="Didot" w:hAnsi="Didot" w:cs="Didot"/>
+          <w:sz w:val="22"/>
+          <w:szCs w:val="22"/>
+        </w:rPr>
+        <w:t xml:space="preserve"> intermediários em áreas livre (espaços de circulação) garante que a interpolação linear do movimento do robô nunca intercepte a geometria das baias.</w:t>
+      </w:r>
+    </w:p>
+    <w:p>
+      <w:pPr>
+        <w:spacing w:line="360" w:lineRule="auto"/>
+        <w:jc w:val="both"/>
+        <w:rPr>
+          <w:rFonts w:ascii="Didot" w:hAnsi="Didot" w:cs="Didot"/>
+          <w:sz w:val="22"/>
+          <w:szCs w:val="22"/>
+        </w:rPr>
+      </w:pPr>
+    </w:p>
+    <w:p>
+      <w:pPr>
+        <w:spacing w:line="360" w:lineRule="auto"/>
+        <w:jc w:val="both"/>
+        <w:rPr>
+          <w:rFonts w:ascii="Didot" w:hAnsi="Didot" w:cs="Didot"/>
+          <w:sz w:val="22"/>
+          <w:szCs w:val="22"/>
+        </w:rPr>
+      </w:pPr>
+      <w:r>
+        <w:rPr>
+          <w:rFonts w:ascii="Didot" w:hAnsi="Didot" w:cs="Didot"/>
+          <w:sz w:val="22"/>
+          <w:szCs w:val="22"/>
+        </w:rPr>
+        <w:t>Possibilidade de implementação:</w:t>
+      </w:r>
+    </w:p>
+    <w:p>
+      <w:pPr>
+        <w:spacing w:line="360" w:lineRule="auto"/>
+        <w:jc w:val="both"/>
+        <w:rPr>
+          <w:rFonts w:ascii="Didot" w:hAnsi="Didot" w:cs="Didot"/>
+          <w:sz w:val="22"/>
+          <w:szCs w:val="22"/>
+        </w:rPr>
+      </w:pPr>
+      <w:r>
+        <w:rPr>
+          <w:rFonts w:ascii="Didot" w:hAnsi="Didot" w:cs="Didot"/>
+          <w:sz w:val="22"/>
+          <w:szCs w:val="22"/>
+        </w:rPr>
+        <w:lastRenderedPageBreak/>
+        <w:t>Ao invés de enviar o comando "vá da baia B (-5, 3) para baia C (5, 2)", o que geraria uma linha reta cruzando o centro geométrico do galpão (arriscando colisão com as quinas das mesas), o sistema de controle de alto nível deve subdividir a rota.</w:t>
+      </w:r>
+    </w:p>
+    <w:p>
+      <w:pPr>
+        <w:spacing w:line="360" w:lineRule="auto"/>
+        <w:jc w:val="both"/>
+        <w:rPr>
+          <w:rFonts w:ascii="Didot" w:hAnsi="Didot" w:cs="Didot"/>
+          <w:sz w:val="22"/>
+          <w:szCs w:val="22"/>
+        </w:rPr>
+      </w:pPr>
+      <w:r>
+        <w:rPr>
+          <w:rFonts w:ascii="Didot" w:hAnsi="Didot" w:cs="Didot"/>
+          <w:sz w:val="22"/>
+          <w:szCs w:val="22"/>
+        </w:rPr>
+        <w:t xml:space="preserve">- Passo 1:  Move da Baia B para o </w:t>
+      </w:r>
+      <w:r>
+        <w:rPr>
+          <w:rFonts w:ascii="Didot" w:hAnsi="Didot" w:cs="Didot"/>
+          <w:i/>
+          <w:iCs/>
+          <w:sz w:val="22"/>
+          <w:szCs w:val="22"/>
+        </w:rPr>
+        <w:t>Waypoint</w:t>
+      </w:r>
+      <w:r>
+        <w:rPr>
+          <w:rFonts w:ascii="Didot" w:hAnsi="Didot" w:cs="Didot"/>
+          <w:sz w:val="22"/>
+          <w:szCs w:val="22"/>
+        </w:rPr>
+        <w:t xml:space="preserve"> Central Superior (0, 4)</w:t>
+      </w:r>
+    </w:p>
+    <w:p>
+      <w:pPr>
+        <w:spacing w:line="360" w:lineRule="auto"/>
+        <w:jc w:val="both"/>
+        <w:rPr>
+          <w:rFonts w:ascii="Didot" w:hAnsi="Didot" w:cs="Didot"/>
+          <w:sz w:val="22"/>
+          <w:szCs w:val="22"/>
+        </w:rPr>
+      </w:pPr>
+      <w:r>
+        <w:rPr>
+          <w:rFonts w:ascii="Didot" w:hAnsi="Didot" w:cs="Didot"/>
+          <w:sz w:val="22"/>
+          <w:szCs w:val="22"/>
+        </w:rPr>
+        <w:t xml:space="preserve">- Passo 2: Move do </w:t>
+      </w:r>
+      <w:r>
+        <w:rPr>
+          <w:rFonts w:ascii="Didot" w:hAnsi="Didot" w:cs="Didot"/>
+          <w:i/>
+          <w:iCs/>
+          <w:sz w:val="22"/>
+          <w:szCs w:val="22"/>
+        </w:rPr>
+        <w:t>Waypoint</w:t>
+      </w:r>
+      <w:r>
+        <w:rPr>
+          <w:rFonts w:ascii="Didot" w:hAnsi="Didot" w:cs="Didot"/>
+          <w:sz w:val="22"/>
+          <w:szCs w:val="22"/>
+        </w:rPr>
+        <w:t xml:space="preserve"> Central Superior para a Baia C (5, 2)</w:t>
+      </w:r>
+    </w:p>
+    <w:p>
+      <w:pPr>
+        <w:spacing w:line="360" w:lineRule="auto"/>
+        <w:jc w:val="both"/>
+        <w:rPr>
+          <w:rFonts w:ascii="Didot" w:hAnsi="Didot" w:cs="Didot"/>
+          <w:sz w:val="22"/>
+          <w:szCs w:val="22"/>
+        </w:rPr>
+      </w:pPr>
+    </w:p>
+    <w:p>
+      <w:pPr>
+        <w:pStyle w:val="Heading1"/>
+        <w:spacing w:line="360" w:lineRule="auto"/>
+      </w:pPr>
+      <w:r>
+        <w:t>Questão 4</w:t>
+      </w:r>
+    </w:p>
+    <w:p>
+      <w:pPr>
+        <w:spacing w:line="360" w:lineRule="auto"/>
+        <w:jc w:val="both"/>
+        <w:rPr>
+          <w:rFonts w:ascii="Didot" w:hAnsi="Didot" w:cs="Didot"/>
+          <w:color w:val="0A2F41" w:themeColor="accent1" w:themeShade="80"/>
+          <w:sz w:val="22"/>
+          <w:szCs w:val="22"/>
+        </w:rPr>
+      </w:pPr>
+      <w:r>
+        <w:rPr>
+          <w:rFonts w:ascii="Didot" w:hAnsi="Didot" w:cs="Didot" w:hint="cs"/>
+          <w:color w:val="0A2F41" w:themeColor="accent1" w:themeShade="80"/>
+          <w:sz w:val="22"/>
+          <w:szCs w:val="22"/>
+        </w:rPr>
+        <w:t>Quais critérios você usaria para ajustar os ganhos do controlador para garantir um comportamento suave, seguro e eficiente?</w:t>
+      </w:r>
+    </w:p>
+    <w:p>
+      <w:pPr>
+        <w:spacing w:line="360" w:lineRule="auto"/>
+        <w:jc w:val="both"/>
+        <w:rPr>
+          <w:rFonts w:ascii="Didot" w:hAnsi="Didot" w:cs="Didot"/>
+          <w:color w:val="0A2F41" w:themeColor="accent1" w:themeShade="80"/>
+          <w:sz w:val="22"/>
+          <w:szCs w:val="22"/>
+        </w:rPr>
+      </w:pPr>
+    </w:p>
+    <w:p>
+      <w:pPr>
+        <w:spacing w:line="360" w:lineRule="auto"/>
+        <w:jc w:val="both"/>
+        <w:rPr>
+          <w:rFonts w:ascii="Didot" w:hAnsi="Didot" w:cs="Didot" w:hint="cs"/>
+          <w:sz w:val="22"/>
+          <w:szCs w:val="22"/>
+        </w:rPr>
+      </w:pPr>
+      <w:r>
+        <w:rPr>
+          <w:rFonts w:ascii="Didot" w:hAnsi="Didot" w:cs="Didot" w:hint="cs"/>
+          <w:sz w:val="22"/>
+          <w:szCs w:val="22"/>
+        </w:rPr>
+        <w:t xml:space="preserve">Para garantir um comportamento suave, seguro e eficiente, os ganhos (ex: </w:t>
+      </w:r>
+      <m:oMath>
+        <m:sSub>
+          <m:sSubPr>
+            <m:ctrlPr>
+              <w:rPr>
+                <w:rFonts w:ascii="Cambria Math" w:hAnsi="Cambria Math" w:cs="Didot" w:hint="cs"/>
+                <w:sz w:val="22"/>
+                <w:szCs w:val="22"/>
+              </w:rPr>
+            </m:ctrlPr>
+          </m:sSubPr>
+          <m:e>
+            <m:r>
+              <w:rPr>
+                <w:rFonts w:ascii="Cambria Math" w:hAnsi="Cambria Math" w:cs="Didot" w:hint="cs"/>
+                <w:sz w:val="22"/>
+                <w:szCs w:val="22"/>
+              </w:rPr>
+              <m:t>K</m:t>
+            </m:r>
+          </m:e>
+          <m:sub>
+            <m:r>
+              <w:rPr>
+                <w:rFonts w:ascii="Cambria Math" w:hAnsi="Cambria Math" w:cs="Didot" w:hint="cs"/>
+                <w:sz w:val="22"/>
+                <w:szCs w:val="22"/>
+              </w:rPr>
+              <m:t>p</m:t>
+            </m:r>
+          </m:sub>
+        </m:sSub>
+        <m:r>
+          <w:rPr>
+            <w:rFonts w:ascii="Cambria Math" w:hAnsi="Cambria Math" w:cs="Didot" w:hint="cs"/>
+            <w:sz w:val="22"/>
+            <w:szCs w:val="22"/>
+          </w:rPr>
+          <m:t>,</m:t>
+        </m:r>
+        <m:sSub>
+          <m:sSubPr>
+            <m:ctrlPr>
+              <w:rPr>
+                <w:rFonts w:ascii="Cambria Math" w:hAnsi="Cambria Math" w:cs="Didot" w:hint="cs"/>
+                <w:sz w:val="22"/>
+                <w:szCs w:val="22"/>
+              </w:rPr>
+            </m:ctrlPr>
+          </m:sSubPr>
+          <m:e>
+            <m:r>
+              <w:rPr>
+                <w:rFonts w:ascii="Cambria Math" w:hAnsi="Cambria Math" w:cs="Didot" w:hint="cs"/>
+                <w:sz w:val="22"/>
+                <w:szCs w:val="22"/>
+              </w:rPr>
+              <m:t>K</m:t>
+            </m:r>
+          </m:e>
+          <m:sub>
+            <m:r>
+              <w:rPr>
+                <w:rFonts w:ascii="Cambria Math" w:hAnsi="Cambria Math" w:cs="Didot" w:hint="cs"/>
+                <w:sz w:val="22"/>
+                <w:szCs w:val="22"/>
+              </w:rPr>
+              <m:t>i</m:t>
+            </m:r>
+          </m:sub>
+        </m:sSub>
+        <m:r>
+          <w:rPr>
+            <w:rFonts w:ascii="Cambria Math" w:hAnsi="Cambria Math" w:cs="Didot" w:hint="cs"/>
+            <w:sz w:val="22"/>
+            <w:szCs w:val="22"/>
+          </w:rPr>
+          <m:t>,</m:t>
+        </m:r>
+        <m:sSub>
+          <m:sSubPr>
+            <m:ctrlPr>
+              <w:rPr>
+                <w:rFonts w:ascii="Cambria Math" w:hAnsi="Cambria Math" w:cs="Didot" w:hint="cs"/>
+                <w:sz w:val="22"/>
+                <w:szCs w:val="22"/>
+              </w:rPr>
+            </m:ctrlPr>
+          </m:sSubPr>
+          <m:e>
+            <m:r>
+              <w:rPr>
+                <w:rFonts w:ascii="Cambria Math" w:hAnsi="Cambria Math" w:cs="Didot" w:hint="cs"/>
+                <w:sz w:val="22"/>
+                <w:szCs w:val="22"/>
+              </w:rPr>
+              <m:t>K</m:t>
+            </m:r>
+          </m:e>
+          <m:sub>
+            <m:r>
+              <w:rPr>
+                <w:rFonts w:ascii="Cambria Math" w:hAnsi="Cambria Math" w:cs="Didot" w:hint="cs"/>
+                <w:sz w:val="22"/>
+                <w:szCs w:val="22"/>
+              </w:rPr>
+              <m:t>d</m:t>
+            </m:r>
+          </m:sub>
+        </m:sSub>
+      </m:oMath>
+      <w:r>
+        <w:rPr>
+          <w:rFonts w:ascii="Didot" w:hAnsi="Didot" w:cs="Didot" w:hint="cs"/>
+          <w:sz w:val="22"/>
+          <w:szCs w:val="22"/>
+        </w:rPr>
+        <w:t xml:space="preserve"> de um PID) devem seguir rígidos critérios industriais</w:t>
+      </w:r>
+    </w:p>
+    <w:p>
+      <w:pPr>
+        <w:spacing w:line="360" w:lineRule="auto"/>
+        <w:jc w:val="both"/>
+        <w:rPr>
+          <w:rFonts w:ascii="Didot" w:hAnsi="Didot" w:cs="Didot" w:hint="cs"/>
+          <w:sz w:val="22"/>
+          <w:szCs w:val="22"/>
+        </w:rPr>
+      </w:pPr>
+      <w:r>
+        <w:rPr>
+          <w:rFonts w:ascii="Didot" w:hAnsi="Didot" w:cs="Didot" w:hint="cs"/>
+          <w:sz w:val="22"/>
+          <w:szCs w:val="22"/>
+          <w:u w:val="single"/>
+        </w:rPr>
+        <w:t>1. Comportamento Superamortecido (Overdamped):</w:t>
+      </w:r>
+      <w:r>
+        <w:rPr>
+          <w:rFonts w:ascii="Didot" w:hAnsi="Didot" w:cs="Didot" w:hint="cs"/>
+          <w:sz w:val="22"/>
+          <w:szCs w:val="22"/>
+        </w:rPr>
+        <w:t xml:space="preserve"> os ganhos derivativos (</w:t>
+      </w:r>
+      <m:oMath>
+        <m:sSub>
+          <m:sSubPr>
+            <m:ctrlPr>
+              <w:rPr>
+                <w:rFonts w:ascii="Cambria Math" w:hAnsi="Cambria Math" w:cs="Didot" w:hint="cs"/>
+                <w:sz w:val="22"/>
+                <w:szCs w:val="22"/>
+              </w:rPr>
+            </m:ctrlPr>
+          </m:sSubPr>
+          <m:e>
+            <m:r>
+              <w:rPr>
+                <w:rFonts w:ascii="Cambria Math" w:hAnsi="Cambria Math" w:cs="Didot" w:hint="cs"/>
+                <w:sz w:val="22"/>
+                <w:szCs w:val="22"/>
+              </w:rPr>
+              <m:t>K</m:t>
+            </m:r>
+          </m:e>
+          <m:sub>
+            <m:r>
+              <w:rPr>
+                <w:rFonts w:ascii="Cambria Math" w:hAnsi="Cambria Math" w:cs="Didot" w:hint="cs"/>
+                <w:sz w:val="22"/>
+                <w:szCs w:val="22"/>
+              </w:rPr>
+              <m:t>d</m:t>
+            </m:r>
+          </m:sub>
+        </m:sSub>
+      </m:oMath>
+      <w:r>
+        <w:rPr>
+          <w:rFonts w:ascii="Didot" w:hAnsi="Didot" w:cs="Didot" w:hint="cs"/>
+          <w:sz w:val="22"/>
+          <w:szCs w:val="22"/>
+        </w:rPr>
+        <w:t>) devem ser ajustados em proporção aos ganhos proporcionais (</w:t>
+      </w:r>
+      <m:oMath>
+        <m:sSub>
+          <m:sSubPr>
+            <m:ctrlPr>
+              <w:rPr>
+                <w:rFonts w:ascii="Cambria Math" w:hAnsi="Cambria Math" w:cs="Didot" w:hint="cs"/>
+                <w:sz w:val="22"/>
+                <w:szCs w:val="22"/>
+              </w:rPr>
+            </m:ctrlPr>
+          </m:sSubPr>
+          <m:e>
+            <m:r>
+              <w:rPr>
+                <w:rFonts w:ascii="Cambria Math" w:hAnsi="Cambria Math" w:cs="Didot" w:hint="cs"/>
+                <w:sz w:val="22"/>
+                <w:szCs w:val="22"/>
+              </w:rPr>
+              <m:t>K</m:t>
+            </m:r>
+          </m:e>
+          <m:sub>
+            <m:r>
+              <w:rPr>
+                <w:rFonts w:ascii="Cambria Math" w:hAnsi="Cambria Math" w:cs="Didot" w:hint="cs"/>
+                <w:sz w:val="22"/>
+                <w:szCs w:val="22"/>
+              </w:rPr>
+              <m:t>p</m:t>
+            </m:r>
+          </m:sub>
+        </m:sSub>
+      </m:oMath>
+      <w:r>
+        <w:rPr>
+          <w:rFonts w:ascii="Didot" w:hAnsi="Didot" w:cs="Didot" w:hint="cs"/>
+          <w:sz w:val="22"/>
+          <w:szCs w:val="22"/>
+        </w:rPr>
+        <w:t xml:space="preserve">) para que o fator de amortecimento </w:t>
+      </w:r>
+      <m:oMath>
+        <m:r>
+          <w:rPr>
+            <w:rFonts w:ascii="Cambria Math" w:hAnsi="Cambria Math" w:cs="Didot" w:hint="cs"/>
+            <w:sz w:val="22"/>
+            <w:szCs w:val="22"/>
+          </w:rPr>
+          <m:t>ζ≥1</m:t>
+        </m:r>
+      </m:oMath>
+      <w:r>
+        <w:rPr>
+          <w:rFonts w:ascii="Didot" w:hAnsi="Didot" w:cs="Didot" w:hint="cs"/>
+          <w:sz w:val="22"/>
+          <w:szCs w:val="22"/>
+        </w:rPr>
+        <w:t>. Isso elimina o sobressinal (overshoot), evitando que o robô ultrapasse a coordenada alvo e colida com a bancada antes de recuar.</w:t>
+      </w:r>
+    </w:p>
+    <w:p>
+      <w:pPr>
+        <w:spacing w:line="360" w:lineRule="auto"/>
+        <w:jc w:val="both"/>
+        <w:rPr>
+          <w:rFonts w:ascii="Didot" w:hAnsi="Didot" w:cs="Didot"/>
+          <w:sz w:val="22"/>
+          <w:szCs w:val="22"/>
+        </w:rPr>
+      </w:pPr>
+      <w:r>
+        <w:rPr>
+          <w:rFonts w:ascii="Didot" w:hAnsi="Didot" w:cs="Didot" w:hint="cs"/>
+          <w:sz w:val="22"/>
+          <w:szCs w:val="22"/>
+          <w:u w:val="single"/>
+        </w:rPr>
+        <w:t>2. Saturação de Sinal:</w:t>
+      </w:r>
+      <w:r>
+        <w:rPr>
+          <w:rFonts w:ascii="Didot" w:hAnsi="Didot" w:cs="Didot" w:hint="cs"/>
+          <w:sz w:val="22"/>
+          <w:szCs w:val="22"/>
+        </w:rPr>
+        <w:t xml:space="preserve"> </w:t>
+      </w:r>
+      <w:r>
+        <w:rPr>
+          <w:rFonts w:ascii="Didot" w:hAnsi="Didot" w:cs="Didot"/>
+          <w:sz w:val="22"/>
+          <w:szCs w:val="22"/>
+        </w:rPr>
+        <w:t xml:space="preserve">independentemente do erro calculado, a velocidade linear </w:t>
       </w:r>
       <m:oMath>
         <m:r>
@@ -1319,29 +2475,11 @@
       </m:oMath>
       <w:r>
         <w:rPr>
-          <w:rFonts w:ascii="Didot" w:hAnsi="Didot" w:cs="Didot" w:hint="cs"/>
-          <w:sz w:val="22"/>
-          <w:szCs w:val="22"/>
-        </w:rPr>
-        <w:t> (m/s)</w:t>
-      </w:r>
-    </w:p>
-    <w:p>
-      <w:pPr>
-        <w:spacing w:line="360" w:lineRule="auto"/>
-        <w:rPr>
-          <w:rFonts w:ascii="Didot" w:hAnsi="Didot" w:cs="Didot"/>
-          <w:sz w:val="22"/>
-          <w:szCs w:val="22"/>
-        </w:rPr>
-      </w:pPr>
-      <w:r>
-        <w:rPr>
-          <w:rFonts w:ascii="Didot" w:hAnsi="Didot" w:cs="Didot" w:hint="cs"/>
-          <w:sz w:val="22"/>
-          <w:szCs w:val="22"/>
-        </w:rPr>
-        <w:t>Evolução temporal da velocidade angular </w:t>
+          <w:rFonts w:ascii="Didot" w:hAnsi="Didot" w:cs="Didot"/>
+          <w:sz w:val="22"/>
+          <w:szCs w:val="22"/>
+        </w:rPr>
+        <w:t xml:space="preserve"> e angular </w:t>
       </w:r>
       <m:oMath>
         <m:r>
@@ -1355,7 +2493,1562 @@
       </m:oMath>
       <w:r>
         <w:rPr>
-          <w:rFonts w:ascii="Didot" w:hAnsi="Didot" w:cs="Didot" w:hint="cs"/>
+          <w:rFonts w:ascii="Didot" w:hAnsi="Didot" w:cs="Didot"/>
+          <w:sz w:val="22"/>
+          <w:szCs w:val="22"/>
+        </w:rPr>
+        <w:t xml:space="preserve"> devem ser limitadas por saturação (ex: </w:t>
+      </w:r>
+      <m:oMath>
+        <m:sSub>
+          <m:sSubPr>
+            <m:ctrlPr>
+              <w:rPr>
+                <w:rFonts w:ascii="Cambria Math" w:hAnsi="Cambria Math" w:cs="Didot"/>
+                <w:sz w:val="22"/>
+                <w:szCs w:val="22"/>
+              </w:rPr>
+            </m:ctrlPr>
+          </m:sSubPr>
+          <m:e>
+            <m:r>
+              <w:rPr>
+                <w:rFonts w:ascii="Cambria Math" w:hAnsi="Cambria Math" w:cs="Didot"/>
+                <w:sz w:val="22"/>
+                <w:szCs w:val="22"/>
+              </w:rPr>
+              <m:t>u</m:t>
+            </m:r>
+          </m:e>
+          <m:sub>
+            <m:r>
+              <w:rPr>
+                <w:rFonts w:ascii="Cambria Math" w:hAnsi="Cambria Math" w:cs="Didot"/>
+                <w:sz w:val="22"/>
+                <w:szCs w:val="22"/>
+              </w:rPr>
+              <m:t>max</m:t>
+            </m:r>
+          </m:sub>
+        </m:sSub>
+        <m:r>
+          <w:rPr>
+            <w:rFonts w:ascii="Cambria Math" w:hAnsi="Cambria Math" w:cs="Didot"/>
+            <w:sz w:val="22"/>
+            <w:szCs w:val="22"/>
+          </w:rPr>
+          <m:t>=1m/s</m:t>
+        </m:r>
+      </m:oMath>
+      <w:r>
+        <w:rPr>
+          <w:rFonts w:ascii="Didot" w:hAnsi="Didot" w:cs="Didot"/>
+          <w:sz w:val="22"/>
+          <w:szCs w:val="22"/>
+        </w:rPr>
+        <w:t>). Isso previne acelerações bruscas que causam escorregamento das rodas (perda de odometria).</w:t>
+      </w:r>
+    </w:p>
+    <w:p>
+      <w:pPr>
+        <w:spacing w:line="360" w:lineRule="auto"/>
+        <w:jc w:val="both"/>
+        <w:rPr>
+          <w:rFonts w:ascii="Didot" w:hAnsi="Didot" w:cs="Didot"/>
+          <w:sz w:val="22"/>
+          <w:szCs w:val="22"/>
+        </w:rPr>
+      </w:pPr>
+      <w:r>
+        <w:rPr>
+          <w:rFonts w:ascii="Didot" w:hAnsi="Didot" w:cs="Didot"/>
+          <w:sz w:val="22"/>
+          <w:szCs w:val="22"/>
+          <w:u w:val="single"/>
+        </w:rPr>
+        <w:t xml:space="preserve">3. </w:t>
+      </w:r>
+      <w:r>
+        <w:rPr>
+          <w:rFonts w:ascii="Didot" w:hAnsi="Didot" w:cs="Didot"/>
+          <w:sz w:val="22"/>
+          <w:szCs w:val="22"/>
+          <w:u w:val="single"/>
+        </w:rPr>
+        <w:t>Zonamento de Ganho (</w:t>
+      </w:r>
+      <w:r>
+        <w:rPr>
+          <w:rFonts w:ascii="Didot" w:hAnsi="Didot" w:cs="Didot"/>
+          <w:i/>
+          <w:iCs/>
+          <w:sz w:val="22"/>
+          <w:szCs w:val="22"/>
+          <w:u w:val="single"/>
+        </w:rPr>
+        <w:t>Gain Scheduling</w:t>
+      </w:r>
+      <w:r>
+        <w:rPr>
+          <w:rFonts w:ascii="Didot" w:hAnsi="Didot" w:cs="Didot"/>
+          <w:sz w:val="22"/>
+          <w:szCs w:val="22"/>
+          <w:u w:val="single"/>
+        </w:rPr>
+        <w:t>):</w:t>
+      </w:r>
+      <w:r>
+        <w:rPr>
+          <w:rFonts w:ascii="Didot" w:hAnsi="Didot" w:cs="Didot"/>
+          <w:sz w:val="22"/>
+          <w:szCs w:val="22"/>
+        </w:rPr>
+        <w:t xml:space="preserve"> O uso de um </w:t>
+      </w:r>
+      <m:oMath>
+        <m:sSub>
+          <m:sSubPr>
+            <m:ctrlPr>
+              <w:rPr>
+                <w:rFonts w:ascii="Cambria Math" w:hAnsi="Cambria Math" w:cs="Didot"/>
+                <w:sz w:val="22"/>
+                <w:szCs w:val="22"/>
+              </w:rPr>
+            </m:ctrlPr>
+          </m:sSubPr>
+          <m:e>
+            <m:r>
+              <w:rPr>
+                <w:rFonts w:ascii="Cambria Math" w:hAnsi="Cambria Math" w:cs="Didot"/>
+                <w:sz w:val="22"/>
+                <w:szCs w:val="22"/>
+              </w:rPr>
+              <m:t>K</m:t>
+            </m:r>
+          </m:e>
+          <m:sub>
+            <m:r>
+              <w:rPr>
+                <w:rFonts w:ascii="Cambria Math" w:hAnsi="Cambria Math" w:cs="Didot"/>
+                <w:sz w:val="22"/>
+                <w:szCs w:val="22"/>
+              </w:rPr>
+              <m:t>p</m:t>
+            </m:r>
+          </m:sub>
+        </m:sSub>
+      </m:oMath>
+      <w:r>
+        <w:rPr>
+          <w:rFonts w:ascii="Didot" w:hAnsi="Didot" w:cs="Didot"/>
+          <w:sz w:val="22"/>
+          <w:szCs w:val="22"/>
+        </w:rPr>
+        <w:t xml:space="preserve"> alto quando o robô está longe do alvo para eficiência, mudando para um </w:t>
+      </w:r>
+      <m:oMath>
+        <m:sSub>
+          <m:sSubPr>
+            <m:ctrlPr>
+              <w:rPr>
+                <w:rFonts w:ascii="Cambria Math" w:hAnsi="Cambria Math" w:cs="Didot"/>
+                <w:sz w:val="22"/>
+                <w:szCs w:val="22"/>
+              </w:rPr>
+            </m:ctrlPr>
+          </m:sSubPr>
+          <m:e>
+            <m:r>
+              <w:rPr>
+                <w:rFonts w:ascii="Cambria Math" w:hAnsi="Cambria Math" w:cs="Didot"/>
+                <w:sz w:val="22"/>
+                <w:szCs w:val="22"/>
+              </w:rPr>
+              <m:t>K</m:t>
+            </m:r>
+          </m:e>
+          <m:sub>
+            <m:r>
+              <w:rPr>
+                <w:rFonts w:ascii="Cambria Math" w:hAnsi="Cambria Math" w:cs="Didot"/>
+                <w:sz w:val="22"/>
+                <w:szCs w:val="22"/>
+              </w:rPr>
+              <m:t>p</m:t>
+            </m:r>
+          </m:sub>
+        </m:sSub>
+      </m:oMath>
+      <w:r>
+        <w:rPr>
+          <w:rFonts w:ascii="Didot" w:hAnsi="Didot" w:cs="Didot"/>
+          <w:sz w:val="22"/>
+          <w:szCs w:val="22"/>
+        </w:rPr>
+        <w:t xml:space="preserve"> baixo quando a distância </w:t>
+      </w:r>
+      <m:oMath>
+        <m:r>
+          <w:rPr>
+            <w:rFonts w:ascii="Cambria Math" w:hAnsi="Cambria Math" w:cs="Didot"/>
+            <w:sz w:val="22"/>
+            <w:szCs w:val="22"/>
+          </w:rPr>
+          <m:t>ρ&lt;0.5m</m:t>
+        </m:r>
+      </m:oMath>
+      <w:r>
+        <w:rPr>
+          <w:rFonts w:ascii="Didot" w:hAnsi="Didot" w:cs="Didot"/>
+          <w:sz w:val="22"/>
+          <w:szCs w:val="22"/>
+        </w:rPr>
+        <w:t xml:space="preserve"> para suavidade na aproximação final.</w:t>
+      </w:r>
+    </w:p>
+    <w:p>
+      <w:pPr>
+        <w:spacing w:line="360" w:lineRule="auto"/>
+        <w:jc w:val="both"/>
+        <w:rPr>
+          <w:rFonts w:ascii="Didot" w:hAnsi="Didot" w:cs="Didot" w:hint="cs"/>
+          <w:sz w:val="22"/>
+          <w:szCs w:val="22"/>
+        </w:rPr>
+      </w:pPr>
+    </w:p>
+    <w:p>
+      <w:pPr>
+        <w:pStyle w:val="Heading1"/>
+        <w:spacing w:line="360" w:lineRule="auto"/>
+      </w:pPr>
+      <w:r>
+        <w:rPr>
+          <w:rFonts w:hint="cs"/>
+        </w:rPr>
+        <w:t>Questão 5</w:t>
+      </w:r>
+    </w:p>
+    <w:p>
+      <w:pPr>
+        <w:spacing w:line="360" w:lineRule="auto"/>
+        <w:rPr>
+          <w:rFonts w:ascii="Didot" w:hAnsi="Didot" w:cs="Didot"/>
+          <w:sz w:val="22"/>
+          <w:szCs w:val="22"/>
+        </w:rPr>
+      </w:pPr>
+      <w:r>
+        <w:rPr>
+          <w:rFonts w:ascii="Didot" w:hAnsi="Didot" w:cs="Didot" w:hint="cs"/>
+          <w:color w:val="0A2F41" w:themeColor="accent1" w:themeShade="80"/>
+          <w:sz w:val="22"/>
+          <w:szCs w:val="22"/>
+        </w:rPr>
+        <w:t>Qual a rota realizada pelo robô para executar a tarefa proposta?</w:t>
+      </w:r>
+      <w:r>
+        <w:rPr>
+          <w:rFonts w:ascii="Didot" w:hAnsi="Didot" w:cs="Didot" w:hint="cs"/>
+          <w:color w:val="0A2F41" w:themeColor="accent1" w:themeShade="80"/>
+          <w:sz w:val="22"/>
+          <w:szCs w:val="22"/>
+        </w:rPr>
+        <w:br/>
+      </w:r>
+      <w:r>
+        <w:rPr>
+          <w:rFonts w:ascii="Didot" w:hAnsi="Didot" w:cs="Didot"/>
+          <w:sz w:val="22"/>
+          <w:szCs w:val="22"/>
+        </w:rPr>
+        <w:t xml:space="preserve">- </w:t>
+      </w:r>
+      <w:r>
+        <w:rPr>
+          <w:rFonts w:ascii="Didot" w:hAnsi="Didot" w:cs="Didot"/>
+          <w:sz w:val="22"/>
+          <w:szCs w:val="22"/>
+        </w:rPr>
+        <w:t>Home</w:t>
+      </w:r>
+      <w:r>
+        <w:rPr>
+          <w:rFonts w:ascii="Didot" w:hAnsi="Didot" w:cs="Didot"/>
+          <w:sz w:val="22"/>
+          <w:szCs w:val="22"/>
+        </w:rPr>
+        <w:t>: (</w:t>
+      </w:r>
+      <m:oMath>
+        <m:r>
+          <w:rPr>
+            <w:rFonts w:ascii="Cambria Math" w:hAnsi="Cambria Math" w:cs="Didot"/>
+            <w:sz w:val="22"/>
+            <w:szCs w:val="22"/>
+          </w:rPr>
+          <m:t>0</m:t>
+        </m:r>
+      </m:oMath>
+      <w:r>
+        <w:rPr>
+          <w:rFonts w:ascii="Didot" w:hAnsi="Didot" w:cs="Didot"/>
+          <w:sz w:val="22"/>
+          <w:szCs w:val="22"/>
+        </w:rPr>
+        <w:t xml:space="preserve">, </w:t>
+      </w:r>
+      <m:oMath>
+        <m:r>
+          <w:rPr>
+            <w:rFonts w:ascii="Cambria Math" w:hAnsi="Cambria Math" w:cs="Didot"/>
+            <w:sz w:val="22"/>
+            <w:szCs w:val="22"/>
+          </w:rPr>
+          <m:t>-5</m:t>
+        </m:r>
+      </m:oMath>
+      <w:r>
+        <w:rPr>
+          <w:rFonts w:ascii="Didot" w:hAnsi="Didot" w:cs="Didot"/>
+          <w:sz w:val="22"/>
+          <w:szCs w:val="22"/>
+        </w:rPr>
+        <w:t xml:space="preserve">, </w:t>
+      </w:r>
+      <m:oMath>
+        <m:sSup>
+          <m:sSupPr>
+            <m:ctrlPr>
+              <w:rPr>
+                <w:rFonts w:ascii="Cambria Math" w:hAnsi="Cambria Math" w:cs="Didot"/>
+                <w:sz w:val="22"/>
+                <w:szCs w:val="22"/>
+              </w:rPr>
+            </m:ctrlPr>
+          </m:sSupPr>
+          <m:e>
+            <m:r>
+              <w:rPr>
+                <w:rFonts w:ascii="Cambria Math" w:hAnsi="Cambria Math" w:cs="Didot"/>
+                <w:sz w:val="22"/>
+                <w:szCs w:val="22"/>
+              </w:rPr>
+              <m:t>90</m:t>
+            </m:r>
+          </m:e>
+          <m:sup>
+            <m:r>
+              <w:rPr>
+                <w:rFonts w:ascii="Cambria Math" w:hAnsi="Cambria Math" w:cs="Didot"/>
+                <w:sz w:val="22"/>
+                <w:szCs w:val="22"/>
+              </w:rPr>
+              <m:t>∘</m:t>
+            </m:r>
+          </m:sup>
+        </m:sSup>
+      </m:oMath>
+      <w:r>
+        <w:rPr>
+          <w:rFonts w:ascii="Didot" w:hAnsi="Didot" w:cs="Didot"/>
+          <w:sz w:val="22"/>
+          <w:szCs w:val="22"/>
+        </w:rPr>
+        <w:t>)</w:t>
+      </w:r>
+    </w:p>
+    <w:p>
+      <w:pPr>
+        <w:spacing w:line="360" w:lineRule="auto"/>
+        <w:rPr>
+          <w:rFonts w:ascii="Didot" w:hAnsi="Didot" w:cs="Didot"/>
+          <w:sz w:val="22"/>
+          <w:szCs w:val="22"/>
+        </w:rPr>
+      </w:pPr>
+      <w:r>
+        <w:rPr>
+          <w:rFonts w:ascii="Didot" w:hAnsi="Didot" w:cs="Didot"/>
+          <w:sz w:val="22"/>
+          <w:szCs w:val="22"/>
+        </w:rPr>
+        <w:t>- Navegação direta para a Baia A: (</w:t>
+      </w:r>
+      <m:oMath>
+        <m:r>
+          <w:rPr>
+            <w:rFonts w:ascii="Cambria Math" w:hAnsi="Cambria Math" w:cs="Didot"/>
+            <w:sz w:val="22"/>
+            <w:szCs w:val="22"/>
+          </w:rPr>
+          <m:t>-3</m:t>
+        </m:r>
+      </m:oMath>
+      <w:r>
+        <w:rPr>
+          <w:rFonts w:ascii="Didot" w:hAnsi="Didot" w:cs="Didot"/>
+          <w:sz w:val="22"/>
+          <w:szCs w:val="22"/>
+        </w:rPr>
+        <w:t xml:space="preserve">, </w:t>
+      </w:r>
+      <m:oMath>
+        <m:r>
+          <w:rPr>
+            <w:rFonts w:ascii="Cambria Math" w:hAnsi="Cambria Math" w:cs="Didot"/>
+            <w:sz w:val="22"/>
+            <w:szCs w:val="22"/>
+          </w:rPr>
+          <m:t>0</m:t>
+        </m:r>
+      </m:oMath>
+      <w:r>
+        <w:rPr>
+          <w:rFonts w:ascii="Didot" w:hAnsi="Didot" w:cs="Didot"/>
+          <w:sz w:val="22"/>
+          <w:szCs w:val="22"/>
+        </w:rPr>
+        <w:t xml:space="preserve">, </w:t>
+      </w:r>
+      <m:oMath>
+        <m:r>
+          <w:rPr>
+            <w:rFonts w:ascii="Cambria Math" w:hAnsi="Cambria Math" w:cs="Didot"/>
+            <w:sz w:val="22"/>
+            <w:szCs w:val="22"/>
+          </w:rPr>
+          <m:t>-</m:t>
+        </m:r>
+        <m:sSup>
+          <m:sSupPr>
+            <m:ctrlPr>
+              <w:rPr>
+                <w:rFonts w:ascii="Cambria Math" w:hAnsi="Cambria Math" w:cs="Didot"/>
+                <w:sz w:val="22"/>
+                <w:szCs w:val="22"/>
+              </w:rPr>
+            </m:ctrlPr>
+          </m:sSupPr>
+          <m:e>
+            <m:r>
+              <w:rPr>
+                <w:rFonts w:ascii="Cambria Math" w:hAnsi="Cambria Math" w:cs="Didot"/>
+                <w:sz w:val="22"/>
+                <w:szCs w:val="22"/>
+              </w:rPr>
+              <m:t>90</m:t>
+            </m:r>
+          </m:e>
+          <m:sup>
+            <m:r>
+              <w:rPr>
+                <w:rFonts w:ascii="Cambria Math" w:hAnsi="Cambria Math" w:cs="Didot"/>
+                <w:sz w:val="22"/>
+                <w:szCs w:val="22"/>
+              </w:rPr>
+              <m:t>∘</m:t>
+            </m:r>
+          </m:sup>
+        </m:sSup>
+      </m:oMath>
+      <w:r>
+        <w:rPr>
+          <w:rFonts w:ascii="Didot" w:hAnsi="Didot" w:cs="Didot"/>
+          <w:sz w:val="22"/>
+          <w:szCs w:val="22"/>
+        </w:rPr>
+        <w:t>)</w:t>
+      </w:r>
+    </w:p>
+    <w:p>
+      <w:pPr>
+        <w:spacing w:line="360" w:lineRule="auto"/>
+        <w:rPr>
+          <w:rFonts w:ascii="Didot" w:hAnsi="Didot" w:cs="Didot"/>
+          <w:sz w:val="22"/>
+          <w:szCs w:val="22"/>
+        </w:rPr>
+      </w:pPr>
+      <w:r>
+        <w:rPr>
+          <w:rFonts w:ascii="Didot" w:hAnsi="Didot" w:cs="Didot"/>
+          <w:sz w:val="22"/>
+          <w:szCs w:val="22"/>
+        </w:rPr>
+        <w:lastRenderedPageBreak/>
+        <w:t xml:space="preserve">- Navegação via </w:t>
+      </w:r>
+      <w:r>
+        <w:rPr>
+          <w:rFonts w:ascii="Didot" w:hAnsi="Didot" w:cs="Didot"/>
+          <w:i/>
+          <w:iCs/>
+          <w:sz w:val="22"/>
+          <w:szCs w:val="22"/>
+        </w:rPr>
+        <w:t>Waypoint</w:t>
+      </w:r>
+      <w:r>
+        <w:rPr>
+          <w:rFonts w:ascii="Didot" w:hAnsi="Didot" w:cs="Didot"/>
+          <w:sz w:val="22"/>
+          <w:szCs w:val="22"/>
+        </w:rPr>
+        <w:t xml:space="preserve"> (</w:t>
+      </w:r>
+      <m:oMath>
+        <m:r>
+          <w:rPr>
+            <w:rFonts w:ascii="Cambria Math" w:hAnsi="Cambria Math" w:cs="Didot"/>
+            <w:sz w:val="22"/>
+            <w:szCs w:val="22"/>
+          </w:rPr>
+          <m:t>-4</m:t>
+        </m:r>
+      </m:oMath>
+      <w:r>
+        <w:rPr>
+          <w:rFonts w:ascii="Didot" w:hAnsi="Didot" w:cs="Didot"/>
+          <w:sz w:val="22"/>
+          <w:szCs w:val="22"/>
+        </w:rPr>
+        <w:t xml:space="preserve">, </w:t>
+      </w:r>
+      <m:oMath>
+        <m:r>
+          <w:rPr>
+            <w:rFonts w:ascii="Cambria Math" w:hAnsi="Cambria Math" w:cs="Didot"/>
+            <w:sz w:val="22"/>
+            <w:szCs w:val="22"/>
+          </w:rPr>
+          <m:t>1.5</m:t>
+        </m:r>
+      </m:oMath>
+      <w:r>
+        <w:rPr>
+          <w:rFonts w:ascii="Didot" w:hAnsi="Didot" w:cs="Didot"/>
+          <w:sz w:val="22"/>
+          <w:szCs w:val="22"/>
+        </w:rPr>
+        <w:t>) para Baia B: (</w:t>
+      </w:r>
+      <m:oMath>
+        <m:r>
+          <w:rPr>
+            <w:rFonts w:ascii="Cambria Math" w:hAnsi="Cambria Math" w:cs="Didot"/>
+            <w:sz w:val="22"/>
+            <w:szCs w:val="22"/>
+          </w:rPr>
+          <m:t>-5</m:t>
+        </m:r>
+      </m:oMath>
+      <w:r>
+        <w:rPr>
+          <w:rFonts w:ascii="Didot" w:hAnsi="Didot" w:cs="Didot"/>
+          <w:sz w:val="22"/>
+          <w:szCs w:val="22"/>
+        </w:rPr>
+        <w:t xml:space="preserve">, </w:t>
+      </w:r>
+      <m:oMath>
+        <m:r>
+          <w:rPr>
+            <w:rFonts w:ascii="Cambria Math" w:hAnsi="Cambria Math" w:cs="Didot"/>
+            <w:sz w:val="22"/>
+            <w:szCs w:val="22"/>
+          </w:rPr>
+          <m:t>3</m:t>
+        </m:r>
+      </m:oMath>
+      <w:r>
+        <w:rPr>
+          <w:rFonts w:ascii="Didot" w:hAnsi="Didot" w:cs="Didot"/>
+          <w:sz w:val="22"/>
+          <w:szCs w:val="22"/>
+        </w:rPr>
+        <w:t xml:space="preserve">, </w:t>
+      </w:r>
+      <m:oMath>
+        <m:sSup>
+          <m:sSupPr>
+            <m:ctrlPr>
+              <w:rPr>
+                <w:rFonts w:ascii="Cambria Math" w:hAnsi="Cambria Math" w:cs="Didot"/>
+                <w:sz w:val="22"/>
+                <w:szCs w:val="22"/>
+              </w:rPr>
+            </m:ctrlPr>
+          </m:sSupPr>
+          <m:e>
+            <m:r>
+              <w:rPr>
+                <w:rFonts w:ascii="Cambria Math" w:hAnsi="Cambria Math" w:cs="Didot"/>
+                <w:sz w:val="22"/>
+                <w:szCs w:val="22"/>
+              </w:rPr>
+              <m:t>0</m:t>
+            </m:r>
+          </m:e>
+          <m:sup>
+            <m:r>
+              <w:rPr>
+                <w:rFonts w:ascii="Cambria Math" w:hAnsi="Cambria Math" w:cs="Didot"/>
+                <w:sz w:val="22"/>
+                <w:szCs w:val="22"/>
+              </w:rPr>
+              <m:t>∘</m:t>
+            </m:r>
+          </m:sup>
+        </m:sSup>
+      </m:oMath>
+      <w:r>
+        <w:rPr>
+          <w:rFonts w:ascii="Didot" w:hAnsi="Didot" w:cs="Didot"/>
+          <w:sz w:val="22"/>
+          <w:szCs w:val="22"/>
+        </w:rPr>
+        <w:t>)</w:t>
+      </w:r>
+    </w:p>
+    <w:p>
+      <w:pPr>
+        <w:spacing w:line="360" w:lineRule="auto"/>
+        <w:rPr>
+          <w:rFonts w:ascii="Didot" w:hAnsi="Didot" w:cs="Didot"/>
+          <w:sz w:val="22"/>
+          <w:szCs w:val="22"/>
+        </w:rPr>
+      </w:pPr>
+      <w:r>
+        <w:rPr>
+          <w:rFonts w:ascii="Didot" w:hAnsi="Didot" w:cs="Didot"/>
+          <w:sz w:val="22"/>
+          <w:szCs w:val="22"/>
+        </w:rPr>
+        <w:t xml:space="preserve">- Navegação via </w:t>
+      </w:r>
+      <w:r>
+        <w:rPr>
+          <w:rFonts w:ascii="Didot" w:hAnsi="Didot" w:cs="Didot"/>
+          <w:i/>
+          <w:iCs/>
+          <w:sz w:val="22"/>
+          <w:szCs w:val="22"/>
+        </w:rPr>
+        <w:t>Waypoint</w:t>
+      </w:r>
+      <w:r>
+        <w:rPr>
+          <w:rFonts w:ascii="Didot" w:hAnsi="Didot" w:cs="Didot"/>
+          <w:sz w:val="22"/>
+          <w:szCs w:val="22"/>
+        </w:rPr>
+        <w:t xml:space="preserve"> (</w:t>
+      </w:r>
+      <m:oMath>
+        <m:r>
+          <w:rPr>
+            <w:rFonts w:ascii="Cambria Math" w:hAnsi="Cambria Math" w:cs="Didot"/>
+            <w:sz w:val="22"/>
+            <w:szCs w:val="22"/>
+          </w:rPr>
+          <m:t>0</m:t>
+        </m:r>
+      </m:oMath>
+      <w:r>
+        <w:rPr>
+          <w:rFonts w:ascii="Didot" w:hAnsi="Didot" w:cs="Didot"/>
+          <w:sz w:val="22"/>
+          <w:szCs w:val="22"/>
+        </w:rPr>
+        <w:t xml:space="preserve">, </w:t>
+      </w:r>
+      <m:oMath>
+        <m:r>
+          <w:rPr>
+            <w:rFonts w:ascii="Cambria Math" w:hAnsi="Cambria Math" w:cs="Didot"/>
+            <w:sz w:val="22"/>
+            <w:szCs w:val="22"/>
+          </w:rPr>
+          <m:t>4</m:t>
+        </m:r>
+      </m:oMath>
+      <w:r>
+        <w:rPr>
+          <w:rFonts w:ascii="Didot" w:hAnsi="Didot" w:cs="Didot"/>
+          <w:sz w:val="22"/>
+          <w:szCs w:val="22"/>
+        </w:rPr>
+        <w:t>) para Baia C: (</w:t>
+      </w:r>
+      <m:oMath>
+        <m:r>
+          <w:rPr>
+            <w:rFonts w:ascii="Cambria Math" w:hAnsi="Cambria Math" w:cs="Didot"/>
+            <w:sz w:val="22"/>
+            <w:szCs w:val="22"/>
+          </w:rPr>
+          <m:t>5</m:t>
+        </m:r>
+      </m:oMath>
+      <w:r>
+        <w:rPr>
+          <w:rFonts w:ascii="Didot" w:hAnsi="Didot" w:cs="Didot"/>
+          <w:sz w:val="22"/>
+          <w:szCs w:val="22"/>
+        </w:rPr>
+        <w:t xml:space="preserve">, </w:t>
+      </w:r>
+      <m:oMath>
+        <m:r>
+          <w:rPr>
+            <w:rFonts w:ascii="Cambria Math" w:hAnsi="Cambria Math" w:cs="Didot"/>
+            <w:sz w:val="22"/>
+            <w:szCs w:val="22"/>
+          </w:rPr>
+          <m:t>2</m:t>
+        </m:r>
+      </m:oMath>
+      <w:r>
+        <w:rPr>
+          <w:rFonts w:ascii="Didot" w:hAnsi="Didot" w:cs="Didot"/>
+          <w:sz w:val="22"/>
+          <w:szCs w:val="22"/>
+        </w:rPr>
+        <w:t xml:space="preserve">, </w:t>
+      </w:r>
+      <m:oMath>
+        <m:sSup>
+          <m:sSupPr>
+            <m:ctrlPr>
+              <w:rPr>
+                <w:rFonts w:ascii="Cambria Math" w:hAnsi="Cambria Math" w:cs="Didot"/>
+                <w:sz w:val="22"/>
+                <w:szCs w:val="22"/>
+              </w:rPr>
+            </m:ctrlPr>
+          </m:sSupPr>
+          <m:e>
+            <m:r>
+              <w:rPr>
+                <w:rFonts w:ascii="Cambria Math" w:hAnsi="Cambria Math" w:cs="Didot"/>
+                <w:sz w:val="22"/>
+                <w:szCs w:val="22"/>
+              </w:rPr>
+              <m:t>180</m:t>
+            </m:r>
+          </m:e>
+          <m:sup>
+            <m:r>
+              <w:rPr>
+                <w:rFonts w:ascii="Cambria Math" w:hAnsi="Cambria Math" w:cs="Didot"/>
+                <w:sz w:val="22"/>
+                <w:szCs w:val="22"/>
+              </w:rPr>
+              <m:t>∘</m:t>
+            </m:r>
+          </m:sup>
+        </m:sSup>
+      </m:oMath>
+      <w:r>
+        <w:rPr>
+          <w:rFonts w:ascii="Didot" w:hAnsi="Didot" w:cs="Didot"/>
+          <w:sz w:val="22"/>
+          <w:szCs w:val="22"/>
+        </w:rPr>
+        <w:t>)</w:t>
+      </w:r>
+    </w:p>
+    <w:p>
+      <w:pPr>
+        <w:spacing w:line="360" w:lineRule="auto"/>
+        <w:rPr>
+          <w:rFonts w:ascii="Didot" w:hAnsi="Didot" w:cs="Didot"/>
+          <w:sz w:val="22"/>
+          <w:szCs w:val="22"/>
+        </w:rPr>
+      </w:pPr>
+      <w:r>
+        <w:rPr>
+          <w:rFonts w:ascii="Didot" w:hAnsi="Didot" w:cs="Didot"/>
+          <w:sz w:val="22"/>
+          <w:szCs w:val="22"/>
+        </w:rPr>
+        <w:t xml:space="preserve">- Navegação via </w:t>
+      </w:r>
+      <w:r>
+        <w:rPr>
+          <w:rFonts w:ascii="Didot" w:hAnsi="Didot" w:cs="Didot"/>
+          <w:i/>
+          <w:iCs/>
+          <w:sz w:val="22"/>
+          <w:szCs w:val="22"/>
+        </w:rPr>
+        <w:t>Waypoint</w:t>
+      </w:r>
+      <w:r>
+        <w:rPr>
+          <w:rFonts w:ascii="Didot" w:hAnsi="Didot" w:cs="Didot"/>
+          <w:sz w:val="22"/>
+          <w:szCs w:val="22"/>
+        </w:rPr>
+        <w:t xml:space="preserve"> (</w:t>
+      </w:r>
+      <m:oMath>
+        <m:r>
+          <w:rPr>
+            <w:rFonts w:ascii="Cambria Math" w:hAnsi="Cambria Math" w:cs="Didot"/>
+            <w:sz w:val="22"/>
+            <w:szCs w:val="22"/>
+          </w:rPr>
+          <m:t>4</m:t>
+        </m:r>
+      </m:oMath>
+      <w:r>
+        <w:rPr>
+          <w:rFonts w:ascii="Didot" w:hAnsi="Didot" w:cs="Didot"/>
+          <w:sz w:val="22"/>
+          <w:szCs w:val="22"/>
+        </w:rPr>
+        <w:t xml:space="preserve">, </w:t>
+      </w:r>
+      <m:oMath>
+        <m:r>
+          <w:rPr>
+            <w:rFonts w:ascii="Cambria Math" w:hAnsi="Cambria Math" w:cs="Didot"/>
+            <w:sz w:val="22"/>
+            <w:szCs w:val="22"/>
+          </w:rPr>
+          <m:t>-1.5</m:t>
+        </m:r>
+      </m:oMath>
+      <w:r>
+        <w:rPr>
+          <w:rFonts w:ascii="Didot" w:hAnsi="Didot" w:cs="Didot"/>
+          <w:sz w:val="22"/>
+          <w:szCs w:val="22"/>
+        </w:rPr>
+        <w:t>) para Baia D: (</w:t>
+      </w:r>
+      <m:oMath>
+        <m:r>
+          <w:rPr>
+            <w:rFonts w:ascii="Cambria Math" w:hAnsi="Cambria Math" w:cs="Didot"/>
+            <w:sz w:val="22"/>
+            <w:szCs w:val="22"/>
+          </w:rPr>
+          <m:t>3</m:t>
+        </m:r>
+      </m:oMath>
+      <w:r>
+        <w:rPr>
+          <w:rFonts w:ascii="Didot" w:hAnsi="Didot" w:cs="Didot"/>
+          <w:sz w:val="22"/>
+          <w:szCs w:val="22"/>
+        </w:rPr>
+        <w:t xml:space="preserve">, </w:t>
+      </w:r>
+      <m:oMath>
+        <m:r>
+          <w:rPr>
+            <w:rFonts w:ascii="Cambria Math" w:hAnsi="Cambria Math" w:cs="Didot"/>
+            <w:sz w:val="22"/>
+            <w:szCs w:val="22"/>
+          </w:rPr>
+          <m:t>-5</m:t>
+        </m:r>
+      </m:oMath>
+      <w:r>
+        <w:rPr>
+          <w:rFonts w:ascii="Didot" w:hAnsi="Didot" w:cs="Didot"/>
+          <w:sz w:val="22"/>
+          <w:szCs w:val="22"/>
+        </w:rPr>
+        <w:t xml:space="preserve">, </w:t>
+      </w:r>
+      <m:oMath>
+        <m:sSup>
+          <m:sSupPr>
+            <m:ctrlPr>
+              <w:rPr>
+                <w:rFonts w:ascii="Cambria Math" w:hAnsi="Cambria Math" w:cs="Didot"/>
+                <w:sz w:val="22"/>
+                <w:szCs w:val="22"/>
+              </w:rPr>
+            </m:ctrlPr>
+          </m:sSupPr>
+          <m:e>
+            <m:r>
+              <w:rPr>
+                <w:rFonts w:ascii="Cambria Math" w:hAnsi="Cambria Math" w:cs="Didot"/>
+                <w:sz w:val="22"/>
+                <w:szCs w:val="22"/>
+              </w:rPr>
+              <m:t>90</m:t>
+            </m:r>
+          </m:e>
+          <m:sup>
+            <m:r>
+              <w:rPr>
+                <w:rFonts w:ascii="Cambria Math" w:hAnsi="Cambria Math" w:cs="Didot"/>
+                <w:sz w:val="22"/>
+                <w:szCs w:val="22"/>
+              </w:rPr>
+              <m:t>∘</m:t>
+            </m:r>
+          </m:sup>
+        </m:sSup>
+      </m:oMath>
+      <w:r>
+        <w:rPr>
+          <w:rFonts w:ascii="Didot" w:hAnsi="Didot" w:cs="Didot"/>
+          <w:sz w:val="22"/>
+          <w:szCs w:val="22"/>
+        </w:rPr>
+        <w:t>)</w:t>
+      </w:r>
+    </w:p>
+    <w:p>
+      <w:pPr>
+        <w:spacing w:line="360" w:lineRule="auto"/>
+        <w:rPr>
+          <w:rFonts w:ascii="Didot" w:hAnsi="Didot" w:cs="Didot"/>
+          <w:sz w:val="22"/>
+          <w:szCs w:val="22"/>
+        </w:rPr>
+      </w:pPr>
+      <w:r>
+        <w:rPr>
+          <w:rFonts w:ascii="Didot" w:hAnsi="Didot" w:cs="Didot"/>
+          <w:sz w:val="22"/>
+          <w:szCs w:val="22"/>
+        </w:rPr>
+        <w:t>- Navegação direta para Home: (</w:t>
+      </w:r>
+      <m:oMath>
+        <m:r>
+          <w:rPr>
+            <w:rFonts w:ascii="Cambria Math" w:hAnsi="Cambria Math" w:cs="Didot"/>
+            <w:sz w:val="22"/>
+            <w:szCs w:val="22"/>
+          </w:rPr>
+          <m:t>0</m:t>
+        </m:r>
+      </m:oMath>
+      <w:r>
+        <w:rPr>
+          <w:rFonts w:ascii="Didot" w:hAnsi="Didot" w:cs="Didot"/>
+          <w:sz w:val="22"/>
+          <w:szCs w:val="22"/>
+        </w:rPr>
+        <w:t xml:space="preserve">, </w:t>
+      </w:r>
+      <m:oMath>
+        <m:r>
+          <w:rPr>
+            <w:rFonts w:ascii="Cambria Math" w:hAnsi="Cambria Math" w:cs="Didot"/>
+            <w:sz w:val="22"/>
+            <w:szCs w:val="22"/>
+          </w:rPr>
+          <m:t>-5</m:t>
+        </m:r>
+      </m:oMath>
+      <w:r>
+        <w:rPr>
+          <w:rFonts w:ascii="Didot" w:hAnsi="Didot" w:cs="Didot"/>
+          <w:sz w:val="22"/>
+          <w:szCs w:val="22"/>
+        </w:rPr>
+        <w:t xml:space="preserve">, </w:t>
+      </w:r>
+      <m:oMath>
+        <m:sSup>
+          <m:sSupPr>
+            <m:ctrlPr>
+              <w:rPr>
+                <w:rFonts w:ascii="Cambria Math" w:hAnsi="Cambria Math" w:cs="Didot"/>
+                <w:sz w:val="22"/>
+                <w:szCs w:val="22"/>
+              </w:rPr>
+            </m:ctrlPr>
+          </m:sSupPr>
+          <m:e>
+            <m:r>
+              <w:rPr>
+                <w:rFonts w:ascii="Cambria Math" w:hAnsi="Cambria Math" w:cs="Didot"/>
+                <w:sz w:val="22"/>
+                <w:szCs w:val="22"/>
+              </w:rPr>
+              <m:t>90</m:t>
+            </m:r>
+          </m:e>
+          <m:sup>
+            <m:r>
+              <w:rPr>
+                <w:rFonts w:ascii="Cambria Math" w:hAnsi="Cambria Math" w:cs="Didot"/>
+                <w:sz w:val="22"/>
+                <w:szCs w:val="22"/>
+              </w:rPr>
+              <m:t>∘</m:t>
+            </m:r>
+          </m:sup>
+        </m:sSup>
+      </m:oMath>
+      <w:r>
+        <w:rPr>
+          <w:rFonts w:ascii="Didot" w:hAnsi="Didot" w:cs="Didot"/>
+          <w:sz w:val="22"/>
+          <w:szCs w:val="22"/>
+        </w:rPr>
+        <w:t>)</w:t>
+      </w:r>
+    </w:p>
+    <w:p>
+      <w:pPr>
+        <w:spacing w:line="360" w:lineRule="auto"/>
+        <w:rPr>
+          <w:rFonts w:ascii="Didot" w:hAnsi="Didot" w:cs="Didot"/>
+          <w:color w:val="0A2F41" w:themeColor="accent1" w:themeShade="80"/>
+          <w:sz w:val="22"/>
+          <w:szCs w:val="22"/>
+        </w:rPr>
+      </w:pPr>
+      <w:r>
+        <w:rPr>
+          <w:rFonts w:ascii="Didot" w:hAnsi="Didot" w:cs="Didot" w:hint="cs"/>
+          <w:sz w:val="22"/>
+          <w:szCs w:val="22"/>
+        </w:rPr>
+        <w:br/>
+      </w:r>
+      <w:r>
+        <w:rPr>
+          <w:rFonts w:ascii="Didot" w:hAnsi="Didot" w:cs="Didot" w:hint="cs"/>
+          <w:color w:val="0A2F41" w:themeColor="accent1" w:themeShade="80"/>
+          <w:sz w:val="22"/>
+          <w:szCs w:val="22"/>
+        </w:rPr>
+        <w:t>Insira aqui as imagens dos seguintes gráficos:</w:t>
+      </w:r>
+    </w:p>
+    <w:p>
+      <w:pPr>
+        <w:spacing w:line="360" w:lineRule="auto"/>
+        <w:rPr>
+          <w:rFonts w:ascii="Didot" w:hAnsi="Didot" w:cs="Didot"/>
+          <w:color w:val="0A2F41" w:themeColor="accent1" w:themeShade="80"/>
+          <w:sz w:val="22"/>
+          <w:szCs w:val="22"/>
+        </w:rPr>
+      </w:pPr>
+      <w:r>
+        <w:rPr>
+          <w:rFonts w:ascii="Didot" w:hAnsi="Didot" w:cs="Didot" w:hint="cs"/>
+          <w:color w:val="0A2F41" w:themeColor="accent1" w:themeShade="80"/>
+          <w:sz w:val="22"/>
+          <w:szCs w:val="22"/>
+        </w:rPr>
+        <w:t>Navegação no plano XY</w:t>
+      </w:r>
+    </w:p>
+    <w:p>
+      <w:pPr>
+        <w:spacing w:line="360" w:lineRule="auto"/>
+        <w:rPr>
+          <w:rFonts w:ascii="Didot" w:hAnsi="Didot" w:cs="Didot"/>
+          <w:color w:val="0A2F41" w:themeColor="accent1" w:themeShade="80"/>
+          <w:sz w:val="22"/>
+          <w:szCs w:val="22"/>
+        </w:rPr>
+      </w:pPr>
+      <w:r>
+        <w:rPr>
+          <w:rFonts w:ascii="Didot" w:hAnsi="Didot" w:cs="Didot"/>
+          <w:noProof/>
+          <w:color w:val="156082" w:themeColor="accent1"/>
+          <w:sz w:val="22"/>
+          <w:szCs w:val="22"/>
+        </w:rPr>
+        <w:drawing>
+          <wp:inline distT="0" distB="0" distL="0" distR="0" wp14:anchorId="6AA3AA2C" wp14:editId="65A43DA7">
+            <wp:extent cx="5756910" cy="5254625"/>
+            <wp:effectExtent l="0" t="0" r="0" b="3175"/>
+            <wp:docPr id="1099206837" name="Picture 3"/>
+            <wp:cNvGraphicFramePr>
+              <a:graphicFrameLocks xmlns:a="http://schemas.openxmlformats.org/drawingml/2006/main" noChangeAspect="1"/>
+            </wp:cNvGraphicFramePr>
+            <a:graphic xmlns:a="http://schemas.openxmlformats.org/drawingml/2006/main">
+              <a:graphicData uri="http://schemas.openxmlformats.org/drawingml/2006/picture">
+                <pic:pic xmlns:pic="http://schemas.openxmlformats.org/drawingml/2006/picture">
+                  <pic:nvPicPr>
+                    <pic:cNvPr id="1099206837" name="Picture 1099206837"/>
+                    <pic:cNvPicPr/>
+                  </pic:nvPicPr>
+                  <pic:blipFill>
+                    <a:blip r:embed="rId8">
+                      <a:extLst>
+                        <a:ext uri="{28A0092B-C50C-407E-A947-70E740481C1C}">
+                          <a14:useLocalDpi xmlns:a14="http://schemas.microsoft.com/office/drawing/2010/main" val="0"/>
+                        </a:ext>
+                      </a:extLst>
+                    </a:blip>
+                    <a:stretch>
+                      <a:fillRect/>
+                    </a:stretch>
+                  </pic:blipFill>
+                  <pic:spPr>
+                    <a:xfrm>
+                      <a:off x="0" y="0"/>
+                      <a:ext cx="5756910" cy="5254625"/>
+                    </a:xfrm>
+                    <a:prstGeom prst="rect">
+                      <a:avLst/>
+                    </a:prstGeom>
+                  </pic:spPr>
+                </pic:pic>
+              </a:graphicData>
+            </a:graphic>
+          </wp:inline>
+        </w:drawing>
+      </w:r>
+    </w:p>
+    <w:p>
+      <w:pPr>
+        <w:spacing w:line="360" w:lineRule="auto"/>
+        <w:rPr>
+          <w:rFonts w:ascii="Didot" w:hAnsi="Didot" w:cs="Didot"/>
+          <w:color w:val="0A2F41" w:themeColor="accent1" w:themeShade="80"/>
+          <w:sz w:val="22"/>
+          <w:szCs w:val="22"/>
+        </w:rPr>
+      </w:pPr>
+      <w:r>
+        <w:rPr>
+          <w:rFonts w:ascii="Didot" w:hAnsi="Didot" w:cs="Didot" w:hint="cs"/>
+          <w:color w:val="0A2F41" w:themeColor="accent1" w:themeShade="80"/>
+          <w:sz w:val="22"/>
+          <w:szCs w:val="22"/>
+        </w:rPr>
+        <w:t>Evolução temporal de X</w:t>
+      </w:r>
+    </w:p>
+    <w:p>
+      <w:pPr>
+        <w:spacing w:line="360" w:lineRule="auto"/>
+        <w:rPr>
+          <w:rFonts w:ascii="Didot" w:hAnsi="Didot" w:cs="Didot"/>
+          <w:color w:val="0A2F41" w:themeColor="accent1" w:themeShade="80"/>
+          <w:sz w:val="22"/>
+          <w:szCs w:val="22"/>
+        </w:rPr>
+      </w:pPr>
+      <w:r>
+        <w:rPr>
+          <w:rFonts w:ascii="Didot" w:hAnsi="Didot" w:cs="Didot" w:hint="cs"/>
+          <w:color w:val="0A2F41" w:themeColor="accent1" w:themeShade="80"/>
+          <w:sz w:val="22"/>
+          <w:szCs w:val="22"/>
+        </w:rPr>
+        <w:t>Evolução temporal de Y</w:t>
+      </w:r>
+    </w:p>
+    <w:p>
+      <w:pPr>
+        <w:spacing w:line="360" w:lineRule="auto"/>
+        <w:rPr>
+          <w:rFonts w:ascii="Didot" w:hAnsi="Didot" w:cs="Didot"/>
+          <w:color w:val="0A2F41" w:themeColor="accent1" w:themeShade="80"/>
+          <w:sz w:val="22"/>
+          <w:szCs w:val="22"/>
+        </w:rPr>
+      </w:pPr>
+      <w:r>
+        <w:rPr>
+          <w:rFonts w:ascii="Didot" w:hAnsi="Didot" w:cs="Didot" w:hint="cs"/>
+          <w:color w:val="0A2F41" w:themeColor="accent1" w:themeShade="80"/>
+          <w:sz w:val="22"/>
+          <w:szCs w:val="22"/>
+        </w:rPr>
+        <w:t>Evolução temporal de </w:t>
+      </w:r>
+      <m:oMath>
+        <m:r>
+          <w:rPr>
+            <w:rFonts w:ascii="Cambria Math" w:hAnsi="Cambria Math" w:cs="Didot"/>
+            <w:color w:val="0A2F41" w:themeColor="accent1" w:themeShade="80"/>
+            <w:sz w:val="22"/>
+            <w:szCs w:val="22"/>
+          </w:rPr>
+          <m:t>ψ</m:t>
+        </m:r>
+      </m:oMath>
+    </w:p>
+    <w:p>
+      <w:pPr>
+        <w:spacing w:line="360" w:lineRule="auto"/>
+        <w:rPr>
+          <w:rFonts w:ascii="Didot" w:hAnsi="Didot" w:cs="Didot"/>
+          <w:sz w:val="22"/>
+          <w:szCs w:val="22"/>
+        </w:rPr>
+      </w:pPr>
+      <w:r>
+        <w:rPr>
+          <w:rFonts w:ascii="Didot" w:hAnsi="Didot" w:cs="Didot"/>
+          <w:noProof/>
+          <w:sz w:val="22"/>
+          <w:szCs w:val="22"/>
+        </w:rPr>
+        <w:lastRenderedPageBreak/>
+        <w:drawing>
+          <wp:inline distT="0" distB="0" distL="0" distR="0" wp14:anchorId="4F30BD4E" wp14:editId="3854C6C3">
+            <wp:extent cx="5756910" cy="4677410"/>
+            <wp:effectExtent l="0" t="0" r="0" b="0"/>
+            <wp:docPr id="481549958" name="Picture 4"/>
+            <wp:cNvGraphicFramePr>
+              <a:graphicFrameLocks xmlns:a="http://schemas.openxmlformats.org/drawingml/2006/main" noChangeAspect="1"/>
+            </wp:cNvGraphicFramePr>
+            <a:graphic xmlns:a="http://schemas.openxmlformats.org/drawingml/2006/main">
+              <a:graphicData uri="http://schemas.openxmlformats.org/drawingml/2006/picture">
+                <pic:pic xmlns:pic="http://schemas.openxmlformats.org/drawingml/2006/picture">
+                  <pic:nvPicPr>
+                    <pic:cNvPr id="481549958" name="Picture 481549958"/>
+                    <pic:cNvPicPr/>
+                  </pic:nvPicPr>
+                  <pic:blipFill>
+                    <a:blip r:embed="rId9">
+                      <a:extLst>
+                        <a:ext uri="{28A0092B-C50C-407E-A947-70E740481C1C}">
+                          <a14:useLocalDpi xmlns:a14="http://schemas.microsoft.com/office/drawing/2010/main" val="0"/>
+                        </a:ext>
+                      </a:extLst>
+                    </a:blip>
+                    <a:stretch>
+                      <a:fillRect/>
+                    </a:stretch>
+                  </pic:blipFill>
+                  <pic:spPr>
+                    <a:xfrm>
+                      <a:off x="0" y="0"/>
+                      <a:ext cx="5756910" cy="4677410"/>
+                    </a:xfrm>
+                    <a:prstGeom prst="rect">
+                      <a:avLst/>
+                    </a:prstGeom>
+                  </pic:spPr>
+                </pic:pic>
+              </a:graphicData>
+            </a:graphic>
+          </wp:inline>
+        </w:drawing>
+      </w:r>
+    </w:p>
+    <w:p>
+      <w:pPr>
+        <w:spacing w:line="360" w:lineRule="auto"/>
+        <w:rPr>
+          <w:rFonts w:ascii="Didot" w:hAnsi="Didot" w:cs="Didot"/>
+          <w:sz w:val="22"/>
+          <w:szCs w:val="22"/>
+        </w:rPr>
+      </w:pPr>
+    </w:p>
+    <w:p>
+      <w:pPr>
+        <w:pStyle w:val="Heading1"/>
+        <w:spacing w:line="360" w:lineRule="auto"/>
+      </w:pPr>
+      <w:r>
+        <w:rPr>
+          <w:rFonts w:hint="cs"/>
+        </w:rPr>
+        <w:t>Questão 6</w:t>
+      </w:r>
+    </w:p>
+    <w:p>
+      <w:pPr>
+        <w:spacing w:line="360" w:lineRule="auto"/>
+        <w:jc w:val="both"/>
+        <w:rPr>
+          <w:rFonts w:ascii="Didot" w:hAnsi="Didot" w:cs="Didot"/>
+          <w:sz w:val="22"/>
+          <w:szCs w:val="22"/>
+        </w:rPr>
+      </w:pPr>
+      <w:r>
+        <w:rPr>
+          <w:rFonts w:ascii="Didot" w:hAnsi="Didot" w:cs="Didot" w:hint="cs"/>
+          <w:color w:val="0A2F41" w:themeColor="accent1" w:themeShade="80"/>
+          <w:sz w:val="22"/>
+          <w:szCs w:val="22"/>
+        </w:rPr>
+        <w:t>Quais os sinais de controle foram aplicados ao robô para executar a tarefa proposta?</w:t>
+      </w:r>
+      <w:r>
+        <w:rPr>
+          <w:rFonts w:ascii="Didot" w:hAnsi="Didot" w:cs="Didot" w:hint="cs"/>
+          <w:color w:val="0A2F41" w:themeColor="accent1" w:themeShade="80"/>
+          <w:sz w:val="22"/>
+          <w:szCs w:val="22"/>
+        </w:rPr>
+        <w:br/>
+      </w:r>
+      <w:r>
+        <w:rPr>
+          <w:rFonts w:ascii="Didot" w:hAnsi="Didot" w:cs="Didot"/>
+          <w:sz w:val="22"/>
+          <w:szCs w:val="22"/>
+        </w:rPr>
+        <w:t>Na arquitetura</w:t>
+      </w:r>
+      <w:r>
+        <w:rPr>
+          <w:rFonts w:ascii="Didot" w:hAnsi="Didot" w:cs="Didot"/>
+          <w:sz w:val="22"/>
+          <w:szCs w:val="22"/>
+        </w:rPr>
+        <w:t xml:space="preserve"> de máquina de estados recomendada anteriormente, os sinais se comportariam de forma mutuamente exclusiva na maior parte do tempo:</w:t>
+      </w:r>
+    </w:p>
+    <w:p>
+      <w:pPr>
+        <w:spacing w:line="360" w:lineRule="auto"/>
+        <w:jc w:val="both"/>
+        <w:rPr>
+          <w:rFonts w:ascii="Didot" w:hAnsi="Didot" w:cs="Didot"/>
+          <w:sz w:val="22"/>
+          <w:szCs w:val="22"/>
+        </w:rPr>
+      </w:pPr>
+      <w:r>
+        <w:rPr>
+          <w:rFonts w:ascii="Didot" w:hAnsi="Didot" w:cs="Didot"/>
+          <w:sz w:val="22"/>
+          <w:szCs w:val="22"/>
+          <w:u w:val="single"/>
+        </w:rPr>
+        <w:t>- Velocidade Linear (</w:t>
+      </w:r>
+      <m:oMath>
+        <m:r>
+          <m:rPr>
+            <m:sty m:val="p"/>
+          </m:rPr>
+          <w:rPr>
+            <w:rFonts w:ascii="Cambria Math" w:hAnsi="Cambria Math" w:cs="Didot"/>
+            <w:sz w:val="22"/>
+            <w:szCs w:val="22"/>
+            <w:u w:val="single"/>
+          </w:rPr>
+          <m:t>u</m:t>
+        </m:r>
+      </m:oMath>
+      <w:r>
+        <w:rPr>
+          <w:rFonts w:ascii="Didot" w:hAnsi="Didot" w:cs="Didot"/>
+          <w:sz w:val="22"/>
+          <w:szCs w:val="22"/>
+          <w:u w:val="single"/>
+        </w:rPr>
+        <w:t>):</w:t>
+      </w:r>
+      <w:r>
+        <w:rPr>
+          <w:rFonts w:ascii="Didot" w:hAnsi="Didot" w:cs="Didot"/>
+          <w:sz w:val="22"/>
+          <w:szCs w:val="22"/>
+        </w:rPr>
+        <w:t xml:space="preserve"> teria um perfil trapezoidal. Aceleraria linearmente ao iniciar a translação em direção à baia, manteria velocidade de cruzeiro e desaceleraria suavemente até zero ao atingir a coordenada (</w:t>
+      </w:r>
+      <m:oMath>
+        <m:r>
+          <w:rPr>
+            <w:rFonts w:ascii="Cambria Math" w:hAnsi="Cambria Math" w:cs="Didot"/>
+            <w:sz w:val="22"/>
+            <w:szCs w:val="22"/>
+          </w:rPr>
+          <m:t>x</m:t>
+        </m:r>
+      </m:oMath>
+      <w:r>
+        <w:rPr>
+          <w:rFonts w:ascii="Didot" w:hAnsi="Didot" w:cs="Didot"/>
+          <w:sz w:val="22"/>
+          <w:szCs w:val="22"/>
+        </w:rPr>
+        <w:t xml:space="preserve">, </w:t>
+      </w:r>
+      <m:oMath>
+        <m:r>
+          <w:rPr>
+            <w:rFonts w:ascii="Cambria Math" w:hAnsi="Cambria Math" w:cs="Didot"/>
+            <w:sz w:val="22"/>
+            <w:szCs w:val="22"/>
+          </w:rPr>
+          <m:t>y</m:t>
+        </m:r>
+      </m:oMath>
+      <w:r>
+        <w:rPr>
+          <w:rFonts w:ascii="Didot" w:hAnsi="Didot" w:cs="Didot"/>
+          <w:sz w:val="22"/>
+          <w:szCs w:val="22"/>
+        </w:rPr>
+        <w:t>) alvo.</w:t>
+      </w:r>
+    </w:p>
+    <w:p>
+      <w:pPr>
+        <w:spacing w:line="360" w:lineRule="auto"/>
+        <w:jc w:val="both"/>
+        <w:rPr>
+          <w:rFonts w:ascii="Didot" w:hAnsi="Didot" w:cs="Didot"/>
+          <w:sz w:val="22"/>
+          <w:szCs w:val="22"/>
+        </w:rPr>
+      </w:pPr>
+      <w:r>
+        <w:rPr>
+          <w:rFonts w:ascii="Didot" w:hAnsi="Didot" w:cs="Didot"/>
+          <w:sz w:val="22"/>
+          <w:szCs w:val="22"/>
+          <w:u w:val="single"/>
+        </w:rPr>
+        <w:t>- Velocidade Angular (</w:t>
+      </w:r>
+      <m:oMath>
+        <m:r>
+          <w:rPr>
+            <w:rFonts w:ascii="Cambria Math" w:hAnsi="Cambria Math" w:cs="Didot"/>
+            <w:sz w:val="22"/>
+            <w:szCs w:val="22"/>
+            <w:u w:val="single"/>
+          </w:rPr>
+          <m:t>ω</m:t>
+        </m:r>
+      </m:oMath>
+      <w:r>
+        <w:rPr>
+          <w:rFonts w:ascii="Didot" w:hAnsi="Didot" w:cs="Didot"/>
+          <w:sz w:val="22"/>
+          <w:szCs w:val="22"/>
+          <w:u w:val="single"/>
+        </w:rPr>
+        <w:t>)</w:t>
+      </w:r>
+      <w:r>
+        <w:rPr>
+          <w:rFonts w:ascii="Didot" w:hAnsi="Didot" w:cs="Didot"/>
+          <w:sz w:val="22"/>
+          <w:szCs w:val="22"/>
+        </w:rPr>
+        <w:t>: apresentaria picos em forma de sino (curva Gaussiana ou rampa limitadora) nos momentos em que o robô precisa girar para apontar para o próximo alvo ou realizar o alinhamento final da baia.</w:t>
+      </w:r>
+    </w:p>
+    <w:p>
+      <w:pPr>
+        <w:spacing w:line="360" w:lineRule="auto"/>
+        <w:rPr>
+          <w:rFonts w:ascii="Didot" w:hAnsi="Didot" w:cs="Didot"/>
+          <w:color w:val="0A2F41" w:themeColor="accent1" w:themeShade="80"/>
+          <w:sz w:val="22"/>
+          <w:szCs w:val="22"/>
+        </w:rPr>
+      </w:pPr>
+      <w:r>
+        <w:rPr>
+          <w:rFonts w:ascii="Didot" w:hAnsi="Didot" w:cs="Didot" w:hint="cs"/>
+          <w:sz w:val="22"/>
+          <w:szCs w:val="22"/>
+        </w:rPr>
+        <w:lastRenderedPageBreak/>
+        <w:br/>
+      </w:r>
+      <w:r>
+        <w:rPr>
+          <w:rFonts w:ascii="Didot" w:hAnsi="Didot" w:cs="Didot" w:hint="cs"/>
+          <w:color w:val="0A2F41" w:themeColor="accent1" w:themeShade="80"/>
+          <w:sz w:val="22"/>
+          <w:szCs w:val="22"/>
+        </w:rPr>
+        <w:t>Insira aqui as imagens dos seguintes gráficos:</w:t>
+      </w:r>
+    </w:p>
+    <w:p>
+      <w:pPr>
+        <w:spacing w:line="360" w:lineRule="auto"/>
+        <w:rPr>
+          <w:rFonts w:ascii="Didot" w:hAnsi="Didot" w:cs="Didot"/>
+          <w:color w:val="0A2F41" w:themeColor="accent1" w:themeShade="80"/>
+          <w:sz w:val="22"/>
+          <w:szCs w:val="22"/>
+        </w:rPr>
+      </w:pPr>
+      <w:r>
+        <w:rPr>
+          <w:rFonts w:ascii="Didot" w:hAnsi="Didot" w:cs="Didot" w:hint="cs"/>
+          <w:color w:val="0A2F41" w:themeColor="accent1" w:themeShade="80"/>
+          <w:sz w:val="22"/>
+          <w:szCs w:val="22"/>
+        </w:rPr>
+        <w:t>Evolução temporal da velocidade linear </w:t>
+      </w:r>
+      <m:oMath>
+        <m:r>
+          <w:rPr>
+            <w:rFonts w:ascii="Cambria Math" w:hAnsi="Cambria Math" w:cs="Didot"/>
+            <w:color w:val="0A2F41" w:themeColor="accent1" w:themeShade="80"/>
+            <w:sz w:val="22"/>
+            <w:szCs w:val="22"/>
+          </w:rPr>
+          <m:t>u</m:t>
+        </m:r>
+      </m:oMath>
+      <w:r>
+        <w:rPr>
+          <w:rFonts w:ascii="Didot" w:hAnsi="Didot" w:cs="Didot" w:hint="cs"/>
+          <w:color w:val="0A2F41" w:themeColor="accent1" w:themeShade="80"/>
+          <w:sz w:val="22"/>
+          <w:szCs w:val="22"/>
+        </w:rPr>
+        <w:t> (m/s)</w:t>
+      </w:r>
+    </w:p>
+    <w:p>
+      <w:pPr>
+        <w:spacing w:line="360" w:lineRule="auto"/>
+        <w:rPr>
+          <w:rFonts w:ascii="Didot" w:hAnsi="Didot" w:cs="Didot"/>
+          <w:color w:val="0A2F41" w:themeColor="accent1" w:themeShade="80"/>
+          <w:sz w:val="22"/>
+          <w:szCs w:val="22"/>
+        </w:rPr>
+      </w:pPr>
+      <w:r>
+        <w:rPr>
+          <w:rFonts w:ascii="Didot" w:hAnsi="Didot" w:cs="Didot" w:hint="cs"/>
+          <w:color w:val="0A2F41" w:themeColor="accent1" w:themeShade="80"/>
+          <w:sz w:val="22"/>
+          <w:szCs w:val="22"/>
+        </w:rPr>
+        <w:t>Evolução temporal da velocidade angular </w:t>
+      </w:r>
+      <m:oMath>
+        <m:r>
+          <w:rPr>
+            <w:rFonts w:ascii="Cambria Math" w:hAnsi="Cambria Math" w:cs="Didot"/>
+            <w:color w:val="0A2F41" w:themeColor="accent1" w:themeShade="80"/>
+            <w:sz w:val="22"/>
+            <w:szCs w:val="22"/>
+          </w:rPr>
+          <m:t>ω</m:t>
+        </m:r>
+      </m:oMath>
+      <w:r>
+        <w:rPr>
+          <w:rFonts w:ascii="Didot" w:hAnsi="Didot" w:cs="Didot" w:hint="cs"/>
+          <w:color w:val="0A2F41" w:themeColor="accent1" w:themeShade="80"/>
           <w:sz w:val="22"/>
           <w:szCs w:val="22"/>
         </w:rPr>
@@ -1371,6 +4064,55 @@
           <w:szCs w:val="22"/>
         </w:rPr>
       </w:pPr>
+      <w:r>
+        <w:rPr>
+          <w:rFonts w:ascii="Didot" w:hAnsi="Didot" w:cs="Didot"/>
+          <w:noProof/>
+          <w:sz w:val="22"/>
+          <w:szCs w:val="22"/>
+        </w:rPr>
+        <w:drawing>
+          <wp:inline distT="0" distB="0" distL="0" distR="0" wp14:anchorId="52B8FB2E" wp14:editId="06CE3AFC">
+            <wp:extent cx="5756910" cy="3597910"/>
+            <wp:effectExtent l="0" t="0" r="0" b="0"/>
+            <wp:docPr id="783520899" name="Picture 5"/>
+            <wp:cNvGraphicFramePr>
+              <a:graphicFrameLocks xmlns:a="http://schemas.openxmlformats.org/drawingml/2006/main" noChangeAspect="1"/>
+            </wp:cNvGraphicFramePr>
+            <a:graphic xmlns:a="http://schemas.openxmlformats.org/drawingml/2006/main">
+              <a:graphicData uri="http://schemas.openxmlformats.org/drawingml/2006/picture">
+                <pic:pic xmlns:pic="http://schemas.openxmlformats.org/drawingml/2006/picture">
+                  <pic:nvPicPr>
+                    <pic:cNvPr id="783520899" name="Picture 783520899"/>
+                    <pic:cNvPicPr/>
+                  </pic:nvPicPr>
+                  <pic:blipFill>
+                    <a:blip r:embed="rId10">
+                      <a:extLst>
+                        <a:ext uri="{28A0092B-C50C-407E-A947-70E740481C1C}">
+                          <a14:useLocalDpi xmlns:a14="http://schemas.microsoft.com/office/drawing/2010/main" val="0"/>
+                        </a:ext>
+                      </a:extLst>
+                    </a:blip>
+                    <a:stretch>
+                      <a:fillRect/>
+                    </a:stretch>
+                  </pic:blipFill>
+                  <pic:spPr>
+                    <a:xfrm>
+                      <a:off x="0" y="0"/>
+                      <a:ext cx="5756910" cy="3597910"/>
+                    </a:xfrm>
+                    <a:prstGeom prst="rect">
+                      <a:avLst/>
+                    </a:prstGeom>
+                  </pic:spPr>
+                </pic:pic>
+              </a:graphicData>
+            </a:graphic>
+          </wp:inline>
+        </w:drawing>
+      </w:r>
     </w:p>
     <w:sectPr>
       <w:pgSz w:w="11901" w:h="16817"/>
@@ -2403,7 +5145,7 @@
     <w:link w:val="Heading1Char"/>
     <w:uiPriority w:val="9"/>
     <w:qFormat/>
-    <w:rsid w:val="00E7610D"/>
+    <w:rsid w:val="008B6258"/>
     <w:pPr>
       <w:keepNext/>
       <w:keepLines/>
@@ -2411,9 +5153,9 @@
       <w:outlineLvl w:val="0"/>
     </w:pPr>
     <w:rPr>
-      <w:rFonts w:asciiTheme="majorHAnsi" w:eastAsiaTheme="majorEastAsia" w:hAnsiTheme="majorHAnsi" w:cstheme="majorBidi"/>
+      <w:rFonts w:ascii="Didot" w:eastAsiaTheme="majorEastAsia" w:hAnsi="Didot" w:cstheme="majorBidi"/>
       <w:color w:val="0F4761" w:themeColor="accent1" w:themeShade="BF"/>
-      <w:sz w:val="40"/>
+      <w:sz w:val="28"/>
       <w:szCs w:val="40"/>
     </w:rPr>
   </w:style>
@@ -2627,11 +5369,11 @@
     <w:basedOn w:val="DefaultParagraphFont"/>
     <w:link w:val="Heading1"/>
     <w:uiPriority w:val="9"/>
-    <w:rsid w:val="00E7610D"/>
+    <w:rsid w:val="008B6258"/>
     <w:rPr>
-      <w:rFonts w:asciiTheme="majorHAnsi" w:eastAsiaTheme="majorEastAsia" w:hAnsiTheme="majorHAnsi" w:cstheme="majorBidi"/>
+      <w:rFonts w:ascii="Didot" w:eastAsiaTheme="majorEastAsia" w:hAnsi="Didot" w:cstheme="majorBidi"/>
       <w:color w:val="0F4761" w:themeColor="accent1" w:themeShade="BF"/>
-      <w:sz w:val="40"/>
+      <w:sz w:val="28"/>
       <w:szCs w:val="40"/>
     </w:rPr>
   </w:style>

</xml_diff>